<commit_message>
docs(QADAM-12): simplify report and make Word URLs clickable
</commit_message>
<xml_diff>
--- a/docs/diploma/Qadam_Predefense_Report.docx
+++ b/docs/diploma/Qadam_Predefense_Report.docx
@@ -71,12 +71,22 @@
         <w:t>Diploma repository</w:t>
       </w:r>
       <w:r>
-        <w:t xml:space="preserve"> — https://github.com/bekasyl00/Qadam_Diplom</w:t>
+        <w:t xml:space="preserve"> — </w:t>
       </w:r>
+      <w:hyperlink r:id="rId11">
+        <w:r>
+          <w:rPr>
+            <w:color w:val="0563C1"/>
+            <w:u w:val="single"/>
+          </w:rPr>
+          <w:t>https://github.com/bekasyl00/Qadam_Diplom</w:t>
+        </w:r>
+      </w:hyperlink>
+      <w:r/>
     </w:p>
     <w:p>
       <w:r>
-        <w:t>This revised proposal presents Qadam, its architecture, and the planned evaluation of AI-assisted business task formulation. Altynbek Seitenov has approved the project for the first pre-defense. The revision addresses his recommendations on the research gap, database and interaction models, evaluation methods, and individual contributions. Experiments and user interviews are still planned; their results are not claimed here.</w:t>
+        <w:t>This report presents Qadam, its research basis, requirements, architecture, implementation and planned evaluation of AI-assisted business task formulation. Experiments and user interviews are planned; their results are not claimed here.</w:t>
       </w:r>
     </w:p>
     <w:p>
@@ -4161,7 +4171,7 @@
                     <pic:cNvPicPr/>
                   </pic:nvPicPr>
                   <pic:blipFill>
-                    <a:blip r:embed="rId11"/>
+                    <a:blip r:embed="rId12"/>
                     <a:stretch>
                       <a:fillRect/>
                     </a:stretch>
@@ -4300,7 +4310,7 @@
                     <pic:cNvPicPr/>
                   </pic:nvPicPr>
                   <pic:blipFill>
-                    <a:blip r:embed="rId12"/>
+                    <a:blip r:embed="rId13"/>
                     <a:stretch>
                       <a:fillRect/>
                     </a:stretch>
@@ -4388,7 +4398,7 @@
                     <pic:cNvPicPr/>
                   </pic:nvPicPr>
                   <pic:blipFill>
-                    <a:blip r:embed="rId13"/>
+                    <a:blip r:embed="rId14"/>
                     <a:stretch>
                       <a:fillRect/>
                     </a:stretch>
@@ -4476,7 +4486,7 @@
                     <pic:cNvPicPr/>
                   </pic:nvPicPr>
                   <pic:blipFill>
-                    <a:blip r:embed="rId14"/>
+                    <a:blip r:embed="rId15"/>
                     <a:stretch>
                       <a:fillRect/>
                     </a:stretch>
@@ -4551,7 +4561,7 @@
                     <pic:cNvPicPr/>
                   </pic:nvPicPr>
                   <pic:blipFill>
-                    <a:blip r:embed="rId15"/>
+                    <a:blip r:embed="rId16"/>
                     <a:stretch>
                       <a:fillRect/>
                     </a:stretch>
@@ -4621,7 +4631,7 @@
                     <pic:cNvPicPr/>
                   </pic:nvPicPr>
                   <pic:blipFill>
-                    <a:blip r:embed="rId16"/>
+                    <a:blip r:embed="rId17"/>
                     <a:stretch>
                       <a:fillRect/>
                     </a:stretch>
@@ -4691,7 +4701,7 @@
                     <pic:cNvPicPr/>
                   </pic:nvPicPr>
                   <pic:blipFill>
-                    <a:blip r:embed="rId17"/>
+                    <a:blip r:embed="rId18"/>
                     <a:stretch>
                       <a:fillRect/>
                     </a:stretch>
@@ -6031,7 +6041,7 @@
     </w:p>
     <w:p>
       <w:r>
-        <w:t>Record model, provider, prompt, application version, date, language, and network conditions. Keep configurations fixed within the primary comparison; analyze unavoidable changes separately. Counterbalancing reduces order effects but cannot remove task differences, recruitment bias, assessor expectations, or learning. Field interviews and a later larger study are needed for generalization. The proposed discussion around 21 October reviews this plan; completed experiments are not required for the first pre-defense.</w:t>
+        <w:t>Record model, provider, prompt, application version, date, language, and network conditions. Keep configurations fixed within the primary comparison; analyze unavoidable changes separately. Counterbalancing reduces order effects but cannot remove task differences, recruitment bias, assessor expectations, or learning. Field interviews and a later larger study are needed for generalization. Completed experiments are not required for the first pre-defense.</w:t>
       </w:r>
     </w:p>
     <w:p>
@@ -6331,7 +6341,7 @@
     </w:p>
     <w:p>
       <w:r>
-        <w:t>Before the meeting, each member prepares a two-minute explanation of one concrete artifact, one technical decision, one limitation, and the next planned change. Review partners should be different from implementers, and the resulting review should be linked to the task.</w:t>
+        <w:t>Before the presentation, each member prepares a two-minute explanation of one concrete artifact, one technical decision, one limitation, and the next planned change. Review partners should be different from implementers, and the resulting review should be linked to the task.</w:t>
       </w:r>
     </w:p>
     <w:p>
@@ -6441,7 +6451,7 @@
               <w:rPr>
                 <w:sz w:val="20"/>
               </w:rPr>
-              <w:t>Consolidate supervisor feedback and clarify current AI responsibility.</w:t>
+              <w:t>Consolidate project documentation and clarify current AI responsibility.</w:t>
             </w:r>
           </w:p>
         </w:tc>
@@ -6499,7 +6509,7 @@
               <w:rPr>
                 <w:sz w:val="20"/>
               </w:rPr>
-              <w:t>Around 21 October</w:t>
+              <w:t>21 October</w:t>
             </w:r>
           </w:p>
         </w:tc>
@@ -6515,7 +6525,7 @@
               <w:rPr>
                 <w:sz w:val="20"/>
               </w:rPr>
-              <w:t>Proposed online supervisor meeting: architecture, evaluation protocol and individual contributions. Exact time remains unconfirmed.</w:t>
+              <w:t>Team review of architecture, evaluation protocol and individual contributions.</w:t>
             </w:r>
           </w:p>
         </w:tc>
@@ -6552,7 +6562,7 @@
               <w:rPr>
                 <w:sz w:val="20"/>
               </w:rPr>
-              <w:t>Resolve meeting actions; execute local database, live AI and browser checks with actual results.</w:t>
+              <w:t>Resolve review actions; execute local database, live AI and browser checks with actual results.</w:t>
             </w:r>
           </w:p>
         </w:tc>
@@ -6626,7 +6636,7 @@
               <w:rPr>
                 <w:sz w:val="20"/>
               </w:rPr>
-              <w:t>First pre-defense checkpoint; submit materials and collect the signed approval form through the required procedure.</w:t>
+              <w:t>First pre-defense checkpoint; submit the reviewed project materials.</w:t>
             </w:r>
           </w:p>
         </w:tc>
@@ -6657,7 +6667,22 @@
     </w:p>
     <w:p>
       <w:r>
-        <w:t>The Qadam project and Kanban board were created on 19 October 2026. Project: https://bekasyl00.youtrack.cloud/projects/QADAM. The task register records responsible students, reviewers, target dates, acceptance criteria and evidence. Its live stages are Backlog, Development, Review, Test, Staging and Done. Prepared material stays in Review until checked; Done requires evidence.</w:t>
+        <w:t xml:space="preserve">The Qadam project and Kanban board were created on 19 October 2026. Project: </w:t>
+      </w:r>
+      <w:hyperlink r:id="rId19">
+        <w:r>
+          <w:rPr>
+            <w:color w:val="0563C1"/>
+            <w:u w:val="single"/>
+          </w:rPr>
+          <w:t>https://bekasyl00.youtrack.cloud/projects/QADAM</w:t>
+        </w:r>
+      </w:hyperlink>
+      <w:r>
+        <w:t>.</w:t>
+      </w:r>
+      <w:r>
+        <w:t xml:space="preserve"> The task register records responsible students, reviewers, target dates, acceptance criteria and evidence. Its live stages are Backlog, Development, Review, Test, Staging and Done. Prepared material stays in Review until checked; Done requires evidence.</w:t>
       </w:r>
     </w:p>
     <w:p>
@@ -7210,1105 +7235,6 @@
         <w:pageBreakBefore/>
       </w:pPr>
       <w:r>
-        <w:t>11 Supervisor feedback and revision record</w:t>
-      </w:r>
-    </w:p>
-    <w:p>
-      <w:pPr>
-        <w:pStyle w:val="Heading2"/>
-      </w:pPr>
-      <w:r>
-        <w:t>Approval and scope</w:t>
-      </w:r>
-    </w:p>
-    <w:p>
-      <w:r>
-        <w:t>Altynbek Seitenov reviewed the proposal positively and approved the project for the first pre-defense [22]. His written feedback was supplied to the team and incorporated into this revision on 19 October 2026; the original message date was not provided. Approval applies to the first pre-defense, not to completed experiments or a final diploma defense.</w:t>
-      </w:r>
-    </w:p>
-    <w:p>
-      <w:r>
-        <w:t>The supervisor stated that he would indicate approval on the application form. Collection and submission of the signed form remain to be confirmed. He proposed another online meeting around 21 October; no exact appointment is recorded.</w:t>
-      </w:r>
-    </w:p>
-    <w:tbl>
-      <w:tblPr>
-        <w:tblW w:type="auto" w:w="0"/>
-        <w:tblLayout w:type="fixed"/>
-        <w:tblLook w:firstColumn="1" w:firstRow="1" w:lastColumn="0" w:lastRow="0" w:noHBand="0" w:noVBand="1" w:val="04A0"/>
-        <w:tblBorders>
-          <w:top w:val="single" w:sz="4" w:color="D5D8DE"/>
-          <w:left w:val="single" w:sz="4" w:color="D5D8DE"/>
-          <w:bottom w:val="single" w:sz="4" w:color="D5D8DE"/>
-          <w:right w:val="single" w:sz="4" w:color="D5D8DE"/>
-          <w:insideH w:val="single" w:sz="4" w:color="D5D8DE"/>
-          <w:insideV w:val="single" w:sz="4" w:color="D5D8DE"/>
-        </w:tblBorders>
-        <w:tblCellMar>
-          <w:top w:w="85" w:type="dxa"/>
-          <w:bottom w:w="85" w:type="dxa"/>
-          <w:left w:w="90" w:type="dxa"/>
-          <w:right w:w="90" w:type="dxa"/>
-        </w:tblCellMar>
-      </w:tblPr>
-      <w:tblGrid>
-        <w:gridCol w:w="2376"/>
-        <w:gridCol w:w="4320"/>
-        <w:gridCol w:w="3528"/>
-      </w:tblGrid>
-      <w:tr>
-        <w:trPr>
-          <w:cantSplit/>
-          <w:tblHeader/>
-        </w:trPr>
-        <w:tc>
-          <w:tcPr>
-            <w:tcW w:type="dxa" w:w="2376"/>
-            <w:shd w:fill="F0F1F3"/>
-          </w:tcPr>
-          <w:p>
-            <w:pPr>
-              <w:spacing w:after="0" w:line="250" w:lineRule="auto"/>
-            </w:pPr>
-            <w:r>
-              <w:rPr>
-                <w:b/>
-                <w:sz w:val="20"/>
-              </w:rPr>
-              <w:t>Supervisor recommendation</w:t>
-            </w:r>
-          </w:p>
-        </w:tc>
-        <w:tc>
-          <w:tcPr>
-            <w:tcW w:type="dxa" w:w="4320"/>
-            <w:shd w:fill="F0F1F3"/>
-          </w:tcPr>
-          <w:p>
-            <w:pPr>
-              <w:spacing w:after="0" w:line="250" w:lineRule="auto"/>
-            </w:pPr>
-            <w:r>
-              <w:rPr>
-                <w:b/>
-                <w:sz w:val="20"/>
-              </w:rPr>
-              <w:t>Revision in this report</w:t>
-            </w:r>
-          </w:p>
-        </w:tc>
-        <w:tc>
-          <w:tcPr>
-            <w:tcW w:type="dxa" w:w="3528"/>
-            <w:shd w:fill="F0F1F3"/>
-          </w:tcPr>
-          <w:p>
-            <w:pPr>
-              <w:spacing w:after="0" w:line="250" w:lineRule="auto"/>
-            </w:pPr>
-            <w:r>
-              <w:rPr>
-                <w:b/>
-                <w:sz w:val="20"/>
-              </w:rPr>
-              <w:t>Remaining team action</w:t>
-            </w:r>
-          </w:p>
-        </w:tc>
-      </w:tr>
-      <w:tr>
-        <w:trPr>
-          <w:cantSplit/>
-        </w:trPr>
-        <w:tc>
-          <w:tcPr>
-            <w:tcW w:type="dxa" w:w="2376"/>
-          </w:tcPr>
-          <w:p>
-            <w:pPr>
-              <w:spacing w:after="0" w:line="250" w:lineRule="auto"/>
-            </w:pPr>
-            <w:r>
-              <w:rPr>
-                <w:sz w:val="20"/>
-              </w:rPr>
-              <w:t>Connect studies, limitations, gap and solution</w:t>
-            </w:r>
-          </w:p>
-        </w:tc>
-        <w:tc>
-          <w:tcPr>
-            <w:tcW w:type="dxa" w:w="4320"/>
-          </w:tcPr>
-          <w:p>
-            <w:pPr>
-              <w:spacing w:after="0" w:line="250" w:lineRule="auto"/>
-            </w:pPr>
-            <w:r>
-              <w:rPr>
-                <w:sz w:val="20"/>
-              </w:rPr>
-              <w:t>Section 3 explains methods and limitations of the central papers and maps them to design and evaluation.</w:t>
-            </w:r>
-          </w:p>
-        </w:tc>
-        <w:tc>
-          <w:tcPr>
-            <w:tcW w:type="dxa" w:w="3528"/>
-          </w:tcPr>
-          <w:p>
-            <w:pPr>
-              <w:spacing w:after="0" w:line="250" w:lineRule="auto"/>
-            </w:pPr>
-            <w:r>
-              <w:rPr>
-                <w:sz w:val="20"/>
-              </w:rPr>
-              <w:t>Personally study the key papers and rehearse explanations.</w:t>
-            </w:r>
-          </w:p>
-        </w:tc>
-      </w:tr>
-      <w:tr>
-        <w:trPr>
-          <w:cantSplit/>
-        </w:trPr>
-        <w:tc>
-          <w:tcPr>
-            <w:tcW w:type="dxa" w:w="2376"/>
-          </w:tcPr>
-          <w:p>
-            <w:pPr>
-              <w:spacing w:after="0" w:line="250" w:lineRule="auto"/>
-            </w:pPr>
-            <w:r>
-              <w:rPr>
-                <w:sz w:val="20"/>
-              </w:rPr>
-              <w:t>Show the complete architectural vision</w:t>
-            </w:r>
-          </w:p>
-        </w:tc>
-        <w:tc>
-          <w:tcPr>
-            <w:tcW w:type="dxa" w:w="4320"/>
-          </w:tcPr>
-          <w:p>
-            <w:pPr>
-              <w:spacing w:after="0" w:line="250" w:lineRule="auto"/>
-            </w:pPr>
-            <w:r>
-              <w:rPr>
-                <w:sz w:val="20"/>
-              </w:rPr>
-              <w:t>Section 7 adds ERD, UML activity and sequence diagrams, distinguishing current data from proposed identity support.</w:t>
-            </w:r>
-          </w:p>
-        </w:tc>
-        <w:tc>
-          <w:tcPr>
-            <w:tcW w:type="dxa" w:w="3528"/>
-          </w:tcPr>
-          <w:p>
-            <w:pPr>
-              <w:spacing w:after="0" w:line="250" w:lineRule="auto"/>
-            </w:pPr>
-            <w:r>
-              <w:rPr>
-                <w:sz w:val="20"/>
-              </w:rPr>
-              <w:t>Peer-review diagrams and discuss future scope.</w:t>
-            </w:r>
-          </w:p>
-        </w:tc>
-      </w:tr>
-      <w:tr>
-        <w:trPr>
-          <w:cantSplit/>
-        </w:trPr>
-        <w:tc>
-          <w:tcPr>
-            <w:tcW w:type="dxa" w:w="2376"/>
-          </w:tcPr>
-          <w:p>
-            <w:pPr>
-              <w:spacing w:after="0" w:line="250" w:lineRule="auto"/>
-            </w:pPr>
-            <w:r>
-              <w:rPr>
-                <w:sz w:val="20"/>
-              </w:rPr>
-              <w:t>Explain manual versus AI evaluation</w:t>
-            </w:r>
-          </w:p>
-        </w:tc>
-        <w:tc>
-          <w:tcPr>
-            <w:tcW w:type="dxa" w:w="4320"/>
-          </w:tcPr>
-          <w:p>
-            <w:pPr>
-              <w:spacing w:after="0" w:line="250" w:lineRule="auto"/>
-            </w:pPr>
-            <w:r>
-              <w:rPr>
-                <w:sz w:val="20"/>
-              </w:rPr>
-              <w:t>Section 9 specifies paired tasks, timing, rubric, factual support, failures and descriptive analysis.</w:t>
-            </w:r>
-          </w:p>
-        </w:tc>
-        <w:tc>
-          <w:tcPr>
-            <w:tcW w:type="dxa" w:w="3528"/>
-          </w:tcPr>
-          <w:p>
-            <w:pPr>
-              <w:spacing w:after="0" w:line="250" w:lineRule="auto"/>
-            </w:pPr>
-            <w:r>
-              <w:rPr>
-                <w:sz w:val="20"/>
-              </w:rPr>
-              <w:t>Agree the protocol and recruitment; conduct the study later.</w:t>
-            </w:r>
-          </w:p>
-        </w:tc>
-      </w:tr>
-      <w:tr>
-        <w:trPr>
-          <w:cantSplit/>
-        </w:trPr>
-        <w:tc>
-          <w:tcPr>
-            <w:tcW w:type="dxa" w:w="2376"/>
-          </w:tcPr>
-          <w:p>
-            <w:pPr>
-              <w:spacing w:after="0" w:line="250" w:lineRule="auto"/>
-            </w:pPr>
-            <w:r>
-              <w:rPr>
-                <w:sz w:val="20"/>
-              </w:rPr>
-              <w:t>Clarify individual contributions</w:t>
-            </w:r>
-          </w:p>
-        </w:tc>
-        <w:tc>
-          <w:tcPr>
-            <w:tcW w:type="dxa" w:w="4320"/>
-          </w:tcPr>
-          <w:p>
-            <w:pPr>
-              <w:spacing w:after="0" w:line="250" w:lineRule="auto"/>
-            </w:pPr>
-            <w:r>
-              <w:rPr>
-                <w:sz w:val="20"/>
-              </w:rPr>
-              <w:t>Section 10 separates repository evidence, Mereke's unpublished AI work, and future responsibilities.</w:t>
-            </w:r>
-          </w:p>
-        </w:tc>
-        <w:tc>
-          <w:tcPr>
-            <w:tcW w:type="dxa" w:w="3528"/>
-          </w:tcPr>
-          <w:p>
-            <w:pPr>
-              <w:spacing w:after="0" w:line="250" w:lineRule="auto"/>
-            </w:pPr>
-            <w:r>
-              <w:rPr>
-                <w:sz w:val="20"/>
-              </w:rPr>
-              <w:t>Each member demonstrates an artifact and submits their next work.</w:t>
-            </w:r>
-          </w:p>
-        </w:tc>
-      </w:tr>
-      <w:tr>
-        <w:trPr>
-          <w:cantSplit/>
-        </w:trPr>
-        <w:tc>
-          <w:tcPr>
-            <w:tcW w:type="dxa" w:w="2376"/>
-          </w:tcPr>
-          <w:p>
-            <w:pPr>
-              <w:spacing w:after="0" w:line="250" w:lineRule="auto"/>
-            </w:pPr>
-            <w:r>
-              <w:rPr>
-                <w:sz w:val="20"/>
-              </w:rPr>
-              <w:t>Consolidate materials before the next meeting</w:t>
-            </w:r>
-          </w:p>
-        </w:tc>
-        <w:tc>
-          <w:tcPr>
-            <w:tcW w:type="dxa" w:w="4320"/>
-          </w:tcPr>
-          <w:p>
-            <w:pPr>
-              <w:spacing w:after="0" w:line="250" w:lineRule="auto"/>
-            </w:pPr>
-            <w:r>
-              <w:rPr>
-                <w:sz w:val="20"/>
-              </w:rPr>
-              <w:t>This revision combines the changes and an actionable task list.</w:t>
-            </w:r>
-          </w:p>
-        </w:tc>
-        <w:tc>
-          <w:tcPr>
-            <w:tcW w:type="dxa" w:w="3528"/>
-          </w:tcPr>
-          <w:p>
-            <w:pPr>
-              <w:spacing w:after="0" w:line="250" w:lineRule="auto"/>
-            </w:pPr>
-            <w:r>
-              <w:rPr>
-                <w:sz w:val="20"/>
-              </w:rPr>
-              <w:t>Confirm meeting time and review the updated proposal.</w:t>
-            </w:r>
-          </w:p>
-        </w:tc>
-      </w:tr>
-    </w:tbl>
-    <w:p>
-      <w:pPr>
-        <w:spacing w:after="20" w:before="0" w:line="240" w:lineRule="auto"/>
-      </w:pPr>
-      <w:r>
-        <w:rPr>
-          <w:sz w:val="4"/>
-        </w:rPr>
-      </w:r>
-    </w:p>
-    <w:p>
-      <w:pPr>
-        <w:pStyle w:val="Heading2"/>
-      </w:pPr>
-      <w:r>
-        <w:t>Communication and meeting preparation</w:t>
-      </w:r>
-    </w:p>
-    <w:p>
-      <w:r>
-        <w:t>Future messages to the supervisor should begin with an appropriate greeting, identify the purpose and attached version, and end with the sender's name. This follows his explicit request for professional academic communication. A draft response is included in the supporting files; it has not been sent.</w:t>
-      </w:r>
-    </w:p>
-    <w:p>
-      <w:r>
-        <w:t>The meeting agenda is: research gap and key publications; data entities and confirmation flow; manual comparison and quality rubric; each member's contribution and next task; remaining evidence and submission procedure. No experiment results are expected at this stage. Bring actual questions and limits rather than treating planned metrics as measured achievements.</w:t>
-      </w:r>
-    </w:p>
-    <w:p>
-      <w:pPr>
-        <w:pStyle w:val="Heading1"/>
-        <w:pageBreakBefore/>
-      </w:pPr>
-      <w:r>
-        <w:t>11 Submission readiness</w:t>
-      </w:r>
-    </w:p>
-    <w:tbl>
-      <w:tblPr>
-        <w:tblW w:type="auto" w:w="0"/>
-        <w:tblLayout w:type="fixed"/>
-        <w:tblLook w:firstColumn="1" w:firstRow="1" w:lastColumn="0" w:lastRow="0" w:noHBand="0" w:noVBand="1" w:val="04A0"/>
-        <w:tblBorders>
-          <w:top w:val="single" w:sz="4" w:color="D5D8DE"/>
-          <w:left w:val="single" w:sz="4" w:color="D5D8DE"/>
-          <w:bottom w:val="single" w:sz="4" w:color="D5D8DE"/>
-          <w:right w:val="single" w:sz="4" w:color="D5D8DE"/>
-          <w:insideH w:val="single" w:sz="4" w:color="D5D8DE"/>
-          <w:insideV w:val="single" w:sz="4" w:color="D5D8DE"/>
-        </w:tblBorders>
-        <w:tblCellMar>
-          <w:top w:w="85" w:type="dxa"/>
-          <w:bottom w:w="85" w:type="dxa"/>
-          <w:left w:w="90" w:type="dxa"/>
-          <w:right w:w="90" w:type="dxa"/>
-        </w:tblCellMar>
-      </w:tblPr>
-      <w:tblGrid>
-        <w:gridCol w:w="2016"/>
-        <w:gridCol w:w="3888"/>
-        <w:gridCol w:w="4320"/>
-      </w:tblGrid>
-      <w:tr>
-        <w:trPr>
-          <w:cantSplit/>
-          <w:tblHeader/>
-        </w:trPr>
-        <w:tc>
-          <w:tcPr>
-            <w:tcW w:type="dxa" w:w="2016"/>
-            <w:shd w:fill="F0F1F3"/>
-          </w:tcPr>
-          <w:p>
-            <w:pPr>
-              <w:spacing w:after="0" w:line="250" w:lineRule="auto"/>
-            </w:pPr>
-            <w:r>
-              <w:rPr>
-                <w:b/>
-                <w:sz w:val="20"/>
-              </w:rPr>
-              <w:t>Assignment component</w:t>
-            </w:r>
-          </w:p>
-        </w:tc>
-        <w:tc>
-          <w:tcPr>
-            <w:tcW w:type="dxa" w:w="3888"/>
-            <w:shd w:fill="F0F1F3"/>
-          </w:tcPr>
-          <w:p>
-            <w:pPr>
-              <w:spacing w:after="0" w:line="250" w:lineRule="auto"/>
-            </w:pPr>
-            <w:r>
-              <w:rPr>
-                <w:b/>
-                <w:sz w:val="20"/>
-              </w:rPr>
-              <w:t>Material available</w:t>
-            </w:r>
-          </w:p>
-        </w:tc>
-        <w:tc>
-          <w:tcPr>
-            <w:tcW w:type="dxa" w:w="4320"/>
-            <w:shd w:fill="F0F1F3"/>
-          </w:tcPr>
-          <w:p>
-            <w:pPr>
-              <w:spacing w:after="0" w:line="250" w:lineRule="auto"/>
-            </w:pPr>
-            <w:r>
-              <w:rPr>
-                <w:b/>
-                <w:sz w:val="20"/>
-              </w:rPr>
-              <w:t>Remaining evidence</w:t>
-            </w:r>
-          </w:p>
-        </w:tc>
-      </w:tr>
-      <w:tr>
-        <w:trPr>
-          <w:cantSplit/>
-        </w:trPr>
-        <w:tc>
-          <w:tcPr>
-            <w:tcW w:type="dxa" w:w="2016"/>
-          </w:tcPr>
-          <w:p>
-            <w:pPr>
-              <w:spacing w:after="0" w:line="250" w:lineRule="auto"/>
-            </w:pPr>
-            <w:r>
-              <w:rPr>
-                <w:sz w:val="20"/>
-              </w:rPr>
-              <w:t>Proposal</w:t>
-            </w:r>
-          </w:p>
-        </w:tc>
-        <w:tc>
-          <w:tcPr>
-            <w:tcW w:type="dxa" w:w="3888"/>
-          </w:tcPr>
-          <w:p>
-            <w:pPr>
-              <w:spacing w:after="0" w:line="250" w:lineRule="auto"/>
-            </w:pPr>
-            <w:r>
-              <w:rPr>
-                <w:sz w:val="20"/>
-              </w:rPr>
-              <w:t>Problem, scope and research question; first pre-defense approval</w:t>
-            </w:r>
-          </w:p>
-        </w:tc>
-        <w:tc>
-          <w:tcPr>
-            <w:tcW w:type="dxa" w:w="4320"/>
-          </w:tcPr>
-          <w:p>
-            <w:pPr>
-              <w:spacing w:after="0" w:line="250" w:lineRule="auto"/>
-            </w:pPr>
-            <w:r>
-              <w:rPr>
-                <w:sz w:val="20"/>
-              </w:rPr>
-              <w:t>Reconfirm refinements at the meeting</w:t>
-            </w:r>
-          </w:p>
-        </w:tc>
-      </w:tr>
-      <w:tr>
-        <w:trPr>
-          <w:cantSplit/>
-        </w:trPr>
-        <w:tc>
-          <w:tcPr>
-            <w:tcW w:type="dxa" w:w="2016"/>
-          </w:tcPr>
-          <w:p>
-            <w:pPr>
-              <w:spacing w:after="0" w:line="250" w:lineRule="auto"/>
-            </w:pPr>
-            <w:r>
-              <w:rPr>
-                <w:sz w:val="20"/>
-              </w:rPr>
-              <w:t>Relevance</w:t>
-            </w:r>
-          </w:p>
-        </w:tc>
-        <w:tc>
-          <w:tcPr>
-            <w:tcW w:type="dxa" w:w="3888"/>
-          </w:tcPr>
-          <w:p>
-            <w:pPr>
-              <w:spacing w:after="0" w:line="250" w:lineRule="auto"/>
-            </w:pPr>
-            <w:r>
-              <w:rPr>
-                <w:sz w:val="20"/>
-              </w:rPr>
-              <w:t>Discussion protocol and decision rules</w:t>
-            </w:r>
-          </w:p>
-        </w:tc>
-        <w:tc>
-          <w:tcPr>
-            <w:tcW w:type="dxa" w:w="4320"/>
-          </w:tcPr>
-          <w:p>
-            <w:pPr>
-              <w:spacing w:after="0" w:line="250" w:lineRule="auto"/>
-            </w:pPr>
-            <w:r>
-              <w:rPr>
-                <w:sz w:val="20"/>
-              </w:rPr>
-              <w:t>Actual discussions or client agreement</w:t>
-            </w:r>
-          </w:p>
-        </w:tc>
-      </w:tr>
-      <w:tr>
-        <w:trPr>
-          <w:cantSplit/>
-        </w:trPr>
-        <w:tc>
-          <w:tcPr>
-            <w:tcW w:type="dxa" w:w="2016"/>
-          </w:tcPr>
-          <w:p>
-            <w:pPr>
-              <w:spacing w:after="0" w:line="250" w:lineRule="auto"/>
-            </w:pPr>
-            <w:r>
-              <w:rPr>
-                <w:sz w:val="20"/>
-              </w:rPr>
-              <w:t>Literature</w:t>
-            </w:r>
-          </w:p>
-        </w:tc>
-        <w:tc>
-          <w:tcPr>
-            <w:tcW w:type="dxa" w:w="3888"/>
-          </w:tcPr>
-          <w:p>
-            <w:pPr>
-              <w:spacing w:after="0" w:line="250" w:lineRule="auto"/>
-            </w:pPr>
-            <w:r>
-              <w:rPr>
-                <w:sz w:val="20"/>
-              </w:rPr>
-              <w:t>Eight scientific sources, critical synthesis and research gap</w:t>
-            </w:r>
-          </w:p>
-        </w:tc>
-        <w:tc>
-          <w:tcPr>
-            <w:tcW w:type="dxa" w:w="4320"/>
-          </w:tcPr>
-          <w:p>
-            <w:pPr>
-              <w:spacing w:after="0" w:line="250" w:lineRule="auto"/>
-            </w:pPr>
-            <w:r>
-              <w:rPr>
-                <w:sz w:val="20"/>
-              </w:rPr>
-              <w:t>Individual reading and oral explanation</w:t>
-            </w:r>
-          </w:p>
-        </w:tc>
-      </w:tr>
-      <w:tr>
-        <w:trPr>
-          <w:cantSplit/>
-        </w:trPr>
-        <w:tc>
-          <w:tcPr>
-            <w:tcW w:type="dxa" w:w="2016"/>
-          </w:tcPr>
-          <w:p>
-            <w:pPr>
-              <w:spacing w:after="0" w:line="250" w:lineRule="auto"/>
-            </w:pPr>
-            <w:r>
-              <w:rPr>
-                <w:sz w:val="20"/>
-              </w:rPr>
-              <w:t>Existing systems</w:t>
-            </w:r>
-          </w:p>
-        </w:tc>
-        <w:tc>
-          <w:tcPr>
-            <w:tcW w:type="dxa" w:w="3888"/>
-          </w:tcPr>
-          <w:p>
-            <w:pPr>
-              <w:spacing w:after="0" w:line="250" w:lineRule="auto"/>
-            </w:pPr>
-            <w:r>
-              <w:rPr>
-                <w:sz w:val="20"/>
-              </w:rPr>
-              <w:t>Four systems and eight consistent criteria</w:t>
-            </w:r>
-          </w:p>
-        </w:tc>
-        <w:tc>
-          <w:tcPr>
-            <w:tcW w:type="dxa" w:w="4320"/>
-          </w:tcPr>
-          <w:p>
-            <w:pPr>
-              <w:spacing w:after="0" w:line="250" w:lineRule="auto"/>
-            </w:pPr>
-            <w:r>
-              <w:rPr>
-                <w:sz w:val="20"/>
-              </w:rPr>
-              <w:t>Review against field findings</w:t>
-            </w:r>
-          </w:p>
-        </w:tc>
-      </w:tr>
-      <w:tr>
-        <w:trPr>
-          <w:cantSplit/>
-        </w:trPr>
-        <w:tc>
-          <w:tcPr>
-            <w:tcW w:type="dxa" w:w="2016"/>
-          </w:tcPr>
-          <w:p>
-            <w:pPr>
-              <w:spacing w:after="0" w:line="250" w:lineRule="auto"/>
-            </w:pPr>
-            <w:r>
-              <w:rPr>
-                <w:sz w:val="20"/>
-              </w:rPr>
-              <w:t>Technology choices</w:t>
-            </w:r>
-          </w:p>
-        </w:tc>
-        <w:tc>
-          <w:tcPr>
-            <w:tcW w:type="dxa" w:w="3888"/>
-          </w:tcPr>
-          <w:p>
-            <w:pPr>
-              <w:spacing w:after="0" w:line="250" w:lineRule="auto"/>
-            </w:pPr>
-            <w:r>
-              <w:rPr>
-                <w:sz w:val="20"/>
-              </w:rPr>
-              <w:t>Five decisions with reasonable alternatives</w:t>
-            </w:r>
-          </w:p>
-        </w:tc>
-        <w:tc>
-          <w:tcPr>
-            <w:tcW w:type="dxa" w:w="4320"/>
-          </w:tcPr>
-          <w:p>
-            <w:pPr>
-              <w:spacing w:after="0" w:line="250" w:lineRule="auto"/>
-            </w:pPr>
-            <w:r>
-              <w:rPr>
-                <w:sz w:val="20"/>
-              </w:rPr>
-              <w:t>Revisit if project requirements change</w:t>
-            </w:r>
-          </w:p>
-        </w:tc>
-      </w:tr>
-      <w:tr>
-        <w:trPr>
-          <w:cantSplit/>
-        </w:trPr>
-        <w:tc>
-          <w:tcPr>
-            <w:tcW w:type="dxa" w:w="2016"/>
-          </w:tcPr>
-          <w:p>
-            <w:pPr>
-              <w:spacing w:after="0" w:line="250" w:lineRule="auto"/>
-            </w:pPr>
-            <w:r>
-              <w:rPr>
-                <w:sz w:val="20"/>
-              </w:rPr>
-              <w:t>Requirements</w:t>
-            </w:r>
-          </w:p>
-        </w:tc>
-        <w:tc>
-          <w:tcPr>
-            <w:tcW w:type="dxa" w:w="3888"/>
-          </w:tcPr>
-          <w:p>
-            <w:pPr>
-              <w:spacing w:after="0" w:line="250" w:lineRule="auto"/>
-            </w:pPr>
-            <w:r>
-              <w:rPr>
-                <w:sz w:val="20"/>
-              </w:rPr>
-              <w:t>Named requirements and acceptance criteria</w:t>
-            </w:r>
-          </w:p>
-        </w:tc>
-        <w:tc>
-          <w:tcPr>
-            <w:tcW w:type="dxa" w:w="4320"/>
-          </w:tcPr>
-          <w:p>
-            <w:pPr>
-              <w:spacing w:after="0" w:line="250" w:lineRule="auto"/>
-            </w:pPr>
-            <w:r>
-              <w:rPr>
-                <w:sz w:val="20"/>
-              </w:rPr>
-              <w:t>Execution records and evidence-driven changes</w:t>
-            </w:r>
-          </w:p>
-        </w:tc>
-      </w:tr>
-      <w:tr>
-        <w:trPr>
-          <w:cantSplit/>
-        </w:trPr>
-        <w:tc>
-          <w:tcPr>
-            <w:tcW w:type="dxa" w:w="2016"/>
-          </w:tcPr>
-          <w:p>
-            <w:pPr>
-              <w:spacing w:after="0" w:line="250" w:lineRule="auto"/>
-            </w:pPr>
-            <w:r>
-              <w:rPr>
-                <w:sz w:val="20"/>
-              </w:rPr>
-              <w:t>Architecture</w:t>
-            </w:r>
-          </w:p>
-        </w:tc>
-        <w:tc>
-          <w:tcPr>
-            <w:tcW w:type="dxa" w:w="3888"/>
-          </w:tcPr>
-          <w:p>
-            <w:pPr>
-              <w:spacing w:after="0" w:line="250" w:lineRule="auto"/>
-            </w:pPr>
-            <w:r>
-              <w:rPr>
-                <w:sz w:val="20"/>
-              </w:rPr>
-              <w:t>Context, use case, component, ERD, activity and sequence views</w:t>
-            </w:r>
-          </w:p>
-        </w:tc>
-        <w:tc>
-          <w:tcPr>
-            <w:tcW w:type="dxa" w:w="4320"/>
-          </w:tcPr>
-          <w:p>
-            <w:pPr>
-              <w:spacing w:after="0" w:line="250" w:lineRule="auto"/>
-            </w:pPr>
-            <w:r>
-              <w:rPr>
-                <w:sz w:val="20"/>
-              </w:rPr>
-              <w:t>Independent team review</w:t>
-            </w:r>
-          </w:p>
-        </w:tc>
-      </w:tr>
-      <w:tr>
-        <w:trPr>
-          <w:cantSplit/>
-        </w:trPr>
-        <w:tc>
-          <w:tcPr>
-            <w:tcW w:type="dxa" w:w="2016"/>
-          </w:tcPr>
-          <w:p>
-            <w:pPr>
-              <w:spacing w:after="0" w:line="250" w:lineRule="auto"/>
-            </w:pPr>
-            <w:r>
-              <w:rPr>
-                <w:sz w:val="20"/>
-              </w:rPr>
-              <w:t>UX and prototype</w:t>
-            </w:r>
-          </w:p>
-        </w:tc>
-        <w:tc>
-          <w:tcPr>
-            <w:tcW w:type="dxa" w:w="3888"/>
-          </w:tcPr>
-          <w:p>
-            <w:pPr>
-              <w:spacing w:after="0" w:line="250" w:lineRule="auto"/>
-            </w:pPr>
-            <w:r>
-              <w:rPr>
-                <w:sz w:val="20"/>
-              </w:rPr>
-              <w:t>Existing Vue and Go implementation and walkthrough</w:t>
-            </w:r>
-          </w:p>
-        </w:tc>
-        <w:tc>
-          <w:tcPr>
-            <w:tcW w:type="dxa" w:w="4320"/>
-          </w:tcPr>
-          <w:p>
-            <w:pPr>
-              <w:spacing w:after="0" w:line="250" w:lineRule="auto"/>
-            </w:pPr>
-            <w:r>
-              <w:rPr>
-                <w:sz w:val="20"/>
-              </w:rPr>
-              <w:t>Dated browser demonstration</w:t>
-            </w:r>
-          </w:p>
-        </w:tc>
-      </w:tr>
-      <w:tr>
-        <w:trPr>
-          <w:cantSplit/>
-        </w:trPr>
-        <w:tc>
-          <w:tcPr>
-            <w:tcW w:type="dxa" w:w="2016"/>
-          </w:tcPr>
-          <w:p>
-            <w:pPr>
-              <w:spacing w:after="0" w:line="250" w:lineRule="auto"/>
-            </w:pPr>
-            <w:r>
-              <w:rPr>
-                <w:sz w:val="20"/>
-              </w:rPr>
-              <w:t>Evaluation</w:t>
-            </w:r>
-          </w:p>
-        </w:tc>
-        <w:tc>
-          <w:tcPr>
-            <w:tcW w:type="dxa" w:w="3888"/>
-          </w:tcPr>
-          <w:p>
-            <w:pPr>
-              <w:spacing w:after="0" w:line="250" w:lineRule="auto"/>
-            </w:pPr>
-            <w:r>
-              <w:rPr>
-                <w:sz w:val="20"/>
-              </w:rPr>
-              <w:t>Manual comparison, rubric, measures and bias controls</w:t>
-            </w:r>
-          </w:p>
-        </w:tc>
-        <w:tc>
-          <w:tcPr>
-            <w:tcW w:type="dxa" w:w="4320"/>
-          </w:tcPr>
-          <w:p>
-            <w:pPr>
-              <w:spacing w:after="0" w:line="250" w:lineRule="auto"/>
-            </w:pPr>
-            <w:r>
-              <w:rPr>
-                <w:sz w:val="20"/>
-              </w:rPr>
-              <w:t>Recruitment and later study execution</w:t>
-            </w:r>
-          </w:p>
-        </w:tc>
-      </w:tr>
-      <w:tr>
-        <w:trPr>
-          <w:cantSplit/>
-        </w:trPr>
-        <w:tc>
-          <w:tcPr>
-            <w:tcW w:type="dxa" w:w="2016"/>
-          </w:tcPr>
-          <w:p>
-            <w:pPr>
-              <w:spacing w:after="0" w:line="250" w:lineRule="auto"/>
-            </w:pPr>
-            <w:r>
-              <w:rPr>
-                <w:sz w:val="20"/>
-              </w:rPr>
-              <w:t>Management</w:t>
-            </w:r>
-          </w:p>
-        </w:tc>
-        <w:tc>
-          <w:tcPr>
-            <w:tcW w:type="dxa" w:w="3888"/>
-          </w:tcPr>
-          <w:p>
-            <w:pPr>
-              <w:spacing w:after="0" w:line="250" w:lineRule="auto"/>
-            </w:pPr>
-            <w:r>
-              <w:rPr>
-                <w:sz w:val="20"/>
-              </w:rPr>
-              <w:t>Contribution summary and live YouTrack project</w:t>
-            </w:r>
-          </w:p>
-        </w:tc>
-        <w:tc>
-          <w:tcPr>
-            <w:tcW w:type="dxa" w:w="4320"/>
-          </w:tcPr>
-          <w:p>
-            <w:pPr>
-              <w:spacing w:after="0" w:line="250" w:lineRule="auto"/>
-            </w:pPr>
-            <w:r>
-              <w:rPr>
-                <w:sz w:val="20"/>
-              </w:rPr>
-              <w:t>Member accounts, linked reviews and submission tag</w:t>
-            </w:r>
-          </w:p>
-        </w:tc>
-      </w:tr>
-      <w:tr>
-        <w:trPr>
-          <w:cantSplit/>
-        </w:trPr>
-        <w:tc>
-          <w:tcPr>
-            <w:tcW w:type="dxa" w:w="2016"/>
-          </w:tcPr>
-          <w:p>
-            <w:pPr>
-              <w:spacing w:after="0" w:line="250" w:lineRule="auto"/>
-            </w:pPr>
-            <w:r>
-              <w:rPr>
-                <w:sz w:val="20"/>
-              </w:rPr>
-              <w:t>Supervision</w:t>
-            </w:r>
-          </w:p>
-        </w:tc>
-        <w:tc>
-          <w:tcPr>
-            <w:tcW w:type="dxa" w:w="3888"/>
-          </w:tcPr>
-          <w:p>
-            <w:pPr>
-              <w:spacing w:after="0" w:line="250" w:lineRule="auto"/>
-            </w:pPr>
-            <w:r>
-              <w:rPr>
-                <w:sz w:val="20"/>
-              </w:rPr>
-              <w:t>Written approval and mapped revisions</w:t>
-            </w:r>
-          </w:p>
-        </w:tc>
-        <w:tc>
-          <w:tcPr>
-            <w:tcW w:type="dxa" w:w="4320"/>
-          </w:tcPr>
-          <w:p>
-            <w:pPr>
-              <w:spacing w:after="0" w:line="250" w:lineRule="auto"/>
-            </w:pPr>
-            <w:r>
-              <w:rPr>
-                <w:sz w:val="20"/>
-              </w:rPr>
-              <w:t>Follow-up meeting and signed form procedure</w:t>
-            </w:r>
-          </w:p>
-        </w:tc>
-      </w:tr>
-    </w:tbl>
-    <w:p>
-      <w:pPr>
-        <w:spacing w:after="20" w:before="0" w:line="240" w:lineRule="auto"/>
-      </w:pPr>
-      <w:r>
-        <w:rPr>
-          <w:sz w:val="4"/>
-        </w:rPr>
-      </w:r>
-    </w:p>
-    <w:p>
-      <w:r>
-        <w:t>This revision addresses the supervisor's recommendations in the written proposal. Human review, field evidence, member account setup, and experiments retain their actual status. The accompanying CRITERIA_CHECKLIST.md maps all eleven components and Git requirements to evidence and remaining actions. The team should state these boundaries clearly while presenting the implemented prototype and the rationale for its design.</w:t>
-      </w:r>
-    </w:p>
-    <w:p>
-      <w:pPr>
-        <w:pStyle w:val="Heading1"/>
-        <w:pageBreakBefore/>
-      </w:pPr>
-      <w:r>
         <w:t>References</w:t>
       </w:r>
     </w:p>
@@ -8319,43 +7245,135 @@
     </w:p>
     <w:p>
       <w:r>
-        <w:t>[1] Norheim, J. J., Rebentisch, E., Xiao, D., Draeger, L., Kerbrat, A., and de Weck, O. L. (2024). Challenges in applying large language models to requirements engineering tasks. Design Science, 10, e16. https://doi.org/10.1017/dsj.2024.8</w:t>
+        <w:t xml:space="preserve">[1] Norheim, J. J., Rebentisch, E., Xiao, D., Draeger, L., Kerbrat, A., and de Weck, O. L. (2024). Challenges in applying large language models to requirements engineering tasks. Design Science, 10, e16. </w:t>
       </w:r>
+      <w:hyperlink r:id="rId20">
+        <w:r>
+          <w:rPr>
+            <w:color w:val="0563C1"/>
+            <w:u w:val="single"/>
+          </w:rPr>
+          <w:t>https://doi.org/10.1017/dsj.2024.8</w:t>
+        </w:r>
+      </w:hyperlink>
+      <w:r/>
     </w:p>
     <w:p>
       <w:r>
-        <w:t>[2] Hemmat, A., Sharbaf, M., Kolahdouz-Rahimi, S., Lano, K., and Tehrani, S. Y. (2025). Research directions for using LLM in software requirement engineering: a systematic review. Frontiers in Computer Science, 7, 1519437. https://doi.org/10.3389/fcomp.2025.1519437</w:t>
+        <w:t xml:space="preserve">[2] Hemmat, A., Sharbaf, M., Kolahdouz-Rahimi, S., Lano, K., and Tehrani, S. Y. (2025). Research directions for using LLM in software requirement engineering: a systematic review. Frontiers in Computer Science, 7, 1519437. </w:t>
       </w:r>
+      <w:hyperlink r:id="rId21">
+        <w:r>
+          <w:rPr>
+            <w:color w:val="0563C1"/>
+            <w:u w:val="single"/>
+          </w:rPr>
+          <w:t>https://doi.org/10.3389/fcomp.2025.1519437</w:t>
+        </w:r>
+      </w:hyperlink>
+      <w:r/>
     </w:p>
     <w:p>
       <w:r>
-        <w:t>[3] Ebrahim, M., Guirguis, S., and Basta, C. (2025). Enhancing Software Requirements Engineering with Language Models and Prompting Techniques: Insights from the Current Research and Future Directions. Proceedings of the 63rd Annual Meeting of the Association for Computational Linguistics, Student Research Workshop, 486–496. https://aclanthology.org/2025.acl-srw.31/</w:t>
+        <w:t xml:space="preserve">[3] Ebrahim, M., Guirguis, S., and Basta, C. (2025). Enhancing Software Requirements Engineering with Language Models and Prompting Techniques: Insights from the Current Research and Future Directions. Proceedings of the 63rd Annual Meeting of the Association for Computational Linguistics, Student Research Workshop, 486–496. </w:t>
       </w:r>
+      <w:hyperlink r:id="rId22">
+        <w:r>
+          <w:rPr>
+            <w:color w:val="0563C1"/>
+            <w:u w:val="single"/>
+          </w:rPr>
+          <w:t>https://aclanthology.org/2025.acl-srw.31/</w:t>
+        </w:r>
+      </w:hyperlink>
+      <w:r/>
     </w:p>
     <w:p>
       <w:r>
-        <w:t>[4] Luitel, D., Hassani, S., and Sabetzadeh, M. (2024). Improving requirements completeness: automated assistance through large language models. Requirements Engineering, 29, 73–95. https://doi.org/10.1007/s00766-024-00416-3</w:t>
+        <w:t xml:space="preserve">[4] Luitel, D., Hassani, S., and Sabetzadeh, M. (2024). Improving requirements completeness: automated assistance through large language models. Requirements Engineering, 29, 73–95. </w:t>
       </w:r>
+      <w:hyperlink r:id="rId23">
+        <w:r>
+          <w:rPr>
+            <w:color w:val="0563C1"/>
+            <w:u w:val="single"/>
+          </w:rPr>
+          <w:t>https://doi.org/10.1007/s00766-024-00416-3</w:t>
+        </w:r>
+      </w:hyperlink>
+      <w:r/>
     </w:p>
     <w:p>
       <w:r>
-        <w:t>[5] Ji, Z., et al. (2023). Survey of Hallucination in Natural Language Generation. ACM Computing Surveys, 55(12). https://doi.org/10.1145/3571730 . Author manuscript: https://arxiv.org/abs/2202.03629</w:t>
+        <w:t xml:space="preserve">[5] Ji, Z., et al. (2023). Survey of Hallucination in Natural Language Generation. ACM Computing Surveys, 55(12). </w:t>
       </w:r>
+      <w:hyperlink r:id="rId24">
+        <w:r>
+          <w:rPr>
+            <w:color w:val="0563C1"/>
+            <w:u w:val="single"/>
+          </w:rPr>
+          <w:t>https://doi.org/10.1145/3571730</w:t>
+        </w:r>
+      </w:hyperlink>
+      <w:r>
+        <w:t xml:space="preserve"> . Author manuscript: </w:t>
+      </w:r>
+      <w:hyperlink r:id="rId25">
+        <w:r>
+          <w:rPr>
+            <w:color w:val="0563C1"/>
+            <w:u w:val="single"/>
+          </w:rPr>
+          <w:t>https://arxiv.org/abs/2202.03629</w:t>
+        </w:r>
+      </w:hyperlink>
+      <w:r/>
     </w:p>
     <w:p>
       <w:r>
-        <w:t>[6] Lin, S., Hilton, J., and Evans, O. (2022). TruthfulQA: Measuring How Models Mimic Human Falsehoods. Proceedings of the 60th Annual Meeting of the Association for Computational Linguistics, Volume 1, 3214–3252. https://aclanthology.org/2022.acl-long.229/</w:t>
+        <w:t xml:space="preserve">[6] Lin, S., Hilton, J., and Evans, O. (2022). TruthfulQA: Measuring How Models Mimic Human Falsehoods. Proceedings of the 60th Annual Meeting of the Association for Computational Linguistics, Volume 1, 3214–3252. </w:t>
       </w:r>
+      <w:hyperlink r:id="rId26">
+        <w:r>
+          <w:rPr>
+            <w:color w:val="0563C1"/>
+            <w:u w:val="single"/>
+          </w:rPr>
+          <w:t>https://aclanthology.org/2022.acl-long.229/</w:t>
+        </w:r>
+      </w:hyperlink>
+      <w:r/>
     </w:p>
     <w:p>
       <w:r>
-        <w:t>[7] Radford, A., Kim, J. W., Xu, T., Brockman, G., McLeavey, C., and Sutskever, I. (2023). Robust Speech Recognition via Large-Scale Weak Supervision. Proceedings of Machine Learning Research, 202, 28492–28518. https://proceedings.mlr.press/v202/radford23a.html</w:t>
+        <w:t xml:space="preserve">[7] Radford, A., Kim, J. W., Xu, T., Brockman, G., McLeavey, C., and Sutskever, I. (2023). Robust Speech Recognition via Large-Scale Weak Supervision. Proceedings of Machine Learning Research, 202, 28492–28518. </w:t>
       </w:r>
+      <w:hyperlink r:id="rId27">
+        <w:r>
+          <w:rPr>
+            <w:color w:val="0563C1"/>
+            <w:u w:val="single"/>
+          </w:rPr>
+          <w:t>https://proceedings.mlr.press/v202/radford23a.html</w:t>
+        </w:r>
+      </w:hyperlink>
+      <w:r/>
     </w:p>
     <w:p>
       <w:r>
-        <w:t>[8] Amershi, S., et al. (2019). Guidelines for Human-AI Interaction. Proceedings of CHI 2019. https://www.microsoft.com/en-us/research/publication/guidelines-for-human-ai-interaction/</w:t>
+        <w:t xml:space="preserve">[8] Amershi, S., et al. (2019). Guidelines for Human-AI Interaction. Proceedings of CHI 2019. </w:t>
       </w:r>
+      <w:hyperlink r:id="rId28">
+        <w:r>
+          <w:rPr>
+            <w:color w:val="0563C1"/>
+            <w:u w:val="single"/>
+          </w:rPr>
+          <w:t>https://www.microsoft.com/en-us/research/publication/guidelines-for-human-ai-interaction/</w:t>
+        </w:r>
+      </w:hyperlink>
+      <w:r/>
     </w:p>
     <w:p>
       <w:pPr>
@@ -8368,48 +7386,150 @@
     </w:p>
     <w:p>
       <w:r>
-        <w:t>[9] Upwork. Uma, Upwork's Mindful AI. Product documentation and availability statements. https://www.upwork.com/uma/</w:t>
+        <w:t xml:space="preserve">[9] Upwork. Uma, Upwork's Mindful AI. Product documentation and availability statements. </w:t>
       </w:r>
+      <w:hyperlink r:id="rId29">
+        <w:r>
+          <w:rPr>
+            <w:color w:val="0563C1"/>
+            <w:u w:val="single"/>
+          </w:rPr>
+          <w:t>https://www.upwork.com/uma/</w:t>
+        </w:r>
+      </w:hyperlink>
+      <w:r/>
     </w:p>
     <w:p>
       <w:r>
-        <w:t>[10] Fiverr Help Center. Post a project brief, get tailored offers for your project. https://help.fiverr.com/hc/en-us/articles/37552341279633-Post-a-project-brief-get-tailored-offers-for-your-project</w:t>
+        <w:t xml:space="preserve">[10] Fiverr Help Center. Post a project brief, get tailored offers for your project. </w:t>
       </w:r>
+      <w:hyperlink r:id="rId30">
+        <w:r>
+          <w:rPr>
+            <w:color w:val="0563C1"/>
+            <w:u w:val="single"/>
+          </w:rPr>
+          <w:t>https://help.fiverr.com/hc/en-us/articles/37552341279633-Post-a-project-brief-get-tailored-offers-for-your-project</w:t>
+        </w:r>
+      </w:hyperlink>
+      <w:r/>
     </w:p>
     <w:p>
       <w:r>
-        <w:t>[11] Riipen Help Center. How employers use Riipen. https://help.riipen.com/en/articles/7321556-how-employers-use-riipen</w:t>
+        <w:t xml:space="preserve">[11] Riipen Help Center. How employers use Riipen. </w:t>
       </w:r>
+      <w:hyperlink r:id="rId31">
+        <w:r>
+          <w:rPr>
+            <w:color w:val="0563C1"/>
+            <w:u w:val="single"/>
+          </w:rPr>
+          <w:t>https://help.riipen.com/en/articles/7321556-how-employers-use-riipen</w:t>
+        </w:r>
+      </w:hyperlink>
+      <w:r/>
     </w:p>
     <w:p>
       <w:r>
-        <w:t>[12] Atlassian Support. What is Jira Product Discovery? https://support.atlassian.com/jira-product-discovery/docs/what-is-jira-product-discovery/ . Supporting guide: https://www.atlassian.com/software/jira/product-discovery/guides/ideas/overview</w:t>
+        <w:t xml:space="preserve">[12] Atlassian Support. What is Jira Product Discovery? </w:t>
       </w:r>
+      <w:hyperlink r:id="rId32">
+        <w:r>
+          <w:rPr>
+            <w:color w:val="0563C1"/>
+            <w:u w:val="single"/>
+          </w:rPr>
+          <w:t>https://support.atlassian.com/jira-product-discovery/docs/what-is-jira-product-discovery/</w:t>
+        </w:r>
+      </w:hyperlink>
+      <w:r>
+        <w:t xml:space="preserve"> . Supporting guide: </w:t>
+      </w:r>
+      <w:hyperlink r:id="rId33">
+        <w:r>
+          <w:rPr>
+            <w:color w:val="0563C1"/>
+            <w:u w:val="single"/>
+          </w:rPr>
+          <w:t>https://www.atlassian.com/software/jira/product-discovery/guides/ideas/overview</w:t>
+        </w:r>
+      </w:hyperlink>
+      <w:r/>
     </w:p>
     <w:p>
       <w:r>
-        <w:t>[13] Groq Documentation. Structured Outputs. https://console.groq.com/docs/structured-outputs</w:t>
+        <w:t xml:space="preserve">[13] Groq Documentation. Structured Outputs. </w:t>
       </w:r>
+      <w:hyperlink r:id="rId34">
+        <w:r>
+          <w:rPr>
+            <w:color w:val="0563C1"/>
+            <w:u w:val="single"/>
+          </w:rPr>
+          <w:t>https://console.groq.com/docs/structured-outputs</w:t>
+        </w:r>
+      </w:hyperlink>
+      <w:r/>
     </w:p>
     <w:p>
       <w:r>
-        <w:t>[14] Groq Documentation. Speech to Text. https://console.groq.com/docs/speech-to-text</w:t>
+        <w:t xml:space="preserve">[14] Groq Documentation. Speech to Text. </w:t>
       </w:r>
+      <w:hyperlink r:id="rId35">
+        <w:r>
+          <w:rPr>
+            <w:color w:val="0563C1"/>
+            <w:u w:val="single"/>
+          </w:rPr>
+          <w:t>https://console.groq.com/docs/speech-to-text</w:t>
+        </w:r>
+      </w:hyperlink>
+      <w:r/>
     </w:p>
     <w:p>
       <w:r>
-        <w:t>[15] Go standard library. Package net/http. https://pkg.go.dev/net/http</w:t>
+        <w:t xml:space="preserve">[15] Go standard library. Package net/http. </w:t>
       </w:r>
+      <w:hyperlink r:id="rId36">
+        <w:r>
+          <w:rPr>
+            <w:color w:val="0563C1"/>
+            <w:u w:val="single"/>
+          </w:rPr>
+          <w:t>https://pkg.go.dev/net/http</w:t>
+        </w:r>
+      </w:hyperlink>
+      <w:r/>
     </w:p>
     <w:p>
       <w:r>
-        <w:t>[16] PostgreSQL 16 Documentation. Transactions. https://www.postgresql.org/docs/16/tutorial-transactions.html</w:t>
+        <w:t xml:space="preserve">[16] PostgreSQL 16 Documentation. Transactions. </w:t>
       </w:r>
+      <w:hyperlink r:id="rId37">
+        <w:r>
+          <w:rPr>
+            <w:color w:val="0563C1"/>
+            <w:u w:val="single"/>
+          </w:rPr>
+          <w:t>https://www.postgresql.org/docs/16/tutorial-transactions.html</w:t>
+        </w:r>
+      </w:hyperlink>
+      <w:r/>
     </w:p>
     <w:p>
       <w:r>
-        <w:t>[17] Vue Documentation. Quick Start. https://vuejs.org/guide/quick-start.html</w:t>
+        <w:t xml:space="preserve">[17] Vue Documentation. Quick Start. </w:t>
       </w:r>
+      <w:hyperlink r:id="rId38">
+        <w:r>
+          <w:rPr>
+            <w:color w:val="0563C1"/>
+            <w:u w:val="single"/>
+          </w:rPr>
+          <w:t>https://vuejs.org/guide/quick-start.html</w:t>
+        </w:r>
+      </w:hyperlink>
+      <w:r/>
     </w:p>
     <w:p>
       <w:pPr>
@@ -8421,12 +7541,36 @@
     </w:p>
     <w:p>
       <w:r>
-        <w:t>[18] Diploma repository. https://github.com/bekasyl00/Qadam_Diplom . Includes the Vue interface, Go server, task and proposal logic, AI integration, and configuration examples.</w:t>
+        <w:t xml:space="preserve">[18] Diploma repository. </w:t>
+      </w:r>
+      <w:hyperlink r:id="rId11">
+        <w:r>
+          <w:rPr>
+            <w:color w:val="0563C1"/>
+            <w:u w:val="single"/>
+          </w:rPr>
+          <w:t>https://github.com/bekasyl00/Qadam_Diplom</w:t>
+        </w:r>
+      </w:hyperlink>
+      <w:r>
+        <w:t xml:space="preserve"> . Includes the Vue interface, Go server, task and proposal logic, AI integration, and configuration examples.</w:t>
       </w:r>
     </w:p>
     <w:p>
       <w:r>
-        <w:t>[19] Qadam repository history and branch metadata, inspected 19 October 2026. https://github.com/bekasyl00/Qadam_Diplom/commits/main/ . Authored changes support the contribution summary; they do not establish independent review or unpublished work.</w:t>
+        <w:t xml:space="preserve">[19] Qadam repository history and branch metadata, inspected 19 October 2026. </w:t>
+      </w:r>
+      <w:hyperlink r:id="rId39">
+        <w:r>
+          <w:rPr>
+            <w:color w:val="0563C1"/>
+            <w:u w:val="single"/>
+          </w:rPr>
+          <w:t>https://github.com/bekasyl00/Qadam_Diplom/commits/main/</w:t>
+        </w:r>
+      </w:hyperlink>
+      <w:r>
+        <w:t xml:space="preserve"> . Authored changes support the contribution summary; they do not establish independent review or unpublished work.</w:t>
       </w:r>
     </w:p>
     <w:p>
@@ -8477,11 +7621,6 @@
       </w:r>
       <w:r>
         <w:t>. Planned tasks and empty forms are not results or approvals.</w:t>
-      </w:r>
-    </w:p>
-    <w:p>
-      <w:r>
-        <w:t>[22] Altynbek Seitenov. Written supervisor feedback supplied by Bekasyl Zhaksylyk on 19 October 2026. Positive assessment and approval for the first pre-defense, with recommendations on literature, architecture, methodology and contributions. Original message date not provided; retained by the team.</w:t>
       </w:r>
     </w:p>
     <w:sectPr>

</xml_diff>

<commit_message>
docs(QADAM-12): consolidate probationary period submission report
</commit_message>
<xml_diff>
--- a/docs/diploma/Qadam_Predefense_Report.docx
+++ b/docs/diploma/Qadam_Predefense_Report.docx
@@ -16,6 +16,7 @@
       <w:r>
         <w:rPr>
           <w:rFonts w:ascii="Times New Roman" w:hAnsi="Times New Roman" w:cs="Times New Roman"/>
+          <w:color w:val="000000"/>
           <w:sz w:val="22"/>
           <w:szCs w:val="22"/>
         </w:rPr>
@@ -25,6 +26,7 @@
       <w:r>
         <w:rPr>
           <w:rFonts w:ascii="Times New Roman" w:hAnsi="Times New Roman" w:cs="Times New Roman"/>
+          <w:color w:val="000000"/>
           <w:sz w:val="22"/>
           <w:szCs w:val="22"/>
         </w:rPr>
@@ -34,6 +36,7 @@
       <w:r>
         <w:rPr>
           <w:rFonts w:ascii="Times New Roman" w:hAnsi="Times New Roman" w:cs="Times New Roman"/>
+          <w:color w:val="000000"/>
           <w:sz w:val="22"/>
           <w:szCs w:val="22"/>
         </w:rPr>
@@ -129,7 +132,7 @@
           <w:b/>
           <w:bCs/>
         </w:rPr>
-        <w:t>Pre-defense preparation report</w:t>
+        <w:t>Consolidated probationary period report</w:t>
       </w:r>
     </w:p>
     <w:p>
@@ -190,6 +193,14 @@
     </w:p>
     <w:p>
       <w:pPr>
+        <w:pageBreakBefore w:val="0"/>
+      </w:pPr>
+      <w:r>
+        <w:t>Group: SE-2418</w:t>
+      </w:r>
+    </w:p>
+    <w:p>
+      <w:pPr>
         <w:rPr>
           <w:rFonts w:ascii="Times New Roman" w:hAnsi="Times New Roman" w:cs="Times New Roman"/>
         </w:rPr>
@@ -215,23 +226,13 @@
         </w:rPr>
       </w:pPr>
       <w:r>
-        <w:rPr>
-          <w:rFonts w:ascii="Times New Roman" w:hAnsi="Times New Roman" w:cs="Times New Roman"/>
-          <w:b/>
-        </w:rPr>
-        <w:t>Diploma repository</w:t>
-      </w:r>
-      <w:r>
-        <w:rPr>
-          <w:rFonts w:ascii="Times New Roman" w:hAnsi="Times New Roman" w:cs="Times New Roman"/>
-        </w:rPr>
-        <w:t xml:space="preserve"> — </w:t>
-      </w:r>
-      <w:hyperlink r:id="rId9" w:history="1">
+        <w:t xml:space="preserve">Diploma repository — </w:t>
+      </w:r>
+      <w:hyperlink r:id="rId9">
         <w:r>
           <w:rPr>
-            <w:rStyle w:val="aff8"/>
-            <w:rFonts w:ascii="Times New Roman" w:hAnsi="Times New Roman" w:cs="Times New Roman"/>
+            <w:color w:val="174D8C"/>
+            <w:u w:val="single"/>
           </w:rPr>
           <w:t>https://github.com/bekasyl00/Qadam_Diplom</w:t>
         </w:r>
@@ -239,6 +240,23 @@
     </w:p>
     <w:p>
       <w:pPr>
+        <w:pageBreakBefore w:val="0"/>
+      </w:pPr>
+      <w:r>
+        <w:t xml:space="preserve">Submission version: </w:t>
+      </w:r>
+      <w:hyperlink r:id="rId22">
+        <w:r>
+          <w:rPr>
+            <w:color w:val="174D8C"/>
+            <w:u w:val="single"/>
+          </w:rPr>
+          <w:t>https://github.com/bekasyl00/Qadam_Diplom/tree/prob-period-1</w:t>
+        </w:r>
+      </w:hyperlink>
+    </w:p>
+    <w:p>
+      <w:pPr>
         <w:rPr>
           <w:rFonts w:ascii="Times New Roman" w:hAnsi="Times New Roman" w:cs="Times New Roman"/>
           <w:lang w:val="kk-KZ"/>
@@ -248,21 +266,7 @@
         <w:rPr>
           <w:rFonts w:ascii="Times New Roman" w:hAnsi="Times New Roman" w:cs="Times New Roman"/>
         </w:rPr>
-        <w:t xml:space="preserve">This revised proposal presents </w:t>
-      </w:r>
-      <w:proofErr w:type="spellStart"/>
-      <w:r>
-        <w:rPr>
-          <w:rFonts w:ascii="Times New Roman" w:hAnsi="Times New Roman" w:cs="Times New Roman"/>
-        </w:rPr>
-        <w:t>Qadam</w:t>
-      </w:r>
-      <w:proofErr w:type="spellEnd"/>
-      <w:r>
-        <w:rPr>
-          <w:rFonts w:ascii="Times New Roman" w:hAnsi="Times New Roman" w:cs="Times New Roman"/>
-        </w:rPr>
-        <w:t>, its architecture, and the planned evaluation of AI-assisted business task formulation. Altynbek Seitenov has approved the project for the first pre-defense. The revision addresses his recommendations on the research gap, database and interaction models, evaluation methods, and individual contributions. Experiments and user interviews are still planned; their results are not claimed here.</w:t>
+        <w:t>This report presents Qadam, its architecture, requirements, prototype, team responsibilities and evaluation plan for the first probationary period. It consolidates the eleven required components. Experiments and user interviews remain planned; no completed study results are claimed.</w:t>
       </w:r>
     </w:p>
     <w:p>
@@ -312,6 +316,196 @@
       </w:r>
     </w:p>
     <w:p>
+      <w:pPr>
+        <w:pStyle w:val="21"/>
+        <w:pageBreakBefore/>
+        <w:spacing w:after="360"/>
+      </w:pPr>
+      <w:r>
+        <w:rPr>
+          <w:color w:val="000000"/>
+        </w:rPr>
+        <w:t>Contents</w:t>
+      </w:r>
+    </w:p>
+    <w:p>
+      <w:pPr>
+        <w:pageBreakBefore w:val="0"/>
+      </w:pPr>
+      <w:r>
+        <w:t>Required sections are listed in the submission order. Page numbers refer to this document.</w:t>
+      </w:r>
+    </w:p>
+    <w:p>
+      <w:pPr>
+        <w:pageBreakBefore w:val="0"/>
+        <w:spacing w:after="240"/>
+      </w:pPr>
+      <w:hyperlink w:anchor="section_1">
+        <w:r>
+          <w:rPr>
+            <w:sz w:val="22"/>
+          </w:rPr>
+          <w:t>1 Project proposal  —  3</w:t>
+        </w:r>
+      </w:hyperlink>
+    </w:p>
+    <w:p>
+      <w:pPr>
+        <w:pageBreakBefore w:val="0"/>
+        <w:spacing w:after="240"/>
+      </w:pPr>
+      <w:hyperlink w:anchor="section_2">
+        <w:r>
+          <w:rPr>
+            <w:sz w:val="22"/>
+          </w:rPr>
+          <w:t>2 Evidence of relevance  —  4</w:t>
+        </w:r>
+      </w:hyperlink>
+    </w:p>
+    <w:p>
+      <w:pPr>
+        <w:pageBreakBefore w:val="0"/>
+        <w:spacing w:after="240"/>
+      </w:pPr>
+      <w:hyperlink w:anchor="section_3">
+        <w:r>
+          <w:rPr>
+            <w:sz w:val="22"/>
+          </w:rPr>
+          <w:t>3 Literature review  —  5</w:t>
+        </w:r>
+      </w:hyperlink>
+    </w:p>
+    <w:p>
+      <w:pPr>
+        <w:pageBreakBefore w:val="0"/>
+        <w:spacing w:after="240"/>
+      </w:pPr>
+      <w:hyperlink w:anchor="section_4">
+        <w:r>
+          <w:rPr>
+            <w:sz w:val="22"/>
+          </w:rPr>
+          <w:t>4 Existing system comparison  —  8</w:t>
+        </w:r>
+      </w:hyperlink>
+    </w:p>
+    <w:p>
+      <w:pPr>
+        <w:pageBreakBefore w:val="0"/>
+        <w:spacing w:after="240"/>
+      </w:pPr>
+      <w:hyperlink w:anchor="section_5">
+        <w:r>
+          <w:rPr>
+            <w:sz w:val="22"/>
+          </w:rPr>
+          <w:t>5 Technology comparison  —  9</w:t>
+        </w:r>
+      </w:hyperlink>
+    </w:p>
+    <w:p>
+      <w:pPr>
+        <w:pageBreakBefore w:val="0"/>
+        <w:spacing w:after="240"/>
+      </w:pPr>
+      <w:hyperlink w:anchor="section_6">
+        <w:r>
+          <w:rPr>
+            <w:sz w:val="22"/>
+          </w:rPr>
+          <w:t>6 Requirements specification  —  10</w:t>
+        </w:r>
+      </w:hyperlink>
+    </w:p>
+    <w:p>
+      <w:pPr>
+        <w:pageBreakBefore w:val="0"/>
+        <w:spacing w:after="240"/>
+      </w:pPr>
+      <w:hyperlink w:anchor="section_7">
+        <w:r>
+          <w:rPr>
+            <w:sz w:val="22"/>
+          </w:rPr>
+          <w:t>7 Architecture and diagrams  —  12</w:t>
+        </w:r>
+      </w:hyperlink>
+    </w:p>
+    <w:p>
+      <w:pPr>
+        <w:pageBreakBefore w:val="0"/>
+        <w:spacing w:after="240"/>
+      </w:pPr>
+      <w:hyperlink w:anchor="section_8">
+        <w:r>
+          <w:rPr>
+            <w:sz w:val="22"/>
+          </w:rPr>
+          <w:t>8 UX and prototype  —  18</w:t>
+        </w:r>
+      </w:hyperlink>
+    </w:p>
+    <w:p>
+      <w:pPr>
+        <w:pageBreakBefore w:val="0"/>
+        <w:spacing w:after="240"/>
+      </w:pPr>
+      <w:hyperlink w:anchor="section_9">
+        <w:r>
+          <w:rPr>
+            <w:sz w:val="22"/>
+          </w:rPr>
+          <w:t>9 Verification and evaluation plan  —  21</w:t>
+        </w:r>
+      </w:hyperlink>
+    </w:p>
+    <w:p>
+      <w:pPr>
+        <w:pageBreakBefore w:val="0"/>
+        <w:spacing w:after="240"/>
+      </w:pPr>
+      <w:hyperlink w:anchor="section_10">
+        <w:r>
+          <w:rPr>
+            <w:sz w:val="22"/>
+          </w:rPr>
+          <w:t>10 Project management and risks  —  24</w:t>
+        </w:r>
+      </w:hyperlink>
+    </w:p>
+    <w:p>
+      <w:pPr>
+        <w:pageBreakBefore w:val="0"/>
+        <w:spacing w:after="240"/>
+      </w:pPr>
+      <w:hyperlink w:anchor="section_11">
+        <w:r>
+          <w:rPr>
+            <w:sz w:val="22"/>
+          </w:rPr>
+          <w:t>11 Supervisor feedback  —  28</w:t>
+        </w:r>
+      </w:hyperlink>
+    </w:p>
+    <w:p>
+      <w:pPr>
+        <w:pageBreakBefore w:val="0"/>
+        <w:spacing w:after="240"/>
+      </w:pPr>
+      <w:hyperlink w:anchor="section_12">
+        <w:r>
+          <w:rPr>
+            <w:sz w:val="22"/>
+          </w:rPr>
+          <w:t>References  —  29</w:t>
+        </w:r>
+      </w:hyperlink>
+    </w:p>
+    <w:p>
+      <w:bookmarkStart w:id="501" w:name="section_1"/>
       <w:pPr>
         <w:pStyle w:val="1"/>
         <w:pageBreakBefore/>
@@ -324,12 +518,13 @@
       <w:r>
         <w:rPr>
           <w:rFonts w:ascii="Times New Roman" w:hAnsi="Times New Roman" w:cs="Times New Roman"/>
+          <w:color w:val="000000"/>
           <w:sz w:val="22"/>
           <w:szCs w:val="22"/>
         </w:rPr>
-        <w:lastRenderedPageBreak/>
         <w:t>1 Project proposal</w:t>
       </w:r>
+      <w:bookmarkEnd w:id="501"/>
     </w:p>
     <w:p>
       <w:pPr>
@@ -343,6 +538,7 @@
       <w:r>
         <w:rPr>
           <w:rFonts w:ascii="Times New Roman" w:hAnsi="Times New Roman" w:cs="Times New Roman"/>
+          <w:color w:val="000000"/>
           <w:sz w:val="22"/>
           <w:szCs w:val="22"/>
         </w:rPr>
@@ -401,6 +597,7 @@
       <w:r>
         <w:rPr>
           <w:rFonts w:ascii="Times New Roman" w:hAnsi="Times New Roman" w:cs="Times New Roman"/>
+          <w:color w:val="000000"/>
           <w:sz w:val="22"/>
           <w:szCs w:val="22"/>
         </w:rPr>
@@ -445,6 +642,7 @@
       <w:r>
         <w:rPr>
           <w:rFonts w:ascii="Times New Roman" w:hAnsi="Times New Roman" w:cs="Times New Roman"/>
+          <w:color w:val="000000"/>
           <w:sz w:val="22"/>
           <w:szCs w:val="22"/>
         </w:rPr>
@@ -546,6 +744,7 @@
       <w:r>
         <w:rPr>
           <w:rFonts w:ascii="Times New Roman" w:hAnsi="Times New Roman" w:cs="Times New Roman"/>
+          <w:color w:val="000000"/>
           <w:sz w:val="22"/>
           <w:szCs w:val="22"/>
         </w:rPr>
@@ -579,6 +778,7 @@
       </w:r>
     </w:p>
     <w:p>
+      <w:bookmarkStart w:id="502" w:name="section_2"/>
       <w:pPr>
         <w:pStyle w:val="1"/>
         <w:pageBreakBefore/>
@@ -591,12 +791,13 @@
       <w:r>
         <w:rPr>
           <w:rFonts w:ascii="Times New Roman" w:hAnsi="Times New Roman" w:cs="Times New Roman"/>
+          <w:color w:val="000000"/>
           <w:sz w:val="22"/>
           <w:szCs w:val="22"/>
         </w:rPr>
-        <w:lastRenderedPageBreak/>
         <w:t>2 Evidence of relevance</w:t>
       </w:r>
+      <w:bookmarkEnd w:id="502"/>
     </w:p>
     <w:p>
       <w:pPr>
@@ -610,6 +811,7 @@
       <w:r>
         <w:rPr>
           <w:rFonts w:ascii="Times New Roman" w:hAnsi="Times New Roman" w:cs="Times New Roman"/>
+          <w:color w:val="000000"/>
           <w:sz w:val="22"/>
           <w:szCs w:val="22"/>
         </w:rPr>
@@ -1061,6 +1263,7 @@
       <w:r>
         <w:rPr>
           <w:rFonts w:ascii="Times New Roman" w:hAnsi="Times New Roman" w:cs="Times New Roman"/>
+          <w:color w:val="000000"/>
           <w:sz w:val="22"/>
           <w:szCs w:val="22"/>
         </w:rPr>
@@ -1105,6 +1308,7 @@
       <w:r>
         <w:rPr>
           <w:rFonts w:ascii="Times New Roman" w:hAnsi="Times New Roman" w:cs="Times New Roman"/>
+          <w:color w:val="000000"/>
           <w:sz w:val="22"/>
           <w:szCs w:val="22"/>
         </w:rPr>
@@ -1138,6 +1342,7 @@
       </w:r>
     </w:p>
     <w:p>
+      <w:bookmarkStart w:id="503" w:name="section_3"/>
       <w:pPr>
         <w:pStyle w:val="1"/>
         <w:pageBreakBefore/>
@@ -1150,12 +1355,13 @@
       <w:r>
         <w:rPr>
           <w:rFonts w:ascii="Times New Roman" w:hAnsi="Times New Roman" w:cs="Times New Roman"/>
+          <w:color w:val="000000"/>
           <w:sz w:val="22"/>
           <w:szCs w:val="22"/>
         </w:rPr>
-        <w:lastRenderedPageBreak/>
-        <w:t>3 Critical literature review</w:t>
-      </w:r>
+        <w:t>3 Literature review</w:t>
+      </w:r>
+      <w:bookmarkEnd w:id="503"/>
     </w:p>
     <w:p>
       <w:pPr>
@@ -1169,6 +1375,7 @@
       <w:r>
         <w:rPr>
           <w:rFonts w:ascii="Times New Roman" w:hAnsi="Times New Roman" w:cs="Times New Roman"/>
+          <w:color w:val="000000"/>
           <w:sz w:val="22"/>
           <w:szCs w:val="22"/>
         </w:rPr>
@@ -1227,6 +1434,7 @@
       <w:r>
         <w:rPr>
           <w:rFonts w:ascii="Times New Roman" w:hAnsi="Times New Roman" w:cs="Times New Roman"/>
+          <w:color w:val="000000"/>
           <w:sz w:val="22"/>
           <w:szCs w:val="22"/>
         </w:rPr>
@@ -1371,7 +1579,7 @@
     </w:p>
     <w:p>
       <w:pPr>
-        <w:pStyle w:val="1"/>
+        <w:pStyle w:val="21"/>
         <w:pageBreakBefore/>
         <w:rPr>
           <w:rFonts w:ascii="Times New Roman" w:hAnsi="Times New Roman" w:cs="Times New Roman"/>
@@ -1382,11 +1590,11 @@
       <w:r>
         <w:rPr>
           <w:rFonts w:ascii="Times New Roman" w:hAnsi="Times New Roman" w:cs="Times New Roman"/>
+          <w:color w:val="000000"/>
           <w:sz w:val="22"/>
           <w:szCs w:val="22"/>
         </w:rPr>
-        <w:lastRenderedPageBreak/>
-        <w:t>3 Research gap and design response</w:t>
+        <w:t>Research gap and design response</w:t>
       </w:r>
     </w:p>
     <w:p>
@@ -1401,6 +1609,7 @@
       <w:r>
         <w:rPr>
           <w:rFonts w:ascii="Times New Roman" w:hAnsi="Times New Roman" w:cs="Times New Roman"/>
+          <w:color w:val="000000"/>
           <w:sz w:val="22"/>
           <w:szCs w:val="22"/>
         </w:rPr>
@@ -1827,6 +2036,7 @@
       <w:r>
         <w:rPr>
           <w:rFonts w:ascii="Times New Roman" w:hAnsi="Times New Roman" w:cs="Times New Roman"/>
+          <w:color w:val="000000"/>
           <w:sz w:val="22"/>
           <w:szCs w:val="22"/>
         </w:rPr>
@@ -1861,7 +2071,7 @@
     </w:p>
     <w:p>
       <w:pPr>
-        <w:pStyle w:val="1"/>
+        <w:pStyle w:val="21"/>
         <w:pageBreakBefore/>
         <w:rPr>
           <w:rFonts w:ascii="Times New Roman" w:hAnsi="Times New Roman" w:cs="Times New Roman"/>
@@ -1872,11 +2082,11 @@
       <w:r>
         <w:rPr>
           <w:rFonts w:ascii="Times New Roman" w:hAnsi="Times New Roman" w:cs="Times New Roman"/>
+          <w:color w:val="000000"/>
           <w:sz w:val="22"/>
           <w:szCs w:val="22"/>
         </w:rPr>
-        <w:lastRenderedPageBreak/>
-        <w:t>3 Publication analysis and reading preparation</w:t>
+        <w:t>Publication analysis and reading preparation</w:t>
       </w:r>
     </w:p>
     <w:tbl>
@@ -2535,6 +2745,7 @@
       <w:r>
         <w:rPr>
           <w:rFonts w:ascii="Times New Roman" w:hAnsi="Times New Roman" w:cs="Times New Roman"/>
+          <w:color w:val="000000"/>
           <w:sz w:val="22"/>
           <w:szCs w:val="22"/>
         </w:rPr>
@@ -2618,6 +2829,7 @@
       </w:r>
     </w:p>
     <w:p>
+      <w:bookmarkStart w:id="504" w:name="section_4"/>
       <w:pPr>
         <w:pStyle w:val="1"/>
         <w:pageBreakBefore/>
@@ -2630,12 +2842,13 @@
       <w:r>
         <w:rPr>
           <w:rFonts w:ascii="Times New Roman" w:hAnsi="Times New Roman" w:cs="Times New Roman"/>
+          <w:color w:val="000000"/>
           <w:sz w:val="22"/>
           <w:szCs w:val="22"/>
         </w:rPr>
-        <w:lastRenderedPageBreak/>
         <w:t>4 Existing system comparison</w:t>
       </w:r>
+      <w:bookmarkEnd w:id="504"/>
     </w:p>
     <w:p>
       <w:pPr>
@@ -3642,6 +3855,7 @@
       <w:r>
         <w:rPr>
           <w:rFonts w:ascii="Times New Roman" w:hAnsi="Times New Roman" w:cs="Times New Roman"/>
+          <w:color w:val="000000"/>
           <w:sz w:val="22"/>
           <w:szCs w:val="22"/>
         </w:rPr>
@@ -3705,6 +3919,7 @@
       </w:r>
     </w:p>
     <w:p>
+      <w:bookmarkStart w:id="505" w:name="section_5"/>
       <w:pPr>
         <w:pStyle w:val="1"/>
         <w:pageBreakBefore/>
@@ -3717,12 +3932,13 @@
       <w:r>
         <w:rPr>
           <w:rFonts w:ascii="Times New Roman" w:hAnsi="Times New Roman" w:cs="Times New Roman"/>
+          <w:color w:val="000000"/>
           <w:sz w:val="22"/>
           <w:szCs w:val="22"/>
         </w:rPr>
-        <w:lastRenderedPageBreak/>
-        <w:t>5 Technology decisions</w:t>
-      </w:r>
+        <w:t>5 Technology comparison</w:t>
+      </w:r>
+      <w:bookmarkEnd w:id="505"/>
     </w:p>
     <w:p>
       <w:pPr>
@@ -4240,6 +4456,7 @@
       <w:r>
         <w:rPr>
           <w:rFonts w:ascii="Times New Roman" w:hAnsi="Times New Roman" w:cs="Times New Roman"/>
+          <w:color w:val="000000"/>
           <w:sz w:val="22"/>
           <w:szCs w:val="22"/>
         </w:rPr>
@@ -4329,6 +4546,7 @@
       </w:r>
     </w:p>
     <w:p>
+      <w:bookmarkStart w:id="506" w:name="section_6"/>
       <w:pPr>
         <w:pStyle w:val="1"/>
         <w:pageBreakBefore/>
@@ -4341,12 +4559,13 @@
       <w:r>
         <w:rPr>
           <w:rFonts w:ascii="Times New Roman" w:hAnsi="Times New Roman" w:cs="Times New Roman"/>
+          <w:color w:val="000000"/>
           <w:sz w:val="22"/>
           <w:szCs w:val="22"/>
         </w:rPr>
-        <w:lastRenderedPageBreak/>
-        <w:t>6 Functional requirements</w:t>
-      </w:r>
+        <w:t>6 Requirements specification</w:t>
+      </w:r>
+      <w:bookmarkEnd w:id="506"/>
     </w:p>
     <w:p>
       <w:pPr>
@@ -5034,6 +5253,7 @@
       <w:r>
         <w:rPr>
           <w:rFonts w:ascii="Times New Roman" w:hAnsi="Times New Roman" w:cs="Times New Roman"/>
+          <w:color w:val="000000"/>
           <w:sz w:val="22"/>
           <w:szCs w:val="22"/>
         </w:rPr>
@@ -5069,7 +5289,7 @@
     </w:p>
     <w:p>
       <w:pPr>
-        <w:pStyle w:val="1"/>
+        <w:pStyle w:val="21"/>
         <w:pageBreakBefore/>
         <w:rPr>
           <w:rFonts w:ascii="Times New Roman" w:hAnsi="Times New Roman" w:cs="Times New Roman"/>
@@ -5080,11 +5300,11 @@
       <w:r>
         <w:rPr>
           <w:rFonts w:ascii="Times New Roman" w:hAnsi="Times New Roman" w:cs="Times New Roman"/>
+          <w:color w:val="000000"/>
           <w:sz w:val="22"/>
           <w:szCs w:val="22"/>
         </w:rPr>
-        <w:lastRenderedPageBreak/>
-        <w:t>6 Requirements continued</w:t>
+        <w:t>Requirements continued</w:t>
       </w:r>
     </w:p>
     <w:tbl>
@@ -5840,6 +6060,7 @@
       </w:pPr>
     </w:p>
     <w:p>
+      <w:bookmarkStart w:id="507" w:name="section_7"/>
       <w:pPr>
         <w:pStyle w:val="1"/>
         <w:pageBreakBefore/>
@@ -5852,12 +6073,13 @@
       <w:r>
         <w:rPr>
           <w:rFonts w:ascii="Times New Roman" w:hAnsi="Times New Roman" w:cs="Times New Roman"/>
+          <w:color w:val="000000"/>
           <w:sz w:val="22"/>
           <w:szCs w:val="22"/>
         </w:rPr>
-        <w:lastRenderedPageBreak/>
-        <w:t>7 Architecture and system context</w:t>
-      </w:r>
+        <w:t>7 Architecture and diagrams</w:t>
+      </w:r>
+      <w:bookmarkEnd w:id="507"/>
     </w:p>
     <w:p>
       <w:pPr>
@@ -6003,6 +6225,7 @@
       <w:r>
         <w:rPr>
           <w:rFonts w:ascii="Times New Roman" w:hAnsi="Times New Roman" w:cs="Times New Roman"/>
+          <w:color w:val="000000"/>
           <w:sz w:val="22"/>
           <w:szCs w:val="22"/>
         </w:rPr>
@@ -6122,7 +6345,7 @@
     </w:p>
     <w:p>
       <w:pPr>
-        <w:pStyle w:val="1"/>
+        <w:pStyle w:val="21"/>
         <w:pageBreakBefore/>
         <w:rPr>
           <w:rFonts w:ascii="Times New Roman" w:hAnsi="Times New Roman" w:cs="Times New Roman"/>
@@ -6133,11 +6356,11 @@
       <w:r>
         <w:rPr>
           <w:rFonts w:ascii="Times New Roman" w:hAnsi="Times New Roman" w:cs="Times New Roman"/>
+          <w:color w:val="000000"/>
           <w:sz w:val="22"/>
           <w:szCs w:val="22"/>
         </w:rPr>
-        <w:lastRenderedPageBreak/>
-        <w:t>7 Use case model</w:t>
+        <w:t>Use case model</w:t>
       </w:r>
     </w:p>
     <w:p>
@@ -6243,6 +6466,7 @@
       <w:r>
         <w:rPr>
           <w:rFonts w:ascii="Times New Roman" w:hAnsi="Times New Roman" w:cs="Times New Roman"/>
+          <w:color w:val="000000"/>
           <w:sz w:val="22"/>
           <w:szCs w:val="22"/>
         </w:rPr>
@@ -6290,7 +6514,7 @@
     </w:p>
     <w:p>
       <w:pPr>
-        <w:pStyle w:val="1"/>
+        <w:pStyle w:val="21"/>
         <w:pageBreakBefore/>
         <w:rPr>
           <w:rFonts w:ascii="Times New Roman" w:hAnsi="Times New Roman" w:cs="Times New Roman"/>
@@ -6301,11 +6525,11 @@
       <w:r>
         <w:rPr>
           <w:rFonts w:ascii="Times New Roman" w:hAnsi="Times New Roman" w:cs="Times New Roman"/>
+          <w:color w:val="000000"/>
           <w:sz w:val="22"/>
           <w:szCs w:val="22"/>
         </w:rPr>
-        <w:lastRenderedPageBreak/>
-        <w:t>7 Component model</w:t>
+        <w:t>Component model</w:t>
       </w:r>
     </w:p>
     <w:p>
@@ -6424,6 +6648,7 @@
       <w:r>
         <w:rPr>
           <w:rFonts w:ascii="Times New Roman" w:hAnsi="Times New Roman" w:cs="Times New Roman"/>
+          <w:color w:val="000000"/>
           <w:sz w:val="22"/>
           <w:szCs w:val="22"/>
         </w:rPr>
@@ -6458,7 +6683,7 @@
     </w:p>
     <w:p>
       <w:pPr>
-        <w:pStyle w:val="1"/>
+        <w:pStyle w:val="21"/>
         <w:pageBreakBefore/>
         <w:rPr>
           <w:rFonts w:ascii="Times New Roman" w:hAnsi="Times New Roman" w:cs="Times New Roman"/>
@@ -6469,11 +6694,11 @@
       <w:r>
         <w:rPr>
           <w:rFonts w:ascii="Times New Roman" w:hAnsi="Times New Roman" w:cs="Times New Roman"/>
+          <w:color w:val="000000"/>
           <w:sz w:val="22"/>
           <w:szCs w:val="22"/>
         </w:rPr>
-        <w:lastRenderedPageBreak/>
-        <w:t>7 Entity relationship model</w:t>
+        <w:t>Entity relationship model</w:t>
       </w:r>
     </w:p>
     <w:p>
@@ -6595,7 +6820,7 @@
     </w:p>
     <w:p>
       <w:pPr>
-        <w:pStyle w:val="1"/>
+        <w:pStyle w:val="21"/>
         <w:pageBreakBefore/>
         <w:rPr>
           <w:rFonts w:ascii="Times New Roman" w:hAnsi="Times New Roman" w:cs="Times New Roman"/>
@@ -6606,11 +6831,11 @@
       <w:r>
         <w:rPr>
           <w:rFonts w:ascii="Times New Roman" w:hAnsi="Times New Roman" w:cs="Times New Roman"/>
+          <w:color w:val="000000"/>
           <w:sz w:val="22"/>
           <w:szCs w:val="22"/>
         </w:rPr>
-        <w:lastRenderedPageBreak/>
-        <w:t>7 Activity model</w:t>
+        <w:t>Activity model</w:t>
       </w:r>
     </w:p>
     <w:p>
@@ -6705,7 +6930,7 @@
     </w:p>
     <w:p>
       <w:pPr>
-        <w:pStyle w:val="1"/>
+        <w:pStyle w:val="21"/>
         <w:pageBreakBefore/>
         <w:rPr>
           <w:rFonts w:ascii="Times New Roman" w:hAnsi="Times New Roman" w:cs="Times New Roman"/>
@@ -6716,11 +6941,11 @@
       <w:r>
         <w:rPr>
           <w:rFonts w:ascii="Times New Roman" w:hAnsi="Times New Roman" w:cs="Times New Roman"/>
+          <w:color w:val="000000"/>
           <w:sz w:val="22"/>
           <w:szCs w:val="22"/>
         </w:rPr>
-        <w:lastRenderedPageBreak/>
-        <w:t>7 Sequence model</w:t>
+        <w:t>Sequence model</w:t>
       </w:r>
     </w:p>
     <w:p>
@@ -6814,6 +7039,7 @@
       </w:r>
     </w:p>
     <w:p>
+      <w:bookmarkStart w:id="508" w:name="section_8"/>
       <w:pPr>
         <w:pStyle w:val="1"/>
         <w:pageBreakBefore/>
@@ -6826,12 +7052,13 @@
       <w:r>
         <w:rPr>
           <w:rFonts w:ascii="Times New Roman" w:hAnsi="Times New Roman" w:cs="Times New Roman"/>
+          <w:color w:val="000000"/>
           <w:sz w:val="22"/>
           <w:szCs w:val="22"/>
         </w:rPr>
-        <w:lastRenderedPageBreak/>
         <w:t>8 UX and prototype</w:t>
       </w:r>
+      <w:bookmarkEnd w:id="508"/>
     </w:p>
     <w:p>
       <w:pPr>
@@ -7459,6 +7686,7 @@
       <w:r>
         <w:rPr>
           <w:rFonts w:ascii="Times New Roman" w:hAnsi="Times New Roman" w:cs="Times New Roman"/>
+          <w:color w:val="000000"/>
           <w:sz w:val="22"/>
           <w:szCs w:val="22"/>
         </w:rPr>
@@ -7480,6 +7708,459 @@
     </w:p>
     <w:p>
       <w:pPr>
+        <w:pStyle w:val="21"/>
+        <w:pageBreakBefore/>
+        <w:rPr>
+          <w:rFonts w:ascii="Times New Roman" w:hAnsi="Times New Roman" w:cs="Times New Roman"/>
+          <w:sz w:val="22"/>
+          <w:szCs w:val="22"/>
+        </w:rPr>
+      </w:pPr>
+      <w:r>
+        <w:rPr>
+          <w:rFonts w:ascii="Times New Roman" w:hAnsi="Times New Roman" w:cs="Times New Roman"/>
+          <w:color w:val="000000"/>
+          <w:sz w:val="22"/>
+          <w:szCs w:val="22"/>
+        </w:rPr>
+        <w:t>Demonstration scenario</w:t>
+      </w:r>
+    </w:p>
+    <w:p>
+      <w:pPr>
+        <w:rPr>
+          <w:rFonts w:ascii="Times New Roman" w:hAnsi="Times New Roman" w:cs="Times New Roman"/>
+        </w:rPr>
+      </w:pPr>
+      <w:r>
+        <w:rPr>
+          <w:rFonts w:ascii="Times New Roman" w:hAnsi="Times New Roman" w:cs="Times New Roman"/>
+        </w:rPr>
+        <w:t>Use synthetic data to avoid exposing a real customer. Start the services using README instructions and record the commit and AI provider used. Live inference requires a valid server-side key and available quota; a successful application build alone does not establish live AI availability.</w:t>
+      </w:r>
+    </w:p>
+    <w:p>
+      <w:pPr>
+        <w:pStyle w:val="21"/>
+        <w:rPr>
+          <w:rFonts w:ascii="Times New Roman" w:hAnsi="Times New Roman" w:cs="Times New Roman"/>
+          <w:sz w:val="22"/>
+          <w:szCs w:val="22"/>
+        </w:rPr>
+      </w:pPr>
+      <w:r>
+        <w:rPr>
+          <w:rFonts w:ascii="Times New Roman" w:hAnsi="Times New Roman" w:cs="Times New Roman"/>
+          <w:color w:val="000000"/>
+          <w:sz w:val="22"/>
+          <w:szCs w:val="22"/>
+        </w:rPr>
+        <w:t>Input and observable result</w:t>
+      </w:r>
+    </w:p>
+    <w:p>
+      <w:pPr>
+        <w:rPr>
+          <w:rFonts w:ascii="Times New Roman" w:hAnsi="Times New Roman" w:cs="Times New Roman"/>
+        </w:rPr>
+      </w:pPr>
+      <w:r>
+        <w:rPr>
+          <w:rFonts w:ascii="Times New Roman" w:hAnsi="Times New Roman" w:cs="Times New Roman"/>
+        </w:rPr>
+        <w:t>Enter this scenario as the business representative: “A small shop keeps sales and stock in CSV files. The manager spends an hour preparing an order. We need a web prototype within 14 days that prepares a purchase list in 10 minutes.”</w:t>
+      </w:r>
+    </w:p>
+    <w:p>
+      <w:pPr>
+        <w:rPr>
+          <w:rFonts w:ascii="Times New Roman" w:hAnsi="Times New Roman" w:cs="Times New Roman"/>
+        </w:rPr>
+      </w:pPr>
+      <w:r>
+        <w:rPr>
+          <w:rFonts w:ascii="Times New Roman" w:hAnsi="Times New Roman" w:cs="Times New Roman"/>
+        </w:rPr>
+        <w:t>Request clarification and answer only with supplied facts. For missing access, acceptance, or contact information, provide explicit synthetic details as user input. Do not describe model-invented values as facts. Review the candidate fields and their sources, edit if necessary, save, confirm, and publish.</w:t>
+      </w:r>
+    </w:p>
+    <w:p>
+      <w:pPr>
+        <w:rPr>
+          <w:rFonts w:ascii="Times New Roman" w:hAnsi="Times New Roman" w:cs="Times New Roman"/>
+        </w:rPr>
+      </w:pPr>
+      <w:r>
+        <w:rPr>
+          <w:rFonts w:ascii="Times New Roman" w:hAnsi="Times New Roman" w:cs="Times New Roman"/>
+        </w:rPr>
+        <w:t>Switch to a prepared team, open the published task, and propose a plan with a prototype link. Switch back to the owner, accept the proposal, then submit a milestone as the team and confirm it as the business. Verify that the team's award increases by exactly 10 once and remains unchanged when confirmation is repeated.</w:t>
+      </w:r>
+    </w:p>
+    <w:p>
+      <w:pPr>
+        <w:pStyle w:val="21"/>
+        <w:rPr>
+          <w:rFonts w:ascii="Times New Roman" w:hAnsi="Times New Roman" w:cs="Times New Roman"/>
+          <w:sz w:val="22"/>
+          <w:szCs w:val="22"/>
+        </w:rPr>
+      </w:pPr>
+      <w:r>
+        <w:rPr>
+          <w:rFonts w:ascii="Times New Roman" w:hAnsi="Times New Roman" w:cs="Times New Roman"/>
+          <w:color w:val="000000"/>
+          <w:sz w:val="22"/>
+          <w:szCs w:val="22"/>
+        </w:rPr>
+        <w:t>Reproducible checks during the demonstration</w:t>
+      </w:r>
+    </w:p>
+    <w:p>
+      <w:pPr>
+        <w:pStyle w:val="a0"/>
+        <w:rPr>
+          <w:rFonts w:ascii="Times New Roman" w:hAnsi="Times New Roman" w:cs="Times New Roman"/>
+        </w:rPr>
+      </w:pPr>
+      <w:r>
+        <w:rPr>
+          <w:rFonts w:ascii="Times New Roman" w:hAnsi="Times New Roman" w:cs="Times New Roman"/>
+        </w:rPr>
+        <w:t>Reload a saved draft and a published task to demonstrate persistence.</w:t>
+      </w:r>
+    </w:p>
+    <w:p>
+      <w:pPr>
+        <w:pStyle w:val="a0"/>
+        <w:rPr>
+          <w:rFonts w:ascii="Times New Roman" w:hAnsi="Times New Roman" w:cs="Times New Roman"/>
+        </w:rPr>
+      </w:pPr>
+      <w:r>
+        <w:rPr>
+          <w:rFonts w:ascii="Times New Roman" w:hAnsi="Times New Roman" w:cs="Times New Roman"/>
+        </w:rPr>
+        <w:t>Change an unconfirmed field and verify that the public snapshot remains unchanged until confirmation.</w:t>
+      </w:r>
+    </w:p>
+    <w:p>
+      <w:pPr>
+        <w:pStyle w:val="a0"/>
+        <w:rPr>
+          <w:rFonts w:ascii="Times New Roman" w:hAnsi="Times New Roman" w:cs="Times New Roman"/>
+        </w:rPr>
+      </w:pPr>
+      <w:r>
+        <w:rPr>
+          <w:rFonts w:ascii="Times New Roman" w:hAnsi="Times New Roman" w:cs="Times New Roman"/>
+        </w:rPr>
+        <w:t>Show an AI question and a reviewed suggestion; avoid promising fixed generated wording.</w:t>
+      </w:r>
+    </w:p>
+    <w:p>
+      <w:pPr>
+        <w:pStyle w:val="a0"/>
+        <w:rPr>
+          <w:rFonts w:ascii="Times New Roman" w:hAnsi="Times New Roman" w:cs="Times New Roman"/>
+        </w:rPr>
+      </w:pPr>
+      <w:r>
+        <w:rPr>
+          <w:rFonts w:ascii="Times New Roman" w:hAnsi="Times New Roman" w:cs="Times New Roman"/>
+        </w:rPr>
+        <w:t>Demonstrate editable voice transcription if microphone permission and provider access are available.</w:t>
+      </w:r>
+    </w:p>
+    <w:p>
+      <w:pPr>
+        <w:pStyle w:val="a0"/>
+        <w:rPr>
+          <w:rFonts w:ascii="Times New Roman" w:hAnsi="Times New Roman" w:cs="Times New Roman"/>
+        </w:rPr>
+      </w:pPr>
+      <w:r>
+        <w:rPr>
+          <w:rFonts w:ascii="Times New Roman" w:hAnsi="Times New Roman" w:cs="Times New Roman"/>
+        </w:rPr>
+        <w:t>Explain the manual path for quota/network failures without presenting it as live AI.</w:t>
+      </w:r>
+    </w:p>
+    <w:p>
+      <w:pPr>
+        <w:pStyle w:val="21"/>
+        <w:rPr>
+          <w:rFonts w:ascii="Times New Roman" w:hAnsi="Times New Roman" w:cs="Times New Roman"/>
+          <w:sz w:val="22"/>
+          <w:szCs w:val="22"/>
+        </w:rPr>
+      </w:pPr>
+      <w:r>
+        <w:rPr>
+          <w:rFonts w:ascii="Times New Roman" w:hAnsi="Times New Roman" w:cs="Times New Roman"/>
+          <w:color w:val="000000"/>
+          <w:sz w:val="22"/>
+          <w:szCs w:val="22"/>
+        </w:rPr>
+        <w:t>Suggested presentation sequence</w:t>
+      </w:r>
+    </w:p>
+    <w:p>
+      <w:pPr>
+        <w:rPr>
+          <w:rFonts w:ascii="Times New Roman" w:hAnsi="Times New Roman" w:cs="Times New Roman"/>
+        </w:rPr>
+      </w:pPr>
+      <w:r>
+        <w:rPr>
+          <w:rFonts w:ascii="Times New Roman" w:hAnsi="Times New Roman" w:cs="Times New Roman"/>
+        </w:rPr>
+        <w:t>A six-minute demonstration can allocate one minute to the problem and audience, two minutes to task formulation, one minute to proposal and selection, one minute to architecture and evaluation, and one minute to limitations and next steps. A separate evidence view should show a real issue, linked change, review, and test result once that chain exists.</w:t>
+      </w:r>
+    </w:p>
+    <w:p>
+      <w:pPr>
+        <w:pStyle w:val="21"/>
+        <w:pageBreakBefore/>
+      </w:pPr>
+      <w:r>
+        <w:rPr>
+          <w:color w:val="000000"/>
+        </w:rPr>
+        <w:t>Prototype and editable source links</w:t>
+      </w:r>
+    </w:p>
+    <w:p>
+      <w:pPr>
+        <w:pageBreakBefore w:val="0"/>
+      </w:pPr>
+      <w:r>
+        <w:t>The prototype is available as runnable source code. No public deployed URL is recorded in the supplied report. Follow the tagged README for installation, environment configuration and startup. The SVG files below are editable diagram sources; PNG exports are in the same folder.</w:t>
+      </w:r>
+    </w:p>
+    <w:p>
+      <w:pPr>
+        <w:pageBreakBefore w:val="0"/>
+        <w:spacing w:after="180"/>
+      </w:pPr>
+      <w:r>
+        <w:rPr>
+          <w:sz w:val="20"/>
+        </w:rPr>
+        <w:t xml:space="preserve">Prototype and startup instructions: </w:t>
+      </w:r>
+      <w:hyperlink r:id="rId23">
+        <w:r>
+          <w:rPr>
+            <w:color w:val="174D8C"/>
+            <w:u w:val="single"/>
+            <w:sz w:val="20"/>
+          </w:rPr>
+          <w:t>https://github.com/bekasyl00/Qadam_Diplom/blob/prob-period-1/README.md</w:t>
+        </w:r>
+      </w:hyperlink>
+    </w:p>
+    <w:p>
+      <w:pPr>
+        <w:pageBreakBefore w:val="0"/>
+        <w:spacing w:after="180"/>
+      </w:pPr>
+      <w:r>
+        <w:rPr>
+          <w:sz w:val="20"/>
+        </w:rPr>
+        <w:t xml:space="preserve">Frontend and backend source: </w:t>
+      </w:r>
+      <w:hyperlink r:id="rId22">
+        <w:r>
+          <w:rPr>
+            <w:color w:val="174D8C"/>
+            <w:u w:val="single"/>
+            <w:sz w:val="20"/>
+          </w:rPr>
+          <w:t>https://github.com/bekasyl00/Qadam_Diplom/tree/prob-period-1</w:t>
+        </w:r>
+      </w:hyperlink>
+    </w:p>
+    <w:p>
+      <w:pPr>
+        <w:pageBreakBefore w:val="0"/>
+        <w:spacing w:after="180"/>
+      </w:pPr>
+      <w:r>
+        <w:rPr>
+          <w:sz w:val="20"/>
+        </w:rPr>
+        <w:t xml:space="preserve">System context: </w:t>
+      </w:r>
+      <w:hyperlink r:id="rId24">
+        <w:r>
+          <w:rPr>
+            <w:color w:val="174D8C"/>
+            <w:u w:val="single"/>
+            <w:sz w:val="20"/>
+          </w:rPr>
+          <w:t>https://github.com/bekasyl00/Qadam_Diplom/blob/prob-period-1/docs/diploma/diagrams/context.svg</w:t>
+        </w:r>
+      </w:hyperlink>
+    </w:p>
+    <w:p>
+      <w:pPr>
+        <w:pageBreakBefore w:val="0"/>
+        <w:spacing w:after="180"/>
+      </w:pPr>
+      <w:r>
+        <w:rPr>
+          <w:sz w:val="20"/>
+        </w:rPr>
+        <w:t xml:space="preserve">Use case diagram: </w:t>
+      </w:r>
+      <w:hyperlink r:id="rId25">
+        <w:r>
+          <w:rPr>
+            <w:color w:val="174D8C"/>
+            <w:u w:val="single"/>
+            <w:sz w:val="20"/>
+          </w:rPr>
+          <w:t>https://github.com/bekasyl00/Qadam_Diplom/blob/prob-period-1/docs/diploma/diagrams/use-cases.svg</w:t>
+        </w:r>
+      </w:hyperlink>
+    </w:p>
+    <w:p>
+      <w:pPr>
+        <w:pageBreakBefore w:val="0"/>
+        <w:spacing w:after="180"/>
+      </w:pPr>
+      <w:r>
+        <w:rPr>
+          <w:sz w:val="20"/>
+        </w:rPr>
+        <w:t xml:space="preserve">Component diagram: </w:t>
+      </w:r>
+      <w:hyperlink r:id="rId26">
+        <w:r>
+          <w:rPr>
+            <w:color w:val="174D8C"/>
+            <w:u w:val="single"/>
+            <w:sz w:val="20"/>
+          </w:rPr>
+          <w:t>https://github.com/bekasyl00/Qadam_Diplom/blob/prob-period-1/docs/diploma/diagrams/components.svg</w:t>
+        </w:r>
+      </w:hyperlink>
+    </w:p>
+    <w:p>
+      <w:pPr>
+        <w:pageBreakBefore w:val="0"/>
+        <w:spacing w:after="180"/>
+      </w:pPr>
+      <w:r>
+        <w:rPr>
+          <w:sz w:val="20"/>
+        </w:rPr>
+        <w:t xml:space="preserve">Entity relationship diagram: </w:t>
+      </w:r>
+      <w:hyperlink r:id="rId27">
+        <w:r>
+          <w:rPr>
+            <w:color w:val="174D8C"/>
+            <w:u w:val="single"/>
+            <w:sz w:val="20"/>
+          </w:rPr>
+          <w:t>https://github.com/bekasyl00/Qadam_Diplom/blob/prob-period-1/docs/diploma/diagrams/erd.svg</w:t>
+        </w:r>
+      </w:hyperlink>
+    </w:p>
+    <w:p>
+      <w:pPr>
+        <w:pageBreakBefore w:val="0"/>
+        <w:spacing w:after="180"/>
+      </w:pPr>
+      <w:r>
+        <w:rPr>
+          <w:sz w:val="20"/>
+        </w:rPr>
+        <w:t xml:space="preserve">UML activity diagram: </w:t>
+      </w:r>
+      <w:hyperlink r:id="rId28">
+        <w:r>
+          <w:rPr>
+            <w:color w:val="174D8C"/>
+            <w:u w:val="single"/>
+            <w:sz w:val="20"/>
+          </w:rPr>
+          <w:t>https://github.com/bekasyl00/Qadam_Diplom/blob/prob-period-1/docs/diploma/diagrams/activity.svg</w:t>
+        </w:r>
+      </w:hyperlink>
+    </w:p>
+    <w:p>
+      <w:pPr>
+        <w:pageBreakBefore w:val="0"/>
+        <w:spacing w:after="180"/>
+      </w:pPr>
+      <w:r>
+        <w:rPr>
+          <w:sz w:val="20"/>
+        </w:rPr>
+        <w:t xml:space="preserve">UML sequence diagram: </w:t>
+      </w:r>
+      <w:hyperlink r:id="rId29">
+        <w:r>
+          <w:rPr>
+            <w:color w:val="174D8C"/>
+            <w:u w:val="single"/>
+            <w:sz w:val="20"/>
+          </w:rPr>
+          <w:t>https://github.com/bekasyl00/Qadam_Diplom/blob/prob-period-1/docs/diploma/diagrams/sequence.svg</w:t>
+        </w:r>
+      </w:hyperlink>
+    </w:p>
+    <w:p>
+      <w:pPr>
+        <w:pageBreakBefore w:val="0"/>
+        <w:spacing w:after="180"/>
+      </w:pPr>
+      <w:r>
+        <w:rPr>
+          <w:sz w:val="20"/>
+        </w:rPr>
+        <w:t xml:space="preserve">UX workflow: </w:t>
+      </w:r>
+      <w:hyperlink r:id="rId30">
+        <w:r>
+          <w:rPr>
+            <w:color w:val="174D8C"/>
+            <w:u w:val="single"/>
+            <w:sz w:val="20"/>
+          </w:rPr>
+          <w:t>https://github.com/bekasyl00/Qadam_Diplom/blob/prob-period-1/docs/diploma/diagrams/workflow.svg</w:t>
+        </w:r>
+      </w:hyperlink>
+    </w:p>
+    <w:p>
+      <w:pPr>
+        <w:pageBreakBefore w:val="0"/>
+        <w:spacing w:after="180"/>
+      </w:pPr>
+      <w:r>
+        <w:rPr>
+          <w:sz w:val="20"/>
+        </w:rPr>
+        <w:t xml:space="preserve">Supporting materials and diagram generator: </w:t>
+      </w:r>
+      <w:hyperlink r:id="rId31">
+        <w:r>
+          <w:rPr>
+            <w:color w:val="174D8C"/>
+            <w:u w:val="single"/>
+            <w:sz w:val="20"/>
+          </w:rPr>
+          <w:t>https://github.com/bekasyl00/Qadam_Diplom/tree/prob-period-1/docs/diploma</w:t>
+        </w:r>
+      </w:hyperlink>
+    </w:p>
+    <w:p>
+      <w:bookmarkStart w:id="509" w:name="section_9"/>
+      <w:pPr>
         <w:pStyle w:val="1"/>
         <w:pageBreakBefore/>
         <w:rPr>
@@ -7491,221 +8172,13 @@
       <w:r>
         <w:rPr>
           <w:rFonts w:ascii="Times New Roman" w:hAnsi="Times New Roman" w:cs="Times New Roman"/>
+          <w:color w:val="000000"/>
           <w:sz w:val="22"/>
           <w:szCs w:val="22"/>
         </w:rPr>
-        <w:lastRenderedPageBreak/>
-        <w:t>8 Demonstration scenario</w:t>
-      </w:r>
-    </w:p>
-    <w:p>
-      <w:pPr>
-        <w:rPr>
-          <w:rFonts w:ascii="Times New Roman" w:hAnsi="Times New Roman" w:cs="Times New Roman"/>
-        </w:rPr>
-      </w:pPr>
-      <w:r>
-        <w:rPr>
-          <w:rFonts w:ascii="Times New Roman" w:hAnsi="Times New Roman" w:cs="Times New Roman"/>
-        </w:rPr>
-        <w:t>Use synthetic data to avoid exposing a real customer. Start the services using README instructions and record the commit and AI provider used. Live inference requires a valid server-side key and available quota; a successful application build alone does not establish live AI availability.</w:t>
-      </w:r>
-    </w:p>
-    <w:p>
-      <w:pPr>
-        <w:pStyle w:val="21"/>
-        <w:rPr>
-          <w:rFonts w:ascii="Times New Roman" w:hAnsi="Times New Roman" w:cs="Times New Roman"/>
-          <w:sz w:val="22"/>
-          <w:szCs w:val="22"/>
-        </w:rPr>
-      </w:pPr>
-      <w:r>
-        <w:rPr>
-          <w:rFonts w:ascii="Times New Roman" w:hAnsi="Times New Roman" w:cs="Times New Roman"/>
-          <w:sz w:val="22"/>
-          <w:szCs w:val="22"/>
-        </w:rPr>
-        <w:t>Input and observable result</w:t>
-      </w:r>
-    </w:p>
-    <w:p>
-      <w:pPr>
-        <w:rPr>
-          <w:rFonts w:ascii="Times New Roman" w:hAnsi="Times New Roman" w:cs="Times New Roman"/>
-        </w:rPr>
-      </w:pPr>
-      <w:r>
-        <w:rPr>
-          <w:rFonts w:ascii="Times New Roman" w:hAnsi="Times New Roman" w:cs="Times New Roman"/>
-        </w:rPr>
-        <w:t>Enter this scenario as the business representative: “A small shop keeps sales and stock in CSV files. The manager spends an hour preparing an order. We need a web prototype within 14 days that prepares a purchase list in 10 minutes.”</w:t>
-      </w:r>
-    </w:p>
-    <w:p>
-      <w:pPr>
-        <w:rPr>
-          <w:rFonts w:ascii="Times New Roman" w:hAnsi="Times New Roman" w:cs="Times New Roman"/>
-        </w:rPr>
-      </w:pPr>
-      <w:r>
-        <w:rPr>
-          <w:rFonts w:ascii="Times New Roman" w:hAnsi="Times New Roman" w:cs="Times New Roman"/>
-        </w:rPr>
-        <w:t>Request clarification and answer only with supplied facts. For missing access, acceptance, or contact information, provide explicit synthetic details as user input. Do not describe model-invented values as facts. Review the candidate fields and their sources, edit if necessary, save, confirm, and publish.</w:t>
-      </w:r>
-    </w:p>
-    <w:p>
-      <w:pPr>
-        <w:rPr>
-          <w:rFonts w:ascii="Times New Roman" w:hAnsi="Times New Roman" w:cs="Times New Roman"/>
-        </w:rPr>
-      </w:pPr>
-      <w:r>
-        <w:rPr>
-          <w:rFonts w:ascii="Times New Roman" w:hAnsi="Times New Roman" w:cs="Times New Roman"/>
-        </w:rPr>
-        <w:t>Switch to a prepared team, open the published task, and propose a plan with a prototype link. Switch back to the owner, accept the proposal, then submit a milestone as the team and confirm it as the business. Verify that the team's award increases by exactly 10 once and remains unchanged when confirmation is repeated.</w:t>
-      </w:r>
-    </w:p>
-    <w:p>
-      <w:pPr>
-        <w:pStyle w:val="21"/>
-        <w:rPr>
-          <w:rFonts w:ascii="Times New Roman" w:hAnsi="Times New Roman" w:cs="Times New Roman"/>
-          <w:sz w:val="22"/>
-          <w:szCs w:val="22"/>
-        </w:rPr>
-      </w:pPr>
-      <w:r>
-        <w:rPr>
-          <w:rFonts w:ascii="Times New Roman" w:hAnsi="Times New Roman" w:cs="Times New Roman"/>
-          <w:sz w:val="22"/>
-          <w:szCs w:val="22"/>
-        </w:rPr>
-        <w:t>Reproducible checks during the demonstration</w:t>
-      </w:r>
-    </w:p>
-    <w:p>
-      <w:pPr>
-        <w:pStyle w:val="a0"/>
-        <w:rPr>
-          <w:rFonts w:ascii="Times New Roman" w:hAnsi="Times New Roman" w:cs="Times New Roman"/>
-        </w:rPr>
-      </w:pPr>
-      <w:r>
-        <w:rPr>
-          <w:rFonts w:ascii="Times New Roman" w:hAnsi="Times New Roman" w:cs="Times New Roman"/>
-        </w:rPr>
-        <w:t>Reload a saved draft and a published task to demonstrate persistence.</w:t>
-      </w:r>
-    </w:p>
-    <w:p>
-      <w:pPr>
-        <w:pStyle w:val="a0"/>
-        <w:rPr>
-          <w:rFonts w:ascii="Times New Roman" w:hAnsi="Times New Roman" w:cs="Times New Roman"/>
-        </w:rPr>
-      </w:pPr>
-      <w:r>
-        <w:rPr>
-          <w:rFonts w:ascii="Times New Roman" w:hAnsi="Times New Roman" w:cs="Times New Roman"/>
-        </w:rPr>
-        <w:t>Change an unconfirmed field and verify that the public snapshot remains unchanged until confirmation.</w:t>
-      </w:r>
-    </w:p>
-    <w:p>
-      <w:pPr>
-        <w:pStyle w:val="a0"/>
-        <w:rPr>
-          <w:rFonts w:ascii="Times New Roman" w:hAnsi="Times New Roman" w:cs="Times New Roman"/>
-        </w:rPr>
-      </w:pPr>
-      <w:r>
-        <w:rPr>
-          <w:rFonts w:ascii="Times New Roman" w:hAnsi="Times New Roman" w:cs="Times New Roman"/>
-        </w:rPr>
-        <w:t>Show an AI question and a reviewed suggestion; avoid promising fixed generated wording.</w:t>
-      </w:r>
-    </w:p>
-    <w:p>
-      <w:pPr>
-        <w:pStyle w:val="a0"/>
-        <w:rPr>
-          <w:rFonts w:ascii="Times New Roman" w:hAnsi="Times New Roman" w:cs="Times New Roman"/>
-        </w:rPr>
-      </w:pPr>
-      <w:r>
-        <w:rPr>
-          <w:rFonts w:ascii="Times New Roman" w:hAnsi="Times New Roman" w:cs="Times New Roman"/>
-        </w:rPr>
-        <w:t>Demonstrate editable voice transcription if microphone permission and provider access are available.</w:t>
-      </w:r>
-    </w:p>
-    <w:p>
-      <w:pPr>
-        <w:pStyle w:val="a0"/>
-        <w:rPr>
-          <w:rFonts w:ascii="Times New Roman" w:hAnsi="Times New Roman" w:cs="Times New Roman"/>
-        </w:rPr>
-      </w:pPr>
-      <w:r>
-        <w:rPr>
-          <w:rFonts w:ascii="Times New Roman" w:hAnsi="Times New Roman" w:cs="Times New Roman"/>
-        </w:rPr>
-        <w:t>Explain the manual path for quota/network failures without presenting it as live AI.</w:t>
-      </w:r>
-    </w:p>
-    <w:p>
-      <w:pPr>
-        <w:pStyle w:val="21"/>
-        <w:rPr>
-          <w:rFonts w:ascii="Times New Roman" w:hAnsi="Times New Roman" w:cs="Times New Roman"/>
-          <w:sz w:val="22"/>
-          <w:szCs w:val="22"/>
-        </w:rPr>
-      </w:pPr>
-      <w:r>
-        <w:rPr>
-          <w:rFonts w:ascii="Times New Roman" w:hAnsi="Times New Roman" w:cs="Times New Roman"/>
-          <w:sz w:val="22"/>
-          <w:szCs w:val="22"/>
-        </w:rPr>
-        <w:t>Suggested presentation sequence</w:t>
-      </w:r>
-    </w:p>
-    <w:p>
-      <w:pPr>
-        <w:rPr>
-          <w:rFonts w:ascii="Times New Roman" w:hAnsi="Times New Roman" w:cs="Times New Roman"/>
-        </w:rPr>
-      </w:pPr>
-      <w:r>
-        <w:rPr>
-          <w:rFonts w:ascii="Times New Roman" w:hAnsi="Times New Roman" w:cs="Times New Roman"/>
-        </w:rPr>
-        <w:t>A six-minute demonstration can allocate one minute to the problem and audience, two minutes to task formulation, one minute to proposal and selection, one minute to architecture and evaluation, and one minute to limitations and next steps. A separate evidence view should show a real issue, linked change, review, and test result once that chain exists.</w:t>
-      </w:r>
-    </w:p>
-    <w:p>
-      <w:pPr>
-        <w:pStyle w:val="1"/>
-        <w:pageBreakBefore/>
-        <w:rPr>
-          <w:rFonts w:ascii="Times New Roman" w:hAnsi="Times New Roman" w:cs="Times New Roman"/>
-          <w:sz w:val="22"/>
-          <w:szCs w:val="22"/>
-        </w:rPr>
-      </w:pPr>
-      <w:r>
-        <w:rPr>
-          <w:rFonts w:ascii="Times New Roman" w:hAnsi="Times New Roman" w:cs="Times New Roman"/>
-          <w:sz w:val="22"/>
-          <w:szCs w:val="22"/>
-        </w:rPr>
-        <w:lastRenderedPageBreak/>
-        <w:t>9 Verification plan</w:t>
-      </w:r>
+        <w:t>9 Verification and evaluation plan</w:t>
+      </w:r>
+      <w:bookmarkEnd w:id="509"/>
     </w:p>
     <w:p>
       <w:pPr>
@@ -8028,6 +8501,7 @@
       <w:r>
         <w:rPr>
           <w:rFonts w:ascii="Times New Roman" w:hAnsi="Times New Roman" w:cs="Times New Roman"/>
+          <w:color w:val="000000"/>
           <w:sz w:val="22"/>
           <w:szCs w:val="22"/>
         </w:rPr>
@@ -8086,6 +8560,7 @@
       <w:r>
         <w:rPr>
           <w:rFonts w:ascii="Times New Roman" w:hAnsi="Times New Roman" w:cs="Times New Roman"/>
+          <w:color w:val="000000"/>
           <w:sz w:val="22"/>
           <w:szCs w:val="22"/>
         </w:rPr>
@@ -8121,7 +8596,7 @@
     </w:p>
     <w:p>
       <w:pPr>
-        <w:pStyle w:val="1"/>
+        <w:pStyle w:val="21"/>
         <w:pageBreakBefore/>
         <w:rPr>
           <w:rFonts w:ascii="Times New Roman" w:hAnsi="Times New Roman" w:cs="Times New Roman"/>
@@ -8132,11 +8607,11 @@
       <w:r>
         <w:rPr>
           <w:rFonts w:ascii="Times New Roman" w:hAnsi="Times New Roman" w:cs="Times New Roman"/>
+          <w:color w:val="000000"/>
           <w:sz w:val="22"/>
           <w:szCs w:val="22"/>
         </w:rPr>
-        <w:lastRenderedPageBreak/>
-        <w:t>9 Evaluation design</w:t>
+        <w:t>Evaluation design</w:t>
       </w:r>
     </w:p>
     <w:p>
@@ -8151,6 +8626,7 @@
       <w:r>
         <w:rPr>
           <w:rFonts w:ascii="Times New Roman" w:hAnsi="Times New Roman" w:cs="Times New Roman"/>
+          <w:color w:val="000000"/>
           <w:sz w:val="22"/>
           <w:szCs w:val="22"/>
         </w:rPr>
@@ -8195,6 +8671,7 @@
       <w:r>
         <w:rPr>
           <w:rFonts w:ascii="Times New Roman" w:hAnsi="Times New Roman" w:cs="Times New Roman"/>
+          <w:color w:val="000000"/>
           <w:sz w:val="22"/>
           <w:szCs w:val="22"/>
         </w:rPr>
@@ -8252,6 +8729,7 @@
       <w:r>
         <w:rPr>
           <w:rFonts w:ascii="Times New Roman" w:hAnsi="Times New Roman" w:cs="Times New Roman"/>
+          <w:color w:val="000000"/>
           <w:sz w:val="22"/>
           <w:szCs w:val="22"/>
         </w:rPr>
@@ -8286,7 +8764,7 @@
     </w:p>
     <w:p>
       <w:pPr>
-        <w:pStyle w:val="1"/>
+        <w:pStyle w:val="21"/>
         <w:pageBreakBefore/>
         <w:rPr>
           <w:rFonts w:ascii="Times New Roman" w:hAnsi="Times New Roman" w:cs="Times New Roman"/>
@@ -8297,11 +8775,11 @@
       <w:r>
         <w:rPr>
           <w:rFonts w:ascii="Times New Roman" w:hAnsi="Times New Roman" w:cs="Times New Roman"/>
+          <w:color w:val="000000"/>
           <w:sz w:val="22"/>
           <w:szCs w:val="22"/>
         </w:rPr>
-        <w:lastRenderedPageBreak/>
-        <w:t>9 Measurement and analysis plan</w:t>
+        <w:t>Measurement and analysis plan</w:t>
       </w:r>
     </w:p>
     <w:tbl>
@@ -8655,6 +9133,7 @@
       <w:r>
         <w:rPr>
           <w:rFonts w:ascii="Times New Roman" w:hAnsi="Times New Roman" w:cs="Times New Roman"/>
+          <w:color w:val="000000"/>
           <w:sz w:val="22"/>
           <w:szCs w:val="22"/>
         </w:rPr>
@@ -8699,6 +9178,7 @@
       <w:r>
         <w:rPr>
           <w:rFonts w:ascii="Times New Roman" w:hAnsi="Times New Roman" w:cs="Times New Roman"/>
+          <w:color w:val="000000"/>
           <w:sz w:val="22"/>
           <w:szCs w:val="22"/>
         </w:rPr>
@@ -8732,6 +9212,7 @@
       </w:r>
     </w:p>
     <w:p>
+      <w:bookmarkStart w:id="510" w:name="section_10"/>
       <w:pPr>
         <w:pStyle w:val="1"/>
         <w:pageBreakBefore/>
@@ -8744,12 +9225,13 @@
       <w:r>
         <w:rPr>
           <w:rFonts w:ascii="Times New Roman" w:hAnsi="Times New Roman" w:cs="Times New Roman"/>
+          <w:color w:val="000000"/>
           <w:sz w:val="22"/>
           <w:szCs w:val="22"/>
         </w:rPr>
-        <w:lastRenderedPageBreak/>
-        <w:t>10 Individual contributions and responsibilities</w:t>
-      </w:r>
+        <w:t>10 Project management and risks</w:t>
+      </w:r>
+      <w:bookmarkEnd w:id="510"/>
     </w:p>
     <w:p>
       <w:pPr>
@@ -8763,6 +9245,7 @@
       <w:r>
         <w:rPr>
           <w:rFonts w:ascii="Times New Roman" w:hAnsi="Times New Roman" w:cs="Times New Roman"/>
+          <w:color w:val="000000"/>
           <w:sz w:val="22"/>
           <w:szCs w:val="22"/>
         </w:rPr>
@@ -9176,6 +9659,7 @@
       <w:r>
         <w:rPr>
           <w:rFonts w:ascii="Times New Roman" w:hAnsi="Times New Roman" w:cs="Times New Roman"/>
+          <w:color w:val="000000"/>
           <w:sz w:val="22"/>
           <w:szCs w:val="22"/>
         </w:rPr>
@@ -9260,7 +9744,7 @@
     </w:p>
     <w:p>
       <w:pPr>
-        <w:pStyle w:val="1"/>
+        <w:pStyle w:val="21"/>
         <w:pageBreakBefore/>
         <w:rPr>
           <w:rFonts w:ascii="Times New Roman" w:hAnsi="Times New Roman" w:cs="Times New Roman"/>
@@ -9271,11 +9755,11 @@
       <w:r>
         <w:rPr>
           <w:rFonts w:ascii="Times New Roman" w:hAnsi="Times New Roman" w:cs="Times New Roman"/>
+          <w:color w:val="000000"/>
           <w:sz w:val="22"/>
           <w:szCs w:val="22"/>
         </w:rPr>
-        <w:lastRenderedPageBreak/>
-        <w:t>10 Schedule and issue tracking</w:t>
+        <w:t>Schedule and issue tracking</w:t>
       </w:r>
     </w:p>
     <w:tbl>
@@ -9657,6 +10141,7 @@
       <w:r>
         <w:rPr>
           <w:rFonts w:ascii="Times New Roman" w:hAnsi="Times New Roman" w:cs="Times New Roman"/>
+          <w:color w:val="000000"/>
           <w:sz w:val="22"/>
           <w:szCs w:val="22"/>
         </w:rPr>
@@ -9666,6 +10151,7 @@
       <w:r>
         <w:rPr>
           <w:rFonts w:ascii="Times New Roman" w:hAnsi="Times New Roman" w:cs="Times New Roman"/>
+          <w:color w:val="000000"/>
           <w:sz w:val="22"/>
           <w:szCs w:val="22"/>
         </w:rPr>
@@ -9679,156 +10165,144 @@
         </w:rPr>
       </w:pPr>
       <w:r>
-        <w:rPr>
-          <w:rFonts w:ascii="Times New Roman" w:hAnsi="Times New Roman" w:cs="Times New Roman"/>
-        </w:rPr>
-        <w:t xml:space="preserve">The </w:t>
-      </w:r>
-      <w:proofErr w:type="spellStart"/>
-      <w:r>
-        <w:rPr>
-          <w:rFonts w:ascii="Times New Roman" w:hAnsi="Times New Roman" w:cs="Times New Roman"/>
-        </w:rPr>
-        <w:t>Qadam</w:t>
-      </w:r>
-      <w:proofErr w:type="spellEnd"/>
-      <w:r>
-        <w:rPr>
-          <w:rFonts w:ascii="Times New Roman" w:hAnsi="Times New Roman" w:cs="Times New Roman"/>
-        </w:rPr>
-        <w:t xml:space="preserve"> project and Kanban board were created on 19 October 2026. Project: </w:t>
-      </w:r>
-      <w:hyperlink r:id="rId17" w:history="1">
+        <w:t xml:space="preserve">The Qadam project and Kanban board were created on 19 October 2026. Project: </w:t>
+      </w:r>
+      <w:hyperlink r:id="rId17">
         <w:r>
           <w:rPr>
-            <w:rStyle w:val="aff8"/>
-            <w:rFonts w:ascii="Times New Roman" w:hAnsi="Times New Roman" w:cs="Times New Roman"/>
+            <w:color w:val="174D8C"/>
+            <w:u w:val="single"/>
           </w:rPr>
-          <w:t>https://bekasyl00.youtrack.clo</w:t>
+          <w:t>https://bekasyl00.youtrack.cloud/projects/QADAM</w:t>
         </w:r>
+      </w:hyperlink>
+      <w:r>
+        <w:t xml:space="preserve">. Board: </w:t>
+      </w:r>
+      <w:hyperlink r:id="rId32">
         <w:r>
           <w:rPr>
-            <w:rStyle w:val="aff8"/>
-            <w:rFonts w:ascii="Times New Roman" w:hAnsi="Times New Roman" w:cs="Times New Roman"/>
+            <w:color w:val="174D8C"/>
+            <w:u w:val="single"/>
           </w:rPr>
-          <w:t>u</w:t>
+          <w:t>https://bekasyl00.youtrack.cloud/agiles/204-1/current</w:t>
         </w:r>
+      </w:hyperlink>
+      <w:r>
+        <w:t>. Tasks record accountable students, reviewers, target dates, acceptance criteria and evidence. Stages are Backlog, Development, Review, Test, Staging and Done. Prepared material stays in Review until checked; Done requires evidence.</w:t>
+      </w:r>
+    </w:p>
+    <w:p>
+      <w:pPr>
+        <w:rPr>
+          <w:rFonts w:ascii="Times New Roman" w:hAnsi="Times New Roman" w:cs="Times New Roman"/>
+        </w:rPr>
+      </w:pPr>
+      <w:r>
+        <w:rPr>
+          <w:rFonts w:ascii="Times New Roman" w:hAnsi="Times New Roman" w:cs="Times New Roman"/>
+        </w:rPr>
+        <w:t>All three team members now have assigned YouTrack accounts: admin (Bekasyl Zhaksylyk), myrzahanmereke (Mereke Myrzakhan), and amantai.zere (Amantai Zere). On 21 October, the board contained 13 tasks: six in Backlog, one in Development, five in Review and one Done. Target dates in descriptions are team planning dates. The completed QADAM-13 records publication of the supplied report and submission tag; QADAM-12 covers the broader submission process and remains open.</w:t>
+      </w:r>
+    </w:p>
+    <w:p>
+      <w:pPr>
+        <w:rPr>
+          <w:rFonts w:ascii="Times New Roman" w:hAnsi="Times New Roman" w:cs="Times New Roman"/>
+        </w:rPr>
+      </w:pPr>
+      <w:r>
+        <w:rPr>
+          <w:rFonts w:ascii="Times New Roman" w:hAnsi="Times New Roman" w:cs="Times New Roman"/>
+        </w:rPr>
+        <w:t>Use separate task branches with issue IDs, link commits or pull requests to their tasks, and obtain another team member's review before merging. Preserve original authorship and commit history. For this submission, the form requires the tag prob-period-1; it takes precedence over the example pre-defense-1 in the general assignment. Finalize the tag against the exact submitted materials before submission, then keep it fixed.</w:t>
+      </w:r>
+    </w:p>
+    <w:p>
+      <w:pPr>
+        <w:pStyle w:val="21"/>
+        <w:pageBreakBefore/>
+        <w:rPr>
+          <w:rFonts w:ascii="Times New Roman" w:hAnsi="Times New Roman" w:cs="Times New Roman"/>
+          <w:sz w:val="22"/>
+          <w:szCs w:val="22"/>
+        </w:rPr>
+      </w:pPr>
+      <w:r>
+        <w:rPr>
+          <w:rFonts w:ascii="Times New Roman" w:hAnsi="Times New Roman" w:cs="Times New Roman"/>
+          <w:color w:val="000000"/>
+          <w:sz w:val="22"/>
+          <w:szCs w:val="22"/>
+        </w:rPr>
+        <w:t>Repository evidence and risks</w:t>
+      </w:r>
+    </w:p>
+    <w:p>
+      <w:pPr>
+        <w:pStyle w:val="21"/>
+        <w:rPr>
+          <w:rFonts w:ascii="Times New Roman" w:hAnsi="Times New Roman" w:cs="Times New Roman"/>
+          <w:sz w:val="22"/>
+          <w:szCs w:val="22"/>
+        </w:rPr>
+      </w:pPr>
+      <w:r>
+        <w:rPr>
+          <w:rFonts w:ascii="Times New Roman" w:hAnsi="Times New Roman" w:cs="Times New Roman"/>
+          <w:color w:val="000000"/>
+          <w:sz w:val="22"/>
+          <w:szCs w:val="22"/>
+        </w:rPr>
+        <w:t>Current evidence and workflow gaps</w:t>
+      </w:r>
+    </w:p>
+    <w:p>
+      <w:pPr>
+        <w:rPr>
+          <w:rFonts w:ascii="Times New Roman" w:hAnsi="Times New Roman" w:cs="Times New Roman"/>
+        </w:rPr>
+      </w:pPr>
+      <w:r>
+        <w:rPr>
+          <w:rFonts w:ascii="Times New Roman" w:hAnsi="Times New Roman" w:cs="Times New Roman"/>
+        </w:rPr>
+        <w:t>The diploma repository contains contributions associated with all three team members, including frontend development, backend AI integration, and project documentation. The development history records authorship, but each member must also explain their own work and show how it was reviewed.</w:t>
+      </w:r>
+    </w:p>
+    <w:p>
+      <w:pPr>
+        <w:rPr>
+          <w:rFonts w:ascii="Times New Roman" w:hAnsi="Times New Roman" w:cs="Times New Roman"/>
+        </w:rPr>
+      </w:pPr>
+      <w:r>
+        <w:t xml:space="preserve">The shared branch is main. Pull request #3, containing the earlier documentation revision, was merged on 21 October 2026: </w:t>
+      </w:r>
+      <w:hyperlink r:id="rId33">
         <w:r>
           <w:rPr>
-            <w:rStyle w:val="aff8"/>
-            <w:rFonts w:ascii="Times New Roman" w:hAnsi="Times New Roman" w:cs="Times New Roman"/>
+            <w:color w:val="174D8C"/>
+            <w:u w:val="single"/>
           </w:rPr>
-          <w:t>d/projects/QADAM</w:t>
+          <w:t>https://github.com/bekasyl00/Qadam_Diplom/pull/3</w:t>
         </w:r>
       </w:hyperlink>
       <w:r>
-        <w:rPr>
-          <w:rFonts w:ascii="Times New Roman" w:hAnsi="Times New Roman" w:cs="Times New Roman"/>
-        </w:rPr>
-        <w:t>. The task register records responsible students, reviewers, target dates, acceptance criteria and evidence. Its live stages are Backlog, Development, Review, Test, Staging and Done. Prepared material stays in Review until checked; Done requires evidence.</w:t>
-      </w:r>
-    </w:p>
-    <w:p>
-      <w:pPr>
-        <w:rPr>
-          <w:rFonts w:ascii="Times New Roman" w:hAnsi="Times New Roman" w:cs="Times New Roman"/>
-        </w:rPr>
-      </w:pPr>
-      <w:r>
-        <w:rPr>
-          <w:rFonts w:ascii="Times New Roman" w:hAnsi="Times New Roman" w:cs="Times New Roman"/>
-        </w:rPr>
-        <w:t>The administrator is currently the only project member. Named ownership and target dates are recorded in descriptions; mapping to each student's own account remains pending. YOUTRACK_TASKS.md contains the issue links and BACKLOG.csv is a dated planning snapshot. No past work is backdated as though the board already existed.</w:t>
-      </w:r>
-    </w:p>
-    <w:p>
-      <w:pPr>
-        <w:rPr>
-          <w:rFonts w:ascii="Times New Roman" w:hAnsi="Times New Roman" w:cs="Times New Roman"/>
-        </w:rPr>
-      </w:pPr>
-      <w:r>
-        <w:rPr>
-          <w:rFonts w:ascii="Times New Roman" w:hAnsi="Times New Roman" w:cs="Times New Roman"/>
-        </w:rPr>
-        <w:t>Use a separate task branch with its issue ID, include that ID in the commit or pull request, and link the change back to the task. Another team member must review before merging into main. Preserve history and original authorship. Create the pre-defense-1 tag only on the reviewed submission version; do not move a submitted tag. Technical tracking IDs remain in supporting records rather than academic requirement labels.</w:t>
-      </w:r>
-    </w:p>
-    <w:p>
-      <w:pPr>
-        <w:pStyle w:val="1"/>
-        <w:pageBreakBefore/>
-        <w:rPr>
-          <w:rFonts w:ascii="Times New Roman" w:hAnsi="Times New Roman" w:cs="Times New Roman"/>
-          <w:sz w:val="22"/>
-          <w:szCs w:val="22"/>
-        </w:rPr>
-      </w:pPr>
-      <w:r>
-        <w:rPr>
-          <w:rFonts w:ascii="Times New Roman" w:hAnsi="Times New Roman" w:cs="Times New Roman"/>
-          <w:sz w:val="22"/>
-          <w:szCs w:val="22"/>
-        </w:rPr>
-        <w:lastRenderedPageBreak/>
-        <w:t>10 Repository evidence and risks</w:t>
-      </w:r>
-    </w:p>
-    <w:p>
-      <w:pPr>
-        <w:pStyle w:val="21"/>
-        <w:rPr>
-          <w:rFonts w:ascii="Times New Roman" w:hAnsi="Times New Roman" w:cs="Times New Roman"/>
-          <w:sz w:val="22"/>
-          <w:szCs w:val="22"/>
-        </w:rPr>
-      </w:pPr>
-      <w:r>
-        <w:rPr>
-          <w:rFonts w:ascii="Times New Roman" w:hAnsi="Times New Roman" w:cs="Times New Roman"/>
-          <w:sz w:val="22"/>
-          <w:szCs w:val="22"/>
-        </w:rPr>
-        <w:t>Current evidence and workflow gaps</w:t>
-      </w:r>
-    </w:p>
-    <w:p>
-      <w:pPr>
-        <w:rPr>
-          <w:rFonts w:ascii="Times New Roman" w:hAnsi="Times New Roman" w:cs="Times New Roman"/>
-        </w:rPr>
-      </w:pPr>
-      <w:r>
-        <w:rPr>
-          <w:rFonts w:ascii="Times New Roman" w:hAnsi="Times New Roman" w:cs="Times New Roman"/>
-        </w:rPr>
-        <w:t>The diploma repository contains contributions associated with all three team members, including frontend development, backend AI integration, and project documentation. The development history records authorship, but each member must also explain their own work and show how it was reviewed.</w:t>
-      </w:r>
-    </w:p>
-    <w:p>
-      <w:pPr>
-        <w:rPr>
-          <w:rFonts w:ascii="Times New Roman" w:hAnsi="Times New Roman" w:cs="Times New Roman"/>
-        </w:rPr>
-      </w:pPr>
-      <w:r>
-        <w:rPr>
-          <w:rFonts w:ascii="Times New Roman" w:hAnsi="Times New Roman" w:cs="Times New Roman"/>
-        </w:rPr>
-        <w:t>The shared branch is now main, verified against the remote repository on 19 October. The history contains separate frontend, backend, and documentation contributions. This is evidence of submitted changes, not proof that every change received an independent review. Record future reviews explicitly and show one traceable issue, change, review, and test chain at the checkpoint.</w:t>
-      </w:r>
-    </w:p>
-    <w:p>
-      <w:pPr>
-        <w:rPr>
-          <w:rFonts w:ascii="Times New Roman" w:hAnsi="Times New Roman" w:cs="Times New Roman"/>
-        </w:rPr>
-      </w:pPr>
-      <w:r>
-        <w:rPr>
-          <w:rFonts w:ascii="Times New Roman" w:hAnsi="Times New Roman" w:cs="Times New Roman"/>
-        </w:rPr>
-        <w:t>Keep original authorship and commit history intact. Create a checkpoint tag only after the submission is reviewed, and verify supervisor and committee access to the required materials. A document revision does not establish fresh live AI or database test results.</w:t>
+        <w:t>. The history contains frontend, backend and documentation contributions. A merged request alone does not prove an independent peer review. Review records and actual validation results must be shown separately.</w:t>
+      </w:r>
+    </w:p>
+    <w:p>
+      <w:pPr>
+        <w:rPr>
+          <w:rFonts w:ascii="Times New Roman" w:hAnsi="Times New Roman" w:cs="Times New Roman"/>
+        </w:rPr>
+      </w:pPr>
+      <w:r>
+        <w:rPr>
+          <w:rFonts w:ascii="Times New Roman" w:hAnsi="Times New Roman" w:cs="Times New Roman"/>
+        </w:rPr>
+        <w:t>Keep original authorship and commit history intact. The submitted Word and PDF files are included in the version tagged prob-period-1. Public GitHub links provide repository access; the supervisor and committee still need suitable YouTrack access. This document update does not establish fresh live AI or database test results.</w:t>
       </w:r>
     </w:p>
     <w:tbl>
@@ -10393,6 +10867,839 @@
     </w:p>
     <w:p>
       <w:pPr>
+        <w:pStyle w:val="21"/>
+        <w:pageBreakBefore/>
+        <w:rPr>
+          <w:rFonts w:ascii="Times New Roman" w:hAnsi="Times New Roman" w:cs="Times New Roman"/>
+          <w:sz w:val="22"/>
+          <w:szCs w:val="22"/>
+        </w:rPr>
+      </w:pPr>
+      <w:r>
+        <w:rPr>
+          <w:rFonts w:ascii="Times New Roman" w:hAnsi="Times New Roman" w:cs="Times New Roman"/>
+          <w:color w:val="000000"/>
+          <w:sz w:val="22"/>
+          <w:szCs w:val="22"/>
+        </w:rPr>
+        <w:t>Submission readiness</w:t>
+      </w:r>
+    </w:p>
+    <w:tbl>
+      <w:tblPr>
+        <w:tblW w:w="0" w:type="auto"/>
+        <w:tblBorders>
+          <w:top w:val="single" w:sz="4" w:space="0" w:color="D5D8DE"/>
+          <w:left w:val="single" w:sz="4" w:space="0" w:color="D5D8DE"/>
+          <w:bottom w:val="single" w:sz="4" w:space="0" w:color="D5D8DE"/>
+          <w:right w:val="single" w:sz="4" w:space="0" w:color="D5D8DE"/>
+          <w:insideH w:val="single" w:sz="4" w:space="0" w:color="D5D8DE"/>
+          <w:insideV w:val="single" w:sz="4" w:space="0" w:color="D5D8DE"/>
+        </w:tblBorders>
+        <w:tblLayout w:type="fixed"/>
+        <w:tblCellMar>
+          <w:top w:w="85" w:type="dxa"/>
+          <w:left w:w="90" w:type="dxa"/>
+          <w:bottom w:w="85" w:type="dxa"/>
+          <w:right w:w="90" w:type="dxa"/>
+        </w:tblCellMar>
+        <w:tblLook w:val="04A0" w:firstRow="1" w:lastRow="0" w:firstColumn="1" w:lastColumn="0" w:noHBand="0" w:noVBand="1"/>
+      </w:tblPr>
+      <w:tblGrid>
+        <w:gridCol w:w="2016"/>
+        <w:gridCol w:w="3888"/>
+        <w:gridCol w:w="4320"/>
+      </w:tblGrid>
+      <w:tr>
+        <w:trPr>
+          <w:cantSplit/>
+          <w:tblHeader/>
+        </w:trPr>
+        <w:tc>
+          <w:tcPr>
+            <w:tcW w:w="2016" w:type="dxa"/>
+            <w:shd w:val="clear" w:color="auto" w:fill="F0F1F3"/>
+          </w:tcPr>
+          <w:p>
+            <w:pPr>
+              <w:spacing w:after="0" w:line="250" w:lineRule="auto"/>
+              <w:rPr>
+                <w:rFonts w:ascii="Times New Roman" w:hAnsi="Times New Roman" w:cs="Times New Roman"/>
+              </w:rPr>
+            </w:pPr>
+            <w:r>
+              <w:rPr>
+                <w:rFonts w:ascii="Times New Roman" w:hAnsi="Times New Roman" w:cs="Times New Roman"/>
+                <w:b/>
+              </w:rPr>
+              <w:t>Assignment component</w:t>
+            </w:r>
+          </w:p>
+        </w:tc>
+        <w:tc>
+          <w:tcPr>
+            <w:tcW w:w="3888" w:type="dxa"/>
+            <w:shd w:val="clear" w:color="auto" w:fill="F0F1F3"/>
+          </w:tcPr>
+          <w:p>
+            <w:pPr>
+              <w:spacing w:after="0" w:line="250" w:lineRule="auto"/>
+              <w:rPr>
+                <w:rFonts w:ascii="Times New Roman" w:hAnsi="Times New Roman" w:cs="Times New Roman"/>
+              </w:rPr>
+            </w:pPr>
+            <w:r>
+              <w:rPr>
+                <w:rFonts w:ascii="Times New Roman" w:hAnsi="Times New Roman" w:cs="Times New Roman"/>
+                <w:b/>
+              </w:rPr>
+              <w:t>Material available</w:t>
+            </w:r>
+          </w:p>
+        </w:tc>
+        <w:tc>
+          <w:tcPr>
+            <w:tcW w:w="4320" w:type="dxa"/>
+            <w:shd w:val="clear" w:color="auto" w:fill="F0F1F3"/>
+          </w:tcPr>
+          <w:p>
+            <w:pPr>
+              <w:spacing w:after="0" w:line="250" w:lineRule="auto"/>
+              <w:rPr>
+                <w:rFonts w:ascii="Times New Roman" w:hAnsi="Times New Roman" w:cs="Times New Roman"/>
+              </w:rPr>
+            </w:pPr>
+            <w:r>
+              <w:rPr>
+                <w:rFonts w:ascii="Times New Roman" w:hAnsi="Times New Roman" w:cs="Times New Roman"/>
+                <w:b/>
+              </w:rPr>
+              <w:t>Remaining evidence</w:t>
+            </w:r>
+          </w:p>
+        </w:tc>
+      </w:tr>
+      <w:tr>
+        <w:trPr>
+          <w:cantSplit/>
+        </w:trPr>
+        <w:tc>
+          <w:tcPr>
+            <w:tcW w:w="2016" w:type="dxa"/>
+          </w:tcPr>
+          <w:p>
+            <w:pPr>
+              <w:spacing w:after="0" w:line="250" w:lineRule="auto"/>
+              <w:rPr>
+                <w:rFonts w:ascii="Times New Roman" w:hAnsi="Times New Roman" w:cs="Times New Roman"/>
+              </w:rPr>
+            </w:pPr>
+            <w:r>
+              <w:rPr>
+                <w:rFonts w:ascii="Times New Roman" w:hAnsi="Times New Roman" w:cs="Times New Roman"/>
+              </w:rPr>
+              <w:t>Proposal</w:t>
+            </w:r>
+          </w:p>
+        </w:tc>
+        <w:tc>
+          <w:tcPr>
+            <w:tcW w:w="3888" w:type="dxa"/>
+          </w:tcPr>
+          <w:p>
+            <w:pPr>
+              <w:spacing w:after="0" w:line="250" w:lineRule="auto"/>
+              <w:rPr>
+                <w:rFonts w:ascii="Times New Roman" w:hAnsi="Times New Roman" w:cs="Times New Roman"/>
+              </w:rPr>
+            </w:pPr>
+            <w:r>
+              <w:rPr>
+                <w:rFonts w:ascii="Times New Roman" w:hAnsi="Times New Roman" w:cs="Times New Roman"/>
+              </w:rPr>
+              <w:t>Problem, scope and research question; first pre-defense approval</w:t>
+            </w:r>
+          </w:p>
+        </w:tc>
+        <w:tc>
+          <w:tcPr>
+            <w:tcW w:w="4320" w:type="dxa"/>
+          </w:tcPr>
+          <w:p>
+            <w:pPr>
+              <w:spacing w:after="0" w:line="250" w:lineRule="auto"/>
+              <w:rPr>
+                <w:rFonts w:ascii="Times New Roman" w:hAnsi="Times New Roman" w:cs="Times New Roman"/>
+              </w:rPr>
+            </w:pPr>
+            <w:r>
+              <w:rPr>
+                <w:rFonts w:ascii="Times New Roman" w:hAnsi="Times New Roman" w:cs="Times New Roman"/>
+              </w:rPr>
+              <w:t>Reconfirm refinements at the meeting</w:t>
+            </w:r>
+          </w:p>
+        </w:tc>
+      </w:tr>
+      <w:tr>
+        <w:trPr>
+          <w:cantSplit/>
+        </w:trPr>
+        <w:tc>
+          <w:tcPr>
+            <w:tcW w:w="2016" w:type="dxa"/>
+          </w:tcPr>
+          <w:p>
+            <w:pPr>
+              <w:spacing w:after="0" w:line="250" w:lineRule="auto"/>
+              <w:rPr>
+                <w:rFonts w:ascii="Times New Roman" w:hAnsi="Times New Roman" w:cs="Times New Roman"/>
+              </w:rPr>
+            </w:pPr>
+            <w:r>
+              <w:rPr>
+                <w:rFonts w:ascii="Times New Roman" w:hAnsi="Times New Roman" w:cs="Times New Roman"/>
+              </w:rPr>
+              <w:t>Relevance</w:t>
+            </w:r>
+          </w:p>
+        </w:tc>
+        <w:tc>
+          <w:tcPr>
+            <w:tcW w:w="3888" w:type="dxa"/>
+          </w:tcPr>
+          <w:p>
+            <w:pPr>
+              <w:spacing w:after="0" w:line="250" w:lineRule="auto"/>
+              <w:rPr>
+                <w:rFonts w:ascii="Times New Roman" w:hAnsi="Times New Roman" w:cs="Times New Roman"/>
+              </w:rPr>
+            </w:pPr>
+            <w:r>
+              <w:rPr>
+                <w:rFonts w:ascii="Times New Roman" w:hAnsi="Times New Roman" w:cs="Times New Roman"/>
+              </w:rPr>
+              <w:t>Discussion protocol and decision rules</w:t>
+            </w:r>
+          </w:p>
+        </w:tc>
+        <w:tc>
+          <w:tcPr>
+            <w:tcW w:w="4320" w:type="dxa"/>
+          </w:tcPr>
+          <w:p>
+            <w:pPr>
+              <w:spacing w:after="0" w:line="250" w:lineRule="auto"/>
+              <w:rPr>
+                <w:rFonts w:ascii="Times New Roman" w:hAnsi="Times New Roman" w:cs="Times New Roman"/>
+              </w:rPr>
+            </w:pPr>
+            <w:r>
+              <w:rPr>
+                <w:rFonts w:ascii="Times New Roman" w:hAnsi="Times New Roman" w:cs="Times New Roman"/>
+              </w:rPr>
+              <w:t>Actual discussions or client agreement</w:t>
+            </w:r>
+          </w:p>
+        </w:tc>
+      </w:tr>
+      <w:tr>
+        <w:trPr>
+          <w:cantSplit/>
+        </w:trPr>
+        <w:tc>
+          <w:tcPr>
+            <w:tcW w:w="2016" w:type="dxa"/>
+          </w:tcPr>
+          <w:p>
+            <w:pPr>
+              <w:spacing w:after="0" w:line="250" w:lineRule="auto"/>
+              <w:rPr>
+                <w:rFonts w:ascii="Times New Roman" w:hAnsi="Times New Roman" w:cs="Times New Roman"/>
+              </w:rPr>
+            </w:pPr>
+            <w:r>
+              <w:rPr>
+                <w:rFonts w:ascii="Times New Roman" w:hAnsi="Times New Roman" w:cs="Times New Roman"/>
+              </w:rPr>
+              <w:t>Literature</w:t>
+            </w:r>
+          </w:p>
+        </w:tc>
+        <w:tc>
+          <w:tcPr>
+            <w:tcW w:w="3888" w:type="dxa"/>
+          </w:tcPr>
+          <w:p>
+            <w:pPr>
+              <w:spacing w:after="0" w:line="250" w:lineRule="auto"/>
+              <w:rPr>
+                <w:rFonts w:ascii="Times New Roman" w:hAnsi="Times New Roman" w:cs="Times New Roman"/>
+              </w:rPr>
+            </w:pPr>
+            <w:r>
+              <w:rPr>
+                <w:rFonts w:ascii="Times New Roman" w:hAnsi="Times New Roman" w:cs="Times New Roman"/>
+              </w:rPr>
+              <w:t>Eight scientific sources, critical synthesis and research gap</w:t>
+            </w:r>
+          </w:p>
+        </w:tc>
+        <w:tc>
+          <w:tcPr>
+            <w:tcW w:w="4320" w:type="dxa"/>
+          </w:tcPr>
+          <w:p>
+            <w:pPr>
+              <w:spacing w:after="0" w:line="250" w:lineRule="auto"/>
+              <w:rPr>
+                <w:rFonts w:ascii="Times New Roman" w:hAnsi="Times New Roman" w:cs="Times New Roman"/>
+              </w:rPr>
+            </w:pPr>
+            <w:r>
+              <w:rPr>
+                <w:rFonts w:ascii="Times New Roman" w:hAnsi="Times New Roman" w:cs="Times New Roman"/>
+              </w:rPr>
+              <w:t>Individual reading and oral explanation</w:t>
+            </w:r>
+          </w:p>
+        </w:tc>
+      </w:tr>
+      <w:tr>
+        <w:trPr>
+          <w:cantSplit/>
+        </w:trPr>
+        <w:tc>
+          <w:tcPr>
+            <w:tcW w:w="2016" w:type="dxa"/>
+          </w:tcPr>
+          <w:p>
+            <w:pPr>
+              <w:spacing w:after="0" w:line="250" w:lineRule="auto"/>
+              <w:rPr>
+                <w:rFonts w:ascii="Times New Roman" w:hAnsi="Times New Roman" w:cs="Times New Roman"/>
+              </w:rPr>
+            </w:pPr>
+            <w:r>
+              <w:rPr>
+                <w:rFonts w:ascii="Times New Roman" w:hAnsi="Times New Roman" w:cs="Times New Roman"/>
+              </w:rPr>
+              <w:t>Existing systems</w:t>
+            </w:r>
+          </w:p>
+        </w:tc>
+        <w:tc>
+          <w:tcPr>
+            <w:tcW w:w="3888" w:type="dxa"/>
+          </w:tcPr>
+          <w:p>
+            <w:pPr>
+              <w:spacing w:after="0" w:line="250" w:lineRule="auto"/>
+              <w:rPr>
+                <w:rFonts w:ascii="Times New Roman" w:hAnsi="Times New Roman" w:cs="Times New Roman"/>
+              </w:rPr>
+            </w:pPr>
+            <w:r>
+              <w:rPr>
+                <w:rFonts w:ascii="Times New Roman" w:hAnsi="Times New Roman" w:cs="Times New Roman"/>
+              </w:rPr>
+              <w:t>Four systems and eight consistent criteria</w:t>
+            </w:r>
+          </w:p>
+        </w:tc>
+        <w:tc>
+          <w:tcPr>
+            <w:tcW w:w="4320" w:type="dxa"/>
+          </w:tcPr>
+          <w:p>
+            <w:pPr>
+              <w:spacing w:after="0" w:line="250" w:lineRule="auto"/>
+              <w:rPr>
+                <w:rFonts w:ascii="Times New Roman" w:hAnsi="Times New Roman" w:cs="Times New Roman"/>
+              </w:rPr>
+            </w:pPr>
+            <w:r>
+              <w:rPr>
+                <w:rFonts w:ascii="Times New Roman" w:hAnsi="Times New Roman" w:cs="Times New Roman"/>
+              </w:rPr>
+              <w:t>Review against field findings</w:t>
+            </w:r>
+          </w:p>
+        </w:tc>
+      </w:tr>
+      <w:tr>
+        <w:trPr>
+          <w:cantSplit/>
+        </w:trPr>
+        <w:tc>
+          <w:tcPr>
+            <w:tcW w:w="2016" w:type="dxa"/>
+          </w:tcPr>
+          <w:p>
+            <w:pPr>
+              <w:spacing w:after="0" w:line="250" w:lineRule="auto"/>
+              <w:rPr>
+                <w:rFonts w:ascii="Times New Roman" w:hAnsi="Times New Roman" w:cs="Times New Roman"/>
+              </w:rPr>
+            </w:pPr>
+            <w:r>
+              <w:rPr>
+                <w:rFonts w:ascii="Times New Roman" w:hAnsi="Times New Roman" w:cs="Times New Roman"/>
+              </w:rPr>
+              <w:t>Technology choices</w:t>
+            </w:r>
+          </w:p>
+        </w:tc>
+        <w:tc>
+          <w:tcPr>
+            <w:tcW w:w="3888" w:type="dxa"/>
+          </w:tcPr>
+          <w:p>
+            <w:pPr>
+              <w:spacing w:after="0" w:line="250" w:lineRule="auto"/>
+              <w:rPr>
+                <w:rFonts w:ascii="Times New Roman" w:hAnsi="Times New Roman" w:cs="Times New Roman"/>
+              </w:rPr>
+            </w:pPr>
+            <w:r>
+              <w:rPr>
+                <w:rFonts w:ascii="Times New Roman" w:hAnsi="Times New Roman" w:cs="Times New Roman"/>
+              </w:rPr>
+              <w:t>Five decisions with reasonable alternatives</w:t>
+            </w:r>
+          </w:p>
+        </w:tc>
+        <w:tc>
+          <w:tcPr>
+            <w:tcW w:w="4320" w:type="dxa"/>
+          </w:tcPr>
+          <w:p>
+            <w:pPr>
+              <w:spacing w:after="0" w:line="250" w:lineRule="auto"/>
+              <w:rPr>
+                <w:rFonts w:ascii="Times New Roman" w:hAnsi="Times New Roman" w:cs="Times New Roman"/>
+              </w:rPr>
+            </w:pPr>
+            <w:r>
+              <w:rPr>
+                <w:rFonts w:ascii="Times New Roman" w:hAnsi="Times New Roman" w:cs="Times New Roman"/>
+              </w:rPr>
+              <w:t>Revisit if project requirements change</w:t>
+            </w:r>
+          </w:p>
+        </w:tc>
+      </w:tr>
+      <w:tr>
+        <w:trPr>
+          <w:cantSplit/>
+        </w:trPr>
+        <w:tc>
+          <w:tcPr>
+            <w:tcW w:w="2016" w:type="dxa"/>
+          </w:tcPr>
+          <w:p>
+            <w:pPr>
+              <w:spacing w:after="0" w:line="250" w:lineRule="auto"/>
+              <w:rPr>
+                <w:rFonts w:ascii="Times New Roman" w:hAnsi="Times New Roman" w:cs="Times New Roman"/>
+              </w:rPr>
+            </w:pPr>
+            <w:r>
+              <w:rPr>
+                <w:rFonts w:ascii="Times New Roman" w:hAnsi="Times New Roman" w:cs="Times New Roman"/>
+              </w:rPr>
+              <w:t>Requirements</w:t>
+            </w:r>
+          </w:p>
+        </w:tc>
+        <w:tc>
+          <w:tcPr>
+            <w:tcW w:w="3888" w:type="dxa"/>
+          </w:tcPr>
+          <w:p>
+            <w:pPr>
+              <w:spacing w:after="0" w:line="250" w:lineRule="auto"/>
+              <w:rPr>
+                <w:rFonts w:ascii="Times New Roman" w:hAnsi="Times New Roman" w:cs="Times New Roman"/>
+              </w:rPr>
+            </w:pPr>
+            <w:r>
+              <w:rPr>
+                <w:rFonts w:ascii="Times New Roman" w:hAnsi="Times New Roman" w:cs="Times New Roman"/>
+              </w:rPr>
+              <w:t>Named requirements and acceptance criteria</w:t>
+            </w:r>
+          </w:p>
+        </w:tc>
+        <w:tc>
+          <w:tcPr>
+            <w:tcW w:w="4320" w:type="dxa"/>
+          </w:tcPr>
+          <w:p>
+            <w:pPr>
+              <w:spacing w:after="0" w:line="250" w:lineRule="auto"/>
+              <w:rPr>
+                <w:rFonts w:ascii="Times New Roman" w:hAnsi="Times New Roman" w:cs="Times New Roman"/>
+              </w:rPr>
+            </w:pPr>
+            <w:r>
+              <w:rPr>
+                <w:rFonts w:ascii="Times New Roman" w:hAnsi="Times New Roman" w:cs="Times New Roman"/>
+              </w:rPr>
+              <w:t>Execution records and evidence-driven changes</w:t>
+            </w:r>
+          </w:p>
+        </w:tc>
+      </w:tr>
+      <w:tr>
+        <w:trPr>
+          <w:cantSplit/>
+        </w:trPr>
+        <w:tc>
+          <w:tcPr>
+            <w:tcW w:w="2016" w:type="dxa"/>
+          </w:tcPr>
+          <w:p>
+            <w:pPr>
+              <w:spacing w:after="0" w:line="250" w:lineRule="auto"/>
+              <w:rPr>
+                <w:rFonts w:ascii="Times New Roman" w:hAnsi="Times New Roman" w:cs="Times New Roman"/>
+              </w:rPr>
+            </w:pPr>
+            <w:r>
+              <w:rPr>
+                <w:rFonts w:ascii="Times New Roman" w:hAnsi="Times New Roman" w:cs="Times New Roman"/>
+              </w:rPr>
+              <w:t>Architecture</w:t>
+            </w:r>
+          </w:p>
+        </w:tc>
+        <w:tc>
+          <w:tcPr>
+            <w:tcW w:w="3888" w:type="dxa"/>
+          </w:tcPr>
+          <w:p>
+            <w:pPr>
+              <w:spacing w:after="0" w:line="250" w:lineRule="auto"/>
+              <w:rPr>
+                <w:rFonts w:ascii="Times New Roman" w:hAnsi="Times New Roman" w:cs="Times New Roman"/>
+              </w:rPr>
+            </w:pPr>
+            <w:r>
+              <w:rPr>
+                <w:rFonts w:ascii="Times New Roman" w:hAnsi="Times New Roman" w:cs="Times New Roman"/>
+              </w:rPr>
+              <w:t>Context, use case, component, ERD, activity and sequence views</w:t>
+            </w:r>
+          </w:p>
+        </w:tc>
+        <w:tc>
+          <w:tcPr>
+            <w:tcW w:w="4320" w:type="dxa"/>
+          </w:tcPr>
+          <w:p>
+            <w:pPr>
+              <w:spacing w:after="0" w:line="250" w:lineRule="auto"/>
+              <w:rPr>
+                <w:rFonts w:ascii="Times New Roman" w:hAnsi="Times New Roman" w:cs="Times New Roman"/>
+              </w:rPr>
+            </w:pPr>
+            <w:r>
+              <w:rPr>
+                <w:rFonts w:ascii="Times New Roman" w:hAnsi="Times New Roman" w:cs="Times New Roman"/>
+              </w:rPr>
+              <w:t>Independent team review</w:t>
+            </w:r>
+          </w:p>
+        </w:tc>
+      </w:tr>
+      <w:tr>
+        <w:trPr>
+          <w:cantSplit/>
+        </w:trPr>
+        <w:tc>
+          <w:tcPr>
+            <w:tcW w:w="2016" w:type="dxa"/>
+          </w:tcPr>
+          <w:p>
+            <w:pPr>
+              <w:spacing w:after="0" w:line="250" w:lineRule="auto"/>
+              <w:rPr>
+                <w:rFonts w:ascii="Times New Roman" w:hAnsi="Times New Roman" w:cs="Times New Roman"/>
+              </w:rPr>
+            </w:pPr>
+            <w:r>
+              <w:rPr>
+                <w:rFonts w:ascii="Times New Roman" w:hAnsi="Times New Roman" w:cs="Times New Roman"/>
+              </w:rPr>
+              <w:t>UX and prototype</w:t>
+            </w:r>
+          </w:p>
+        </w:tc>
+        <w:tc>
+          <w:tcPr>
+            <w:tcW w:w="3888" w:type="dxa"/>
+          </w:tcPr>
+          <w:p>
+            <w:pPr>
+              <w:spacing w:after="0" w:line="250" w:lineRule="auto"/>
+              <w:rPr>
+                <w:rFonts w:ascii="Times New Roman" w:hAnsi="Times New Roman" w:cs="Times New Roman"/>
+              </w:rPr>
+            </w:pPr>
+            <w:r>
+              <w:rPr>
+                <w:rFonts w:ascii="Times New Roman" w:hAnsi="Times New Roman" w:cs="Times New Roman"/>
+              </w:rPr>
+              <w:t>Existing Vue and Go implementation and walkthrough</w:t>
+            </w:r>
+          </w:p>
+        </w:tc>
+        <w:tc>
+          <w:tcPr>
+            <w:tcW w:w="4320" w:type="dxa"/>
+          </w:tcPr>
+          <w:p>
+            <w:pPr>
+              <w:spacing w:after="0" w:line="250" w:lineRule="auto"/>
+              <w:rPr>
+                <w:rFonts w:ascii="Times New Roman" w:hAnsi="Times New Roman" w:cs="Times New Roman"/>
+              </w:rPr>
+            </w:pPr>
+            <w:r>
+              <w:rPr>
+                <w:rFonts w:ascii="Times New Roman" w:hAnsi="Times New Roman" w:cs="Times New Roman"/>
+              </w:rPr>
+              <w:t>Dated browser demonstration</w:t>
+            </w:r>
+          </w:p>
+        </w:tc>
+      </w:tr>
+      <w:tr>
+        <w:trPr>
+          <w:cantSplit/>
+        </w:trPr>
+        <w:tc>
+          <w:tcPr>
+            <w:tcW w:w="2016" w:type="dxa"/>
+          </w:tcPr>
+          <w:p>
+            <w:pPr>
+              <w:spacing w:after="0" w:line="250" w:lineRule="auto"/>
+              <w:rPr>
+                <w:rFonts w:ascii="Times New Roman" w:hAnsi="Times New Roman" w:cs="Times New Roman"/>
+              </w:rPr>
+            </w:pPr>
+            <w:r>
+              <w:rPr>
+                <w:rFonts w:ascii="Times New Roman" w:hAnsi="Times New Roman" w:cs="Times New Roman"/>
+              </w:rPr>
+              <w:t>Evaluation</w:t>
+            </w:r>
+          </w:p>
+        </w:tc>
+        <w:tc>
+          <w:tcPr>
+            <w:tcW w:w="3888" w:type="dxa"/>
+          </w:tcPr>
+          <w:p>
+            <w:pPr>
+              <w:spacing w:after="0" w:line="250" w:lineRule="auto"/>
+              <w:rPr>
+                <w:rFonts w:ascii="Times New Roman" w:hAnsi="Times New Roman" w:cs="Times New Roman"/>
+              </w:rPr>
+            </w:pPr>
+            <w:r>
+              <w:rPr>
+                <w:rFonts w:ascii="Times New Roman" w:hAnsi="Times New Roman" w:cs="Times New Roman"/>
+              </w:rPr>
+              <w:t>Manual comparison, rubric, measures and bias controls</w:t>
+            </w:r>
+          </w:p>
+        </w:tc>
+        <w:tc>
+          <w:tcPr>
+            <w:tcW w:w="4320" w:type="dxa"/>
+          </w:tcPr>
+          <w:p>
+            <w:pPr>
+              <w:spacing w:after="0" w:line="250" w:lineRule="auto"/>
+              <w:rPr>
+                <w:rFonts w:ascii="Times New Roman" w:hAnsi="Times New Roman" w:cs="Times New Roman"/>
+              </w:rPr>
+            </w:pPr>
+            <w:r>
+              <w:rPr>
+                <w:rFonts w:ascii="Times New Roman" w:hAnsi="Times New Roman" w:cs="Times New Roman"/>
+              </w:rPr>
+              <w:t>Recruitment and later study execution</w:t>
+            </w:r>
+          </w:p>
+        </w:tc>
+      </w:tr>
+      <w:tr>
+        <w:trPr>
+          <w:cantSplit/>
+        </w:trPr>
+        <w:tc>
+          <w:tcPr>
+            <w:tcW w:w="2016" w:type="dxa"/>
+          </w:tcPr>
+          <w:p>
+            <w:pPr>
+              <w:spacing w:after="0" w:line="250" w:lineRule="auto"/>
+              <w:rPr>
+                <w:rFonts w:ascii="Times New Roman" w:hAnsi="Times New Roman" w:cs="Times New Roman"/>
+              </w:rPr>
+            </w:pPr>
+            <w:r>
+              <w:rPr>
+                <w:rFonts w:ascii="Times New Roman" w:hAnsi="Times New Roman" w:cs="Times New Roman"/>
+              </w:rPr>
+              <w:t>Management</w:t>
+            </w:r>
+          </w:p>
+        </w:tc>
+        <w:tc>
+          <w:tcPr>
+            <w:tcW w:w="3888" w:type="dxa"/>
+          </w:tcPr>
+          <w:p>
+            <w:pPr>
+              <w:spacing w:after="0" w:line="250" w:lineRule="auto"/>
+              <w:rPr>
+                <w:rFonts w:ascii="Times New Roman" w:hAnsi="Times New Roman" w:cs="Times New Roman"/>
+              </w:rPr>
+            </w:pPr>
+            <w:r>
+              <w:rPr>
+                <w:rFonts w:ascii="Times New Roman" w:hAnsi="Times New Roman" w:cs="Times New Roman"/>
+              </w:rPr>
+              <w:t xml:space="preserve">Contribution summary and live </w:t>
+            </w:r>
+            <w:proofErr w:type="spellStart"/>
+            <w:r>
+              <w:rPr>
+                <w:rFonts w:ascii="Times New Roman" w:hAnsi="Times New Roman" w:cs="Times New Roman"/>
+              </w:rPr>
+              <w:t>YouTrack</w:t>
+            </w:r>
+            <w:proofErr w:type="spellEnd"/>
+            <w:r>
+              <w:rPr>
+                <w:rFonts w:ascii="Times New Roman" w:hAnsi="Times New Roman" w:cs="Times New Roman"/>
+              </w:rPr>
+              <w:t xml:space="preserve"> project</w:t>
+            </w:r>
+          </w:p>
+        </w:tc>
+        <w:tc>
+          <w:tcPr>
+            <w:tcW w:w="4320" w:type="dxa"/>
+          </w:tcPr>
+          <w:p>
+            <w:pPr>
+              <w:spacing w:after="0" w:line="250" w:lineRule="auto"/>
+              <w:rPr>
+                <w:rFonts w:ascii="Times New Roman" w:hAnsi="Times New Roman" w:cs="Times New Roman"/>
+              </w:rPr>
+            </w:pPr>
+            <w:r>
+              <w:rPr>
+                <w:rFonts w:ascii="Times New Roman" w:hAnsi="Times New Roman" w:cs="Times New Roman"/>
+              </w:rPr>
+              <w:t>Linked peer reviews and submission receipt; personal assignments and the submission tag are available.</w:t>
+            </w:r>
+          </w:p>
+        </w:tc>
+      </w:tr>
+      <w:tr>
+        <w:trPr>
+          <w:cantSplit/>
+        </w:trPr>
+        <w:tc>
+          <w:tcPr>
+            <w:tcW w:w="2016" w:type="dxa"/>
+          </w:tcPr>
+          <w:p>
+            <w:pPr>
+              <w:spacing w:after="0" w:line="250" w:lineRule="auto"/>
+              <w:rPr>
+                <w:rFonts w:ascii="Times New Roman" w:hAnsi="Times New Roman" w:cs="Times New Roman"/>
+              </w:rPr>
+            </w:pPr>
+            <w:r>
+              <w:rPr>
+                <w:rFonts w:ascii="Times New Roman" w:hAnsi="Times New Roman" w:cs="Times New Roman"/>
+              </w:rPr>
+              <w:t>Supervision</w:t>
+            </w:r>
+          </w:p>
+        </w:tc>
+        <w:tc>
+          <w:tcPr>
+            <w:tcW w:w="3888" w:type="dxa"/>
+          </w:tcPr>
+          <w:p>
+            <w:pPr>
+              <w:spacing w:after="0" w:line="250" w:lineRule="auto"/>
+              <w:rPr>
+                <w:rFonts w:ascii="Times New Roman" w:hAnsi="Times New Roman" w:cs="Times New Roman"/>
+              </w:rPr>
+            </w:pPr>
+            <w:r>
+              <w:rPr>
+                <w:rFonts w:ascii="Times New Roman" w:hAnsi="Times New Roman" w:cs="Times New Roman"/>
+              </w:rPr>
+              <w:t>Written approval and mapped revisions</w:t>
+            </w:r>
+          </w:p>
+        </w:tc>
+        <w:tc>
+          <w:tcPr>
+            <w:tcW w:w="4320" w:type="dxa"/>
+          </w:tcPr>
+          <w:p>
+            <w:pPr>
+              <w:spacing w:after="0" w:line="250" w:lineRule="auto"/>
+              <w:rPr>
+                <w:rFonts w:ascii="Times New Roman" w:hAnsi="Times New Roman" w:cs="Times New Roman"/>
+              </w:rPr>
+            </w:pPr>
+            <w:r>
+              <w:rPr>
+                <w:rFonts w:ascii="Times New Roman" w:hAnsi="Times New Roman" w:cs="Times New Roman"/>
+              </w:rPr>
+              <w:t>Follow-up meeting and signed form procedure</w:t>
+            </w:r>
+          </w:p>
+        </w:tc>
+      </w:tr>
+    </w:tbl>
+    <w:p>
+      <w:pPr>
+        <w:spacing w:after="20" w:line="240" w:lineRule="auto"/>
+        <w:rPr>
+          <w:rFonts w:ascii="Times New Roman" w:hAnsi="Times New Roman" w:cs="Times New Roman"/>
+        </w:rPr>
+      </w:pPr>
+    </w:p>
+    <w:p>
+      <w:pPr>
+        <w:rPr>
+          <w:rFonts w:ascii="Times New Roman" w:hAnsi="Times New Roman" w:cs="Times New Roman"/>
+        </w:rPr>
+      </w:pPr>
+      <w:r>
+        <w:rPr>
+          <w:rFonts w:ascii="Times New Roman" w:hAnsi="Times New Roman" w:cs="Times New Roman"/>
+        </w:rPr>
+        <w:t>This report addresses the eleven required components while distinguishing prepared materials from completed evidence. Field discussions, independent reviews, comparative experiments and the university submission receipt remain outstanding. Personal YouTrack assignments are in place. The team must explain these limits alongside the prototype and its design rationale.</w:t>
+      </w:r>
+    </w:p>
+    <w:p>
+      <w:bookmarkStart w:id="511" w:name="section_11"/>
+      <w:pPr>
         <w:pStyle w:val="1"/>
         <w:pageBreakBefore/>
         <w:rPr>
@@ -10404,12 +11711,13 @@
       <w:r>
         <w:rPr>
           <w:rFonts w:ascii="Times New Roman" w:hAnsi="Times New Roman" w:cs="Times New Roman"/>
+          <w:color w:val="000000"/>
           <w:sz w:val="22"/>
           <w:szCs w:val="22"/>
         </w:rPr>
-        <w:lastRenderedPageBreak/>
-        <w:t>11 Supervisor feedback and revision record</w:t>
-      </w:r>
+        <w:t>11 Supervisor feedback</w:t>
+      </w:r>
+      <w:bookmarkEnd w:id="511"/>
     </w:p>
     <w:p>
       <w:pPr>
@@ -10423,6 +11731,7 @@
       <w:r>
         <w:rPr>
           <w:rFonts w:ascii="Times New Roman" w:hAnsi="Times New Roman" w:cs="Times New Roman"/>
+          <w:color w:val="000000"/>
           <w:sz w:val="22"/>
           <w:szCs w:val="22"/>
         </w:rPr>
@@ -10894,6 +12203,7 @@
       <w:r>
         <w:rPr>
           <w:rFonts w:ascii="Times New Roman" w:hAnsi="Times New Roman" w:cs="Times New Roman"/>
+          <w:color w:val="000000"/>
           <w:sz w:val="22"/>
           <w:szCs w:val="22"/>
         </w:rPr>
@@ -10910,7 +12220,7 @@
         <w:rPr>
           <w:rFonts w:ascii="Times New Roman" w:hAnsi="Times New Roman" w:cs="Times New Roman"/>
         </w:rPr>
-        <w:t>Future messages to the supervisor should begin with an appropriate greeting, identify the purpose and attached version, and end with the sender's name. This follows his explicit request for professional academic communication. A draft response is included in the supporting files; it has not been sent.</w:t>
+        <w:t>Messages to the supervisor should begin with an appropriate greeting, identify their purpose and the attached version, and end with the sender's name. The written feedback requested professional academic communication. No follow-up message or confirmed meeting is claimed here.</w:t>
       </w:r>
     </w:p>
     <w:p>
@@ -10927,6 +12237,7 @@
       </w:r>
     </w:p>
     <w:p>
+      <w:bookmarkStart w:id="512" w:name="section_12"/>
       <w:pPr>
         <w:pStyle w:val="1"/>
         <w:pageBreakBefore/>
@@ -10939,828 +12250,194 @@
       <w:r>
         <w:rPr>
           <w:rFonts w:ascii="Times New Roman" w:hAnsi="Times New Roman" w:cs="Times New Roman"/>
+          <w:color w:val="000000"/>
           <w:sz w:val="22"/>
           <w:szCs w:val="22"/>
         </w:rPr>
-        <w:lastRenderedPageBreak/>
-        <w:t>11 Submission readiness</w:t>
-      </w:r>
-    </w:p>
-    <w:tbl>
-      <w:tblPr>
-        <w:tblW w:w="0" w:type="auto"/>
-        <w:tblBorders>
-          <w:top w:val="single" w:sz="4" w:space="0" w:color="D5D8DE"/>
-          <w:left w:val="single" w:sz="4" w:space="0" w:color="D5D8DE"/>
-          <w:bottom w:val="single" w:sz="4" w:space="0" w:color="D5D8DE"/>
-          <w:right w:val="single" w:sz="4" w:space="0" w:color="D5D8DE"/>
-          <w:insideH w:val="single" w:sz="4" w:space="0" w:color="D5D8DE"/>
-          <w:insideV w:val="single" w:sz="4" w:space="0" w:color="D5D8DE"/>
-        </w:tblBorders>
-        <w:tblLayout w:type="fixed"/>
-        <w:tblCellMar>
-          <w:top w:w="85" w:type="dxa"/>
-          <w:left w:w="90" w:type="dxa"/>
-          <w:bottom w:w="85" w:type="dxa"/>
-          <w:right w:w="90" w:type="dxa"/>
-        </w:tblCellMar>
-        <w:tblLook w:val="04A0" w:firstRow="1" w:lastRow="0" w:firstColumn="1" w:lastColumn="0" w:noHBand="0" w:noVBand="1"/>
-      </w:tblPr>
-      <w:tblGrid>
-        <w:gridCol w:w="2016"/>
-        <w:gridCol w:w="3888"/>
-        <w:gridCol w:w="4320"/>
-      </w:tblGrid>
-      <w:tr>
-        <w:trPr>
-          <w:cantSplit/>
-          <w:tblHeader/>
-        </w:trPr>
-        <w:tc>
-          <w:tcPr>
-            <w:tcW w:w="2016" w:type="dxa"/>
-            <w:shd w:val="clear" w:color="auto" w:fill="F0F1F3"/>
-          </w:tcPr>
-          <w:p>
-            <w:pPr>
-              <w:spacing w:after="0" w:line="250" w:lineRule="auto"/>
-              <w:rPr>
-                <w:rFonts w:ascii="Times New Roman" w:hAnsi="Times New Roman" w:cs="Times New Roman"/>
-              </w:rPr>
-            </w:pPr>
-            <w:r>
-              <w:rPr>
-                <w:rFonts w:ascii="Times New Roman" w:hAnsi="Times New Roman" w:cs="Times New Roman"/>
-                <w:b/>
-              </w:rPr>
-              <w:t>Assignment component</w:t>
-            </w:r>
-          </w:p>
-        </w:tc>
-        <w:tc>
-          <w:tcPr>
-            <w:tcW w:w="3888" w:type="dxa"/>
-            <w:shd w:val="clear" w:color="auto" w:fill="F0F1F3"/>
-          </w:tcPr>
-          <w:p>
-            <w:pPr>
-              <w:spacing w:after="0" w:line="250" w:lineRule="auto"/>
-              <w:rPr>
-                <w:rFonts w:ascii="Times New Roman" w:hAnsi="Times New Roman" w:cs="Times New Roman"/>
-              </w:rPr>
-            </w:pPr>
-            <w:r>
-              <w:rPr>
-                <w:rFonts w:ascii="Times New Roman" w:hAnsi="Times New Roman" w:cs="Times New Roman"/>
-                <w:b/>
-              </w:rPr>
-              <w:t>Material available</w:t>
-            </w:r>
-          </w:p>
-        </w:tc>
-        <w:tc>
-          <w:tcPr>
-            <w:tcW w:w="4320" w:type="dxa"/>
-            <w:shd w:val="clear" w:color="auto" w:fill="F0F1F3"/>
-          </w:tcPr>
-          <w:p>
-            <w:pPr>
-              <w:spacing w:after="0" w:line="250" w:lineRule="auto"/>
-              <w:rPr>
-                <w:rFonts w:ascii="Times New Roman" w:hAnsi="Times New Roman" w:cs="Times New Roman"/>
-              </w:rPr>
-            </w:pPr>
-            <w:r>
-              <w:rPr>
-                <w:rFonts w:ascii="Times New Roman" w:hAnsi="Times New Roman" w:cs="Times New Roman"/>
-                <w:b/>
-              </w:rPr>
-              <w:t>Remaining evidence</w:t>
-            </w:r>
-          </w:p>
-        </w:tc>
-      </w:tr>
-      <w:tr>
-        <w:trPr>
-          <w:cantSplit/>
-        </w:trPr>
-        <w:tc>
-          <w:tcPr>
-            <w:tcW w:w="2016" w:type="dxa"/>
-          </w:tcPr>
-          <w:p>
-            <w:pPr>
-              <w:spacing w:after="0" w:line="250" w:lineRule="auto"/>
-              <w:rPr>
-                <w:rFonts w:ascii="Times New Roman" w:hAnsi="Times New Roman" w:cs="Times New Roman"/>
-              </w:rPr>
-            </w:pPr>
-            <w:r>
-              <w:rPr>
-                <w:rFonts w:ascii="Times New Roman" w:hAnsi="Times New Roman" w:cs="Times New Roman"/>
-              </w:rPr>
-              <w:t>Proposal</w:t>
-            </w:r>
-          </w:p>
-        </w:tc>
-        <w:tc>
-          <w:tcPr>
-            <w:tcW w:w="3888" w:type="dxa"/>
-          </w:tcPr>
-          <w:p>
-            <w:pPr>
-              <w:spacing w:after="0" w:line="250" w:lineRule="auto"/>
-              <w:rPr>
-                <w:rFonts w:ascii="Times New Roman" w:hAnsi="Times New Roman" w:cs="Times New Roman"/>
-              </w:rPr>
-            </w:pPr>
-            <w:r>
-              <w:rPr>
-                <w:rFonts w:ascii="Times New Roman" w:hAnsi="Times New Roman" w:cs="Times New Roman"/>
-              </w:rPr>
-              <w:t>Problem, scope and research question; first pre-defense approval</w:t>
-            </w:r>
-          </w:p>
-        </w:tc>
-        <w:tc>
-          <w:tcPr>
-            <w:tcW w:w="4320" w:type="dxa"/>
-          </w:tcPr>
-          <w:p>
-            <w:pPr>
-              <w:spacing w:after="0" w:line="250" w:lineRule="auto"/>
-              <w:rPr>
-                <w:rFonts w:ascii="Times New Roman" w:hAnsi="Times New Roman" w:cs="Times New Roman"/>
-              </w:rPr>
-            </w:pPr>
-            <w:r>
-              <w:rPr>
-                <w:rFonts w:ascii="Times New Roman" w:hAnsi="Times New Roman" w:cs="Times New Roman"/>
-              </w:rPr>
-              <w:t>Reconfirm refinements at the meeting</w:t>
-            </w:r>
-          </w:p>
-        </w:tc>
-      </w:tr>
-      <w:tr>
-        <w:trPr>
-          <w:cantSplit/>
-        </w:trPr>
-        <w:tc>
-          <w:tcPr>
-            <w:tcW w:w="2016" w:type="dxa"/>
-          </w:tcPr>
-          <w:p>
-            <w:pPr>
-              <w:spacing w:after="0" w:line="250" w:lineRule="auto"/>
-              <w:rPr>
-                <w:rFonts w:ascii="Times New Roman" w:hAnsi="Times New Roman" w:cs="Times New Roman"/>
-              </w:rPr>
-            </w:pPr>
-            <w:r>
-              <w:rPr>
-                <w:rFonts w:ascii="Times New Roman" w:hAnsi="Times New Roman" w:cs="Times New Roman"/>
-              </w:rPr>
-              <w:t>Relevance</w:t>
-            </w:r>
-          </w:p>
-        </w:tc>
-        <w:tc>
-          <w:tcPr>
-            <w:tcW w:w="3888" w:type="dxa"/>
-          </w:tcPr>
-          <w:p>
-            <w:pPr>
-              <w:spacing w:after="0" w:line="250" w:lineRule="auto"/>
-              <w:rPr>
-                <w:rFonts w:ascii="Times New Roman" w:hAnsi="Times New Roman" w:cs="Times New Roman"/>
-              </w:rPr>
-            </w:pPr>
-            <w:r>
-              <w:rPr>
-                <w:rFonts w:ascii="Times New Roman" w:hAnsi="Times New Roman" w:cs="Times New Roman"/>
-              </w:rPr>
-              <w:t>Discussion protocol and decision rules</w:t>
-            </w:r>
-          </w:p>
-        </w:tc>
-        <w:tc>
-          <w:tcPr>
-            <w:tcW w:w="4320" w:type="dxa"/>
-          </w:tcPr>
-          <w:p>
-            <w:pPr>
-              <w:spacing w:after="0" w:line="250" w:lineRule="auto"/>
-              <w:rPr>
-                <w:rFonts w:ascii="Times New Roman" w:hAnsi="Times New Roman" w:cs="Times New Roman"/>
-              </w:rPr>
-            </w:pPr>
-            <w:r>
-              <w:rPr>
-                <w:rFonts w:ascii="Times New Roman" w:hAnsi="Times New Roman" w:cs="Times New Roman"/>
-              </w:rPr>
-              <w:t>Actual discussions or client agreement</w:t>
-            </w:r>
-          </w:p>
-        </w:tc>
-      </w:tr>
-      <w:tr>
-        <w:trPr>
-          <w:cantSplit/>
-        </w:trPr>
-        <w:tc>
-          <w:tcPr>
-            <w:tcW w:w="2016" w:type="dxa"/>
-          </w:tcPr>
-          <w:p>
-            <w:pPr>
-              <w:spacing w:after="0" w:line="250" w:lineRule="auto"/>
-              <w:rPr>
-                <w:rFonts w:ascii="Times New Roman" w:hAnsi="Times New Roman" w:cs="Times New Roman"/>
-              </w:rPr>
-            </w:pPr>
-            <w:r>
-              <w:rPr>
-                <w:rFonts w:ascii="Times New Roman" w:hAnsi="Times New Roman" w:cs="Times New Roman"/>
-              </w:rPr>
-              <w:t>Literature</w:t>
-            </w:r>
-          </w:p>
-        </w:tc>
-        <w:tc>
-          <w:tcPr>
-            <w:tcW w:w="3888" w:type="dxa"/>
-          </w:tcPr>
-          <w:p>
-            <w:pPr>
-              <w:spacing w:after="0" w:line="250" w:lineRule="auto"/>
-              <w:rPr>
-                <w:rFonts w:ascii="Times New Roman" w:hAnsi="Times New Roman" w:cs="Times New Roman"/>
-              </w:rPr>
-            </w:pPr>
-            <w:r>
-              <w:rPr>
-                <w:rFonts w:ascii="Times New Roman" w:hAnsi="Times New Roman" w:cs="Times New Roman"/>
-              </w:rPr>
-              <w:t>Eight scientific sources, critical synthesis and research gap</w:t>
-            </w:r>
-          </w:p>
-        </w:tc>
-        <w:tc>
-          <w:tcPr>
-            <w:tcW w:w="4320" w:type="dxa"/>
-          </w:tcPr>
-          <w:p>
-            <w:pPr>
-              <w:spacing w:after="0" w:line="250" w:lineRule="auto"/>
-              <w:rPr>
-                <w:rFonts w:ascii="Times New Roman" w:hAnsi="Times New Roman" w:cs="Times New Roman"/>
-              </w:rPr>
-            </w:pPr>
-            <w:r>
-              <w:rPr>
-                <w:rFonts w:ascii="Times New Roman" w:hAnsi="Times New Roman" w:cs="Times New Roman"/>
-              </w:rPr>
-              <w:t>Individual reading and oral explanation</w:t>
-            </w:r>
-          </w:p>
-        </w:tc>
-      </w:tr>
-      <w:tr>
-        <w:trPr>
-          <w:cantSplit/>
-        </w:trPr>
-        <w:tc>
-          <w:tcPr>
-            <w:tcW w:w="2016" w:type="dxa"/>
-          </w:tcPr>
-          <w:p>
-            <w:pPr>
-              <w:spacing w:after="0" w:line="250" w:lineRule="auto"/>
-              <w:rPr>
-                <w:rFonts w:ascii="Times New Roman" w:hAnsi="Times New Roman" w:cs="Times New Roman"/>
-              </w:rPr>
-            </w:pPr>
-            <w:r>
-              <w:rPr>
-                <w:rFonts w:ascii="Times New Roman" w:hAnsi="Times New Roman" w:cs="Times New Roman"/>
-              </w:rPr>
-              <w:t>Existing systems</w:t>
-            </w:r>
-          </w:p>
-        </w:tc>
-        <w:tc>
-          <w:tcPr>
-            <w:tcW w:w="3888" w:type="dxa"/>
-          </w:tcPr>
-          <w:p>
-            <w:pPr>
-              <w:spacing w:after="0" w:line="250" w:lineRule="auto"/>
-              <w:rPr>
-                <w:rFonts w:ascii="Times New Roman" w:hAnsi="Times New Roman" w:cs="Times New Roman"/>
-              </w:rPr>
-            </w:pPr>
-            <w:r>
-              <w:rPr>
-                <w:rFonts w:ascii="Times New Roman" w:hAnsi="Times New Roman" w:cs="Times New Roman"/>
-              </w:rPr>
-              <w:t>Four systems and eight consistent criteria</w:t>
-            </w:r>
-          </w:p>
-        </w:tc>
-        <w:tc>
-          <w:tcPr>
-            <w:tcW w:w="4320" w:type="dxa"/>
-          </w:tcPr>
-          <w:p>
-            <w:pPr>
-              <w:spacing w:after="0" w:line="250" w:lineRule="auto"/>
-              <w:rPr>
-                <w:rFonts w:ascii="Times New Roman" w:hAnsi="Times New Roman" w:cs="Times New Roman"/>
-              </w:rPr>
-            </w:pPr>
-            <w:r>
-              <w:rPr>
-                <w:rFonts w:ascii="Times New Roman" w:hAnsi="Times New Roman" w:cs="Times New Roman"/>
-              </w:rPr>
-              <w:t>Review against field findings</w:t>
-            </w:r>
-          </w:p>
-        </w:tc>
-      </w:tr>
-      <w:tr>
-        <w:trPr>
-          <w:cantSplit/>
-        </w:trPr>
-        <w:tc>
-          <w:tcPr>
-            <w:tcW w:w="2016" w:type="dxa"/>
-          </w:tcPr>
-          <w:p>
-            <w:pPr>
-              <w:spacing w:after="0" w:line="250" w:lineRule="auto"/>
-              <w:rPr>
-                <w:rFonts w:ascii="Times New Roman" w:hAnsi="Times New Roman" w:cs="Times New Roman"/>
-              </w:rPr>
-            </w:pPr>
-            <w:r>
-              <w:rPr>
-                <w:rFonts w:ascii="Times New Roman" w:hAnsi="Times New Roman" w:cs="Times New Roman"/>
-              </w:rPr>
-              <w:t>Technology choices</w:t>
-            </w:r>
-          </w:p>
-        </w:tc>
-        <w:tc>
-          <w:tcPr>
-            <w:tcW w:w="3888" w:type="dxa"/>
-          </w:tcPr>
-          <w:p>
-            <w:pPr>
-              <w:spacing w:after="0" w:line="250" w:lineRule="auto"/>
-              <w:rPr>
-                <w:rFonts w:ascii="Times New Roman" w:hAnsi="Times New Roman" w:cs="Times New Roman"/>
-              </w:rPr>
-            </w:pPr>
-            <w:r>
-              <w:rPr>
-                <w:rFonts w:ascii="Times New Roman" w:hAnsi="Times New Roman" w:cs="Times New Roman"/>
-              </w:rPr>
-              <w:t>Five decisions with reasonable alternatives</w:t>
-            </w:r>
-          </w:p>
-        </w:tc>
-        <w:tc>
-          <w:tcPr>
-            <w:tcW w:w="4320" w:type="dxa"/>
-          </w:tcPr>
-          <w:p>
-            <w:pPr>
-              <w:spacing w:after="0" w:line="250" w:lineRule="auto"/>
-              <w:rPr>
-                <w:rFonts w:ascii="Times New Roman" w:hAnsi="Times New Roman" w:cs="Times New Roman"/>
-              </w:rPr>
-            </w:pPr>
-            <w:r>
-              <w:rPr>
-                <w:rFonts w:ascii="Times New Roman" w:hAnsi="Times New Roman" w:cs="Times New Roman"/>
-              </w:rPr>
-              <w:t>Revisit if project requirements change</w:t>
-            </w:r>
-          </w:p>
-        </w:tc>
-      </w:tr>
-      <w:tr>
-        <w:trPr>
-          <w:cantSplit/>
-        </w:trPr>
-        <w:tc>
-          <w:tcPr>
-            <w:tcW w:w="2016" w:type="dxa"/>
-          </w:tcPr>
-          <w:p>
-            <w:pPr>
-              <w:spacing w:after="0" w:line="250" w:lineRule="auto"/>
-              <w:rPr>
-                <w:rFonts w:ascii="Times New Roman" w:hAnsi="Times New Roman" w:cs="Times New Roman"/>
-              </w:rPr>
-            </w:pPr>
-            <w:r>
-              <w:rPr>
-                <w:rFonts w:ascii="Times New Roman" w:hAnsi="Times New Roman" w:cs="Times New Roman"/>
-              </w:rPr>
-              <w:t>Requirements</w:t>
-            </w:r>
-          </w:p>
-        </w:tc>
-        <w:tc>
-          <w:tcPr>
-            <w:tcW w:w="3888" w:type="dxa"/>
-          </w:tcPr>
-          <w:p>
-            <w:pPr>
-              <w:spacing w:after="0" w:line="250" w:lineRule="auto"/>
-              <w:rPr>
-                <w:rFonts w:ascii="Times New Roman" w:hAnsi="Times New Roman" w:cs="Times New Roman"/>
-              </w:rPr>
-            </w:pPr>
-            <w:r>
-              <w:rPr>
-                <w:rFonts w:ascii="Times New Roman" w:hAnsi="Times New Roman" w:cs="Times New Roman"/>
-              </w:rPr>
-              <w:t>Named requirements and acceptance criteria</w:t>
-            </w:r>
-          </w:p>
-        </w:tc>
-        <w:tc>
-          <w:tcPr>
-            <w:tcW w:w="4320" w:type="dxa"/>
-          </w:tcPr>
-          <w:p>
-            <w:pPr>
-              <w:spacing w:after="0" w:line="250" w:lineRule="auto"/>
-              <w:rPr>
-                <w:rFonts w:ascii="Times New Roman" w:hAnsi="Times New Roman" w:cs="Times New Roman"/>
-              </w:rPr>
-            </w:pPr>
-            <w:r>
-              <w:rPr>
-                <w:rFonts w:ascii="Times New Roman" w:hAnsi="Times New Roman" w:cs="Times New Roman"/>
-              </w:rPr>
-              <w:t>Execution records and evidence-driven changes</w:t>
-            </w:r>
-          </w:p>
-        </w:tc>
-      </w:tr>
-      <w:tr>
-        <w:trPr>
-          <w:cantSplit/>
-        </w:trPr>
-        <w:tc>
-          <w:tcPr>
-            <w:tcW w:w="2016" w:type="dxa"/>
-          </w:tcPr>
-          <w:p>
-            <w:pPr>
-              <w:spacing w:after="0" w:line="250" w:lineRule="auto"/>
-              <w:rPr>
-                <w:rFonts w:ascii="Times New Roman" w:hAnsi="Times New Roman" w:cs="Times New Roman"/>
-              </w:rPr>
-            </w:pPr>
-            <w:r>
-              <w:rPr>
-                <w:rFonts w:ascii="Times New Roman" w:hAnsi="Times New Roman" w:cs="Times New Roman"/>
-              </w:rPr>
-              <w:t>Architecture</w:t>
-            </w:r>
-          </w:p>
-        </w:tc>
-        <w:tc>
-          <w:tcPr>
-            <w:tcW w:w="3888" w:type="dxa"/>
-          </w:tcPr>
-          <w:p>
-            <w:pPr>
-              <w:spacing w:after="0" w:line="250" w:lineRule="auto"/>
-              <w:rPr>
-                <w:rFonts w:ascii="Times New Roman" w:hAnsi="Times New Roman" w:cs="Times New Roman"/>
-              </w:rPr>
-            </w:pPr>
-            <w:r>
-              <w:rPr>
-                <w:rFonts w:ascii="Times New Roman" w:hAnsi="Times New Roman" w:cs="Times New Roman"/>
-              </w:rPr>
-              <w:t>Context, use case, component, ERD, activity and sequence views</w:t>
-            </w:r>
-          </w:p>
-        </w:tc>
-        <w:tc>
-          <w:tcPr>
-            <w:tcW w:w="4320" w:type="dxa"/>
-          </w:tcPr>
-          <w:p>
-            <w:pPr>
-              <w:spacing w:after="0" w:line="250" w:lineRule="auto"/>
-              <w:rPr>
-                <w:rFonts w:ascii="Times New Roman" w:hAnsi="Times New Roman" w:cs="Times New Roman"/>
-              </w:rPr>
-            </w:pPr>
-            <w:r>
-              <w:rPr>
-                <w:rFonts w:ascii="Times New Roman" w:hAnsi="Times New Roman" w:cs="Times New Roman"/>
-              </w:rPr>
-              <w:t>Independent team review</w:t>
-            </w:r>
-          </w:p>
-        </w:tc>
-      </w:tr>
-      <w:tr>
-        <w:trPr>
-          <w:cantSplit/>
-        </w:trPr>
-        <w:tc>
-          <w:tcPr>
-            <w:tcW w:w="2016" w:type="dxa"/>
-          </w:tcPr>
-          <w:p>
-            <w:pPr>
-              <w:spacing w:after="0" w:line="250" w:lineRule="auto"/>
-              <w:rPr>
-                <w:rFonts w:ascii="Times New Roman" w:hAnsi="Times New Roman" w:cs="Times New Roman"/>
-              </w:rPr>
-            </w:pPr>
-            <w:r>
-              <w:rPr>
-                <w:rFonts w:ascii="Times New Roman" w:hAnsi="Times New Roman" w:cs="Times New Roman"/>
-              </w:rPr>
-              <w:t>UX and prototype</w:t>
-            </w:r>
-          </w:p>
-        </w:tc>
-        <w:tc>
-          <w:tcPr>
-            <w:tcW w:w="3888" w:type="dxa"/>
-          </w:tcPr>
-          <w:p>
-            <w:pPr>
-              <w:spacing w:after="0" w:line="250" w:lineRule="auto"/>
-              <w:rPr>
-                <w:rFonts w:ascii="Times New Roman" w:hAnsi="Times New Roman" w:cs="Times New Roman"/>
-              </w:rPr>
-            </w:pPr>
-            <w:r>
-              <w:rPr>
-                <w:rFonts w:ascii="Times New Roman" w:hAnsi="Times New Roman" w:cs="Times New Roman"/>
-              </w:rPr>
-              <w:t>Existing Vue and Go implementation and walkthrough</w:t>
-            </w:r>
-          </w:p>
-        </w:tc>
-        <w:tc>
-          <w:tcPr>
-            <w:tcW w:w="4320" w:type="dxa"/>
-          </w:tcPr>
-          <w:p>
-            <w:pPr>
-              <w:spacing w:after="0" w:line="250" w:lineRule="auto"/>
-              <w:rPr>
-                <w:rFonts w:ascii="Times New Roman" w:hAnsi="Times New Roman" w:cs="Times New Roman"/>
-              </w:rPr>
-            </w:pPr>
-            <w:r>
-              <w:rPr>
-                <w:rFonts w:ascii="Times New Roman" w:hAnsi="Times New Roman" w:cs="Times New Roman"/>
-              </w:rPr>
-              <w:t>Dated browser demonstration</w:t>
-            </w:r>
-          </w:p>
-        </w:tc>
-      </w:tr>
-      <w:tr>
-        <w:trPr>
-          <w:cantSplit/>
-        </w:trPr>
-        <w:tc>
-          <w:tcPr>
-            <w:tcW w:w="2016" w:type="dxa"/>
-          </w:tcPr>
-          <w:p>
-            <w:pPr>
-              <w:spacing w:after="0" w:line="250" w:lineRule="auto"/>
-              <w:rPr>
-                <w:rFonts w:ascii="Times New Roman" w:hAnsi="Times New Roman" w:cs="Times New Roman"/>
-              </w:rPr>
-            </w:pPr>
-            <w:r>
-              <w:rPr>
-                <w:rFonts w:ascii="Times New Roman" w:hAnsi="Times New Roman" w:cs="Times New Roman"/>
-              </w:rPr>
-              <w:t>Evaluation</w:t>
-            </w:r>
-          </w:p>
-        </w:tc>
-        <w:tc>
-          <w:tcPr>
-            <w:tcW w:w="3888" w:type="dxa"/>
-          </w:tcPr>
-          <w:p>
-            <w:pPr>
-              <w:spacing w:after="0" w:line="250" w:lineRule="auto"/>
-              <w:rPr>
-                <w:rFonts w:ascii="Times New Roman" w:hAnsi="Times New Roman" w:cs="Times New Roman"/>
-              </w:rPr>
-            </w:pPr>
-            <w:r>
-              <w:rPr>
-                <w:rFonts w:ascii="Times New Roman" w:hAnsi="Times New Roman" w:cs="Times New Roman"/>
-              </w:rPr>
-              <w:t>Manual comparison, rubric, measures and bias controls</w:t>
-            </w:r>
-          </w:p>
-        </w:tc>
-        <w:tc>
-          <w:tcPr>
-            <w:tcW w:w="4320" w:type="dxa"/>
-          </w:tcPr>
-          <w:p>
-            <w:pPr>
-              <w:spacing w:after="0" w:line="250" w:lineRule="auto"/>
-              <w:rPr>
-                <w:rFonts w:ascii="Times New Roman" w:hAnsi="Times New Roman" w:cs="Times New Roman"/>
-              </w:rPr>
-            </w:pPr>
-            <w:r>
-              <w:rPr>
-                <w:rFonts w:ascii="Times New Roman" w:hAnsi="Times New Roman" w:cs="Times New Roman"/>
-              </w:rPr>
-              <w:t>Recruitment and later study execution</w:t>
-            </w:r>
-          </w:p>
-        </w:tc>
-      </w:tr>
-      <w:tr>
-        <w:trPr>
-          <w:cantSplit/>
-        </w:trPr>
-        <w:tc>
-          <w:tcPr>
-            <w:tcW w:w="2016" w:type="dxa"/>
-          </w:tcPr>
-          <w:p>
-            <w:pPr>
-              <w:spacing w:after="0" w:line="250" w:lineRule="auto"/>
-              <w:rPr>
-                <w:rFonts w:ascii="Times New Roman" w:hAnsi="Times New Roman" w:cs="Times New Roman"/>
-              </w:rPr>
-            </w:pPr>
-            <w:r>
-              <w:rPr>
-                <w:rFonts w:ascii="Times New Roman" w:hAnsi="Times New Roman" w:cs="Times New Roman"/>
-              </w:rPr>
-              <w:t>Management</w:t>
-            </w:r>
-          </w:p>
-        </w:tc>
-        <w:tc>
-          <w:tcPr>
-            <w:tcW w:w="3888" w:type="dxa"/>
-          </w:tcPr>
-          <w:p>
-            <w:pPr>
-              <w:spacing w:after="0" w:line="250" w:lineRule="auto"/>
-              <w:rPr>
-                <w:rFonts w:ascii="Times New Roman" w:hAnsi="Times New Roman" w:cs="Times New Roman"/>
-              </w:rPr>
-            </w:pPr>
-            <w:r>
-              <w:rPr>
-                <w:rFonts w:ascii="Times New Roman" w:hAnsi="Times New Roman" w:cs="Times New Roman"/>
-              </w:rPr>
-              <w:t xml:space="preserve">Contribution summary and live </w:t>
-            </w:r>
-            <w:proofErr w:type="spellStart"/>
-            <w:r>
-              <w:rPr>
-                <w:rFonts w:ascii="Times New Roman" w:hAnsi="Times New Roman" w:cs="Times New Roman"/>
-              </w:rPr>
-              <w:t>YouTrack</w:t>
-            </w:r>
-            <w:proofErr w:type="spellEnd"/>
-            <w:r>
-              <w:rPr>
-                <w:rFonts w:ascii="Times New Roman" w:hAnsi="Times New Roman" w:cs="Times New Roman"/>
-              </w:rPr>
-              <w:t xml:space="preserve"> project</w:t>
-            </w:r>
-          </w:p>
-        </w:tc>
-        <w:tc>
-          <w:tcPr>
-            <w:tcW w:w="4320" w:type="dxa"/>
-          </w:tcPr>
-          <w:p>
-            <w:pPr>
-              <w:spacing w:after="0" w:line="250" w:lineRule="auto"/>
-              <w:rPr>
-                <w:rFonts w:ascii="Times New Roman" w:hAnsi="Times New Roman" w:cs="Times New Roman"/>
-              </w:rPr>
-            </w:pPr>
-            <w:r>
-              <w:rPr>
-                <w:rFonts w:ascii="Times New Roman" w:hAnsi="Times New Roman" w:cs="Times New Roman"/>
-              </w:rPr>
-              <w:t>Member accounts, linked reviews and submission tag</w:t>
-            </w:r>
-          </w:p>
-        </w:tc>
-      </w:tr>
-      <w:tr>
-        <w:trPr>
-          <w:cantSplit/>
-        </w:trPr>
-        <w:tc>
-          <w:tcPr>
-            <w:tcW w:w="2016" w:type="dxa"/>
-          </w:tcPr>
-          <w:p>
-            <w:pPr>
-              <w:spacing w:after="0" w:line="250" w:lineRule="auto"/>
-              <w:rPr>
-                <w:rFonts w:ascii="Times New Roman" w:hAnsi="Times New Roman" w:cs="Times New Roman"/>
-              </w:rPr>
-            </w:pPr>
-            <w:r>
-              <w:rPr>
-                <w:rFonts w:ascii="Times New Roman" w:hAnsi="Times New Roman" w:cs="Times New Roman"/>
-              </w:rPr>
-              <w:t>Supervision</w:t>
-            </w:r>
-          </w:p>
-        </w:tc>
-        <w:tc>
-          <w:tcPr>
-            <w:tcW w:w="3888" w:type="dxa"/>
-          </w:tcPr>
-          <w:p>
-            <w:pPr>
-              <w:spacing w:after="0" w:line="250" w:lineRule="auto"/>
-              <w:rPr>
-                <w:rFonts w:ascii="Times New Roman" w:hAnsi="Times New Roman" w:cs="Times New Roman"/>
-              </w:rPr>
-            </w:pPr>
-            <w:r>
-              <w:rPr>
-                <w:rFonts w:ascii="Times New Roman" w:hAnsi="Times New Roman" w:cs="Times New Roman"/>
-              </w:rPr>
-              <w:t>Written approval and mapped revisions</w:t>
-            </w:r>
-          </w:p>
-        </w:tc>
-        <w:tc>
-          <w:tcPr>
-            <w:tcW w:w="4320" w:type="dxa"/>
-          </w:tcPr>
-          <w:p>
-            <w:pPr>
-              <w:spacing w:after="0" w:line="250" w:lineRule="auto"/>
-              <w:rPr>
-                <w:rFonts w:ascii="Times New Roman" w:hAnsi="Times New Roman" w:cs="Times New Roman"/>
-              </w:rPr>
-            </w:pPr>
-            <w:r>
-              <w:rPr>
-                <w:rFonts w:ascii="Times New Roman" w:hAnsi="Times New Roman" w:cs="Times New Roman"/>
-              </w:rPr>
-              <w:t>Follow-up meeting and signed form procedure</w:t>
-            </w:r>
-          </w:p>
-        </w:tc>
-      </w:tr>
-    </w:tbl>
-    <w:p>
-      <w:pPr>
-        <w:spacing w:after="20" w:line="240" w:lineRule="auto"/>
-        <w:rPr>
-          <w:rFonts w:ascii="Times New Roman" w:hAnsi="Times New Roman" w:cs="Times New Roman"/>
-        </w:rPr>
-      </w:pPr>
-    </w:p>
-    <w:p>
-      <w:pPr>
-        <w:rPr>
-          <w:rFonts w:ascii="Times New Roman" w:hAnsi="Times New Roman" w:cs="Times New Roman"/>
-        </w:rPr>
-      </w:pPr>
-      <w:r>
-        <w:rPr>
-          <w:rFonts w:ascii="Times New Roman" w:hAnsi="Times New Roman" w:cs="Times New Roman"/>
-        </w:rPr>
-        <w:t>This revision addresses the supervisor's recommendations in the written proposal. Human review, field evidence, member account setup, and experiments retain their actual status. The accompanying CRITERIA_CHECKLIST.md maps all eleven components and Git requirements to evidence and remaining actions. The team should state these boundaries clearly while presenting the implemented prototype and the rationale for its design.</w:t>
-      </w:r>
-    </w:p>
-    <w:p>
-      <w:pPr>
-        <w:pStyle w:val="1"/>
+        <w:t>References</w:t>
+      </w:r>
+      <w:bookmarkEnd w:id="512"/>
+    </w:p>
+    <w:p>
+      <w:pPr>
+        <w:rPr>
+          <w:rFonts w:ascii="Times New Roman" w:hAnsi="Times New Roman" w:cs="Times New Roman"/>
+        </w:rPr>
+      </w:pPr>
+      <w:r>
+        <w:rPr>
+          <w:rFonts w:ascii="Times New Roman" w:hAnsi="Times New Roman" w:cs="Times New Roman"/>
+        </w:rPr>
+        <w:t>Scientific publications [1–8] form the core literature review. Product and technical sources [9–17] support the comparisons and implementation choices. Product and technical sources were reviewed on 11 October 2026; the four central research papers were revisited on 19 October for this revision. Titles are retained to make source verification straightforward.</w:t>
+      </w:r>
+    </w:p>
+    <w:p>
+      <w:pPr>
+        <w:rPr>
+          <w:rFonts w:ascii="Times New Roman" w:hAnsi="Times New Roman" w:cs="Times New Roman"/>
+        </w:rPr>
+      </w:pPr>
+      <w:r>
+        <w:t xml:space="preserve">[1] Norheim, J. J., Rebentisch, E., Xiao, D., Draeger, L., Kerbrat, A., and de Weck, O. L. (2024). Challenges in applying large language models to requirements engineering tasks. Design Science, 10, e16. </w:t>
+      </w:r>
+      <w:hyperlink r:id="rId34">
+        <w:r>
+          <w:rPr>
+            <w:color w:val="174D8C"/>
+            <w:u w:val="single"/>
+          </w:rPr>
+          <w:t>https://doi.org/10.1017/dsj.2024.8</w:t>
+        </w:r>
+      </w:hyperlink>
+    </w:p>
+    <w:p>
+      <w:pPr>
+        <w:rPr>
+          <w:rFonts w:ascii="Times New Roman" w:hAnsi="Times New Roman" w:cs="Times New Roman"/>
+        </w:rPr>
+      </w:pPr>
+      <w:r>
+        <w:t xml:space="preserve">[2] Hemmat, A., Sharbaf, M., Kolahdouz-Rahimi, S., Lano, K., and Tehrani, S. Y. (2025). Research directions for using LLM in software requirement engineering: a systematic review. Frontiers in Computer Science, 7, 1519437. </w:t>
+      </w:r>
+      <w:hyperlink r:id="rId35">
+        <w:r>
+          <w:rPr>
+            <w:color w:val="174D8C"/>
+            <w:u w:val="single"/>
+          </w:rPr>
+          <w:t>https://doi.org/10.3389/fcomp.2025.1519437</w:t>
+        </w:r>
+      </w:hyperlink>
+    </w:p>
+    <w:p>
+      <w:pPr>
+        <w:rPr>
+          <w:rFonts w:ascii="Times New Roman" w:hAnsi="Times New Roman" w:cs="Times New Roman"/>
+        </w:rPr>
+      </w:pPr>
+      <w:r>
+        <w:t xml:space="preserve">[3] Ebrahim, M., Guirguis, S., and Basta, C. (2025). Enhancing Software Requirements Engineering with Language Models and Prompting Techniques: Insights from the Current Research and Future Directions. Proceedings of the 63rd Annual Meeting of the Association for Computational Linguistics, Student Research Workshop, 486–496. </w:t>
+      </w:r>
+      <w:hyperlink r:id="rId36">
+        <w:r>
+          <w:rPr>
+            <w:color w:val="174D8C"/>
+            <w:u w:val="single"/>
+          </w:rPr>
+          <w:t>https://aclanthology.org/2025.acl-srw.31/</w:t>
+        </w:r>
+      </w:hyperlink>
+    </w:p>
+    <w:p>
+      <w:pPr>
+        <w:rPr>
+          <w:rFonts w:ascii="Times New Roman" w:hAnsi="Times New Roman" w:cs="Times New Roman"/>
+        </w:rPr>
+      </w:pPr>
+      <w:r>
+        <w:t xml:space="preserve">[4] Luitel, D., Hassani, S., and Sabetzadeh, M. (2024). Improving requirements completeness: automated assistance through large language models. Requirements Engineering, 29, 73–95. </w:t>
+      </w:r>
+      <w:hyperlink r:id="rId37">
+        <w:r>
+          <w:rPr>
+            <w:color w:val="174D8C"/>
+            <w:u w:val="single"/>
+          </w:rPr>
+          <w:t>https://doi.org/10.1007/s00766-024-00416-3</w:t>
+        </w:r>
+      </w:hyperlink>
+    </w:p>
+    <w:p>
+      <w:pPr>
+        <w:rPr>
+          <w:rFonts w:ascii="Times New Roman" w:hAnsi="Times New Roman" w:cs="Times New Roman"/>
+        </w:rPr>
+      </w:pPr>
+      <w:r>
+        <w:t xml:space="preserve">[5] Ji, Z., et al. (2023). Survey of Hallucination in Natural Language Generation. ACM Computing Surveys, 55(12). </w:t>
+      </w:r>
+      <w:hyperlink r:id="rId38">
+        <w:r>
+          <w:rPr>
+            <w:color w:val="174D8C"/>
+            <w:u w:val="single"/>
+          </w:rPr>
+          <w:t>https://doi.org/10.1145/3571730</w:t>
+        </w:r>
+      </w:hyperlink>
+      <w:r>
+        <w:t xml:space="preserve"> . Author manuscript: </w:t>
+      </w:r>
+      <w:hyperlink r:id="rId39">
+        <w:r>
+          <w:rPr>
+            <w:color w:val="174D8C"/>
+            <w:u w:val="single"/>
+          </w:rPr>
+          <w:t>https://arxiv.org/abs/2202.03629</w:t>
+        </w:r>
+      </w:hyperlink>
+    </w:p>
+    <w:p>
+      <w:pPr>
+        <w:rPr>
+          <w:rFonts w:ascii="Times New Roman" w:hAnsi="Times New Roman" w:cs="Times New Roman"/>
+        </w:rPr>
+      </w:pPr>
+      <w:r>
+        <w:t xml:space="preserve">[6] Lin, S., Hilton, J., and Evans, O. (2022). TruthfulQA: Measuring How Models Mimic Human Falsehoods. Proceedings of the 60th Annual Meeting of the Association for Computational Linguistics, Volume 1, 3214–3252. </w:t>
+      </w:r>
+      <w:hyperlink r:id="rId40">
+        <w:r>
+          <w:rPr>
+            <w:color w:val="174D8C"/>
+            <w:u w:val="single"/>
+          </w:rPr>
+          <w:t>https://aclanthology.org/2022.acl-long.229/</w:t>
+        </w:r>
+      </w:hyperlink>
+    </w:p>
+    <w:p>
+      <w:pPr>
+        <w:rPr>
+          <w:rFonts w:ascii="Times New Roman" w:hAnsi="Times New Roman" w:cs="Times New Roman"/>
+        </w:rPr>
+      </w:pPr>
+      <w:r>
+        <w:t xml:space="preserve">[7] Radford, A., Kim, J. W., Xu, T., Brockman, G., McLeavey, C., and Sutskever, I. (2023). Robust Speech Recognition via Large-Scale Weak Supervision. Proceedings of Machine Learning Research, 202, 28492–28518. </w:t>
+      </w:r>
+      <w:hyperlink r:id="rId41">
+        <w:r>
+          <w:rPr>
+            <w:color w:val="174D8C"/>
+            <w:u w:val="single"/>
+          </w:rPr>
+          <w:t>https://proceedings.mlr.press/v202/radford23a.html</w:t>
+        </w:r>
+      </w:hyperlink>
+    </w:p>
+    <w:p>
+      <w:pPr>
+        <w:rPr>
+          <w:rFonts w:ascii="Times New Roman" w:hAnsi="Times New Roman" w:cs="Times New Roman"/>
+        </w:rPr>
+      </w:pPr>
+      <w:r>
+        <w:t xml:space="preserve">[8] Amershi, S., et al. (2019). Guidelines for Human-AI Interaction. Proceedings of CHI 2019. </w:t>
+      </w:r>
+      <w:hyperlink r:id="rId42">
+        <w:r>
+          <w:rPr>
+            <w:color w:val="174D8C"/>
+            <w:u w:val="single"/>
+          </w:rPr>
+          <w:t>https://www.microsoft.com/en-us/research/publication/guidelines-for-human-ai-interaction/</w:t>
+        </w:r>
+      </w:hyperlink>
+    </w:p>
+    <w:p>
+      <w:pPr>
+        <w:pStyle w:val="21"/>
         <w:pageBreakBefore/>
         <w:rPr>
           <w:rFonts w:ascii="Times New Roman" w:hAnsi="Times New Roman" w:cs="Times New Roman"/>
@@ -11771,218 +12448,199 @@
       <w:r>
         <w:rPr>
           <w:rFonts w:ascii="Times New Roman" w:hAnsi="Times New Roman" w:cs="Times New Roman"/>
+          <w:color w:val="000000"/>
           <w:sz w:val="22"/>
           <w:szCs w:val="22"/>
         </w:rPr>
-        <w:lastRenderedPageBreak/>
-        <w:t>References</w:t>
-      </w:r>
-    </w:p>
-    <w:p>
-      <w:pPr>
-        <w:rPr>
-          <w:rFonts w:ascii="Times New Roman" w:hAnsi="Times New Roman" w:cs="Times New Roman"/>
-        </w:rPr>
-      </w:pPr>
-      <w:r>
-        <w:rPr>
-          <w:rFonts w:ascii="Times New Roman" w:hAnsi="Times New Roman" w:cs="Times New Roman"/>
-        </w:rPr>
-        <w:t>Scientific publications [1–8] form the core literature review. Product and technical sources [9–17] support the comparisons and implementation choices. Product and technical sources were reviewed on 11 October 2026; the four central research papers were revisited on 19 October for this revision. Titles are retained to make source verification straightforward.</w:t>
-      </w:r>
-    </w:p>
-    <w:p>
-      <w:pPr>
-        <w:rPr>
-          <w:rFonts w:ascii="Times New Roman" w:hAnsi="Times New Roman" w:cs="Times New Roman"/>
-        </w:rPr>
-      </w:pPr>
-      <w:r>
-        <w:rPr>
-          <w:rFonts w:ascii="Times New Roman" w:hAnsi="Times New Roman" w:cs="Times New Roman"/>
-        </w:rPr>
-        <w:t xml:space="preserve">[1] Norheim, J. J., Rebentisch, E., Xiao, D., Draeger, L., </w:t>
-      </w:r>
-      <w:proofErr w:type="spellStart"/>
-      <w:r>
-        <w:rPr>
-          <w:rFonts w:ascii="Times New Roman" w:hAnsi="Times New Roman" w:cs="Times New Roman"/>
-        </w:rPr>
-        <w:t>Kerbrat</w:t>
-      </w:r>
-      <w:proofErr w:type="spellEnd"/>
-      <w:r>
-        <w:rPr>
-          <w:rFonts w:ascii="Times New Roman" w:hAnsi="Times New Roman" w:cs="Times New Roman"/>
-        </w:rPr>
-        <w:t>, A., and de Weck, O. L. (2024). Challenges in applying large language models to requirements engineering tasks. Design Science, 10, e16. https://doi.org/10.1017/dsj.2024.8</w:t>
-      </w:r>
-    </w:p>
-    <w:p>
-      <w:pPr>
-        <w:rPr>
-          <w:rFonts w:ascii="Times New Roman" w:hAnsi="Times New Roman" w:cs="Times New Roman"/>
-        </w:rPr>
-      </w:pPr>
-      <w:r>
-        <w:rPr>
-          <w:rFonts w:ascii="Times New Roman" w:hAnsi="Times New Roman" w:cs="Times New Roman"/>
-        </w:rPr>
-        <w:t xml:space="preserve">[2] Hemmat, A., </w:t>
-      </w:r>
-      <w:proofErr w:type="spellStart"/>
-      <w:r>
-        <w:rPr>
-          <w:rFonts w:ascii="Times New Roman" w:hAnsi="Times New Roman" w:cs="Times New Roman"/>
-        </w:rPr>
-        <w:t>Sharbaf</w:t>
-      </w:r>
-      <w:proofErr w:type="spellEnd"/>
-      <w:r>
-        <w:rPr>
-          <w:rFonts w:ascii="Times New Roman" w:hAnsi="Times New Roman" w:cs="Times New Roman"/>
-        </w:rPr>
-        <w:t>, M., Kolahdouz-Rahimi, S., Lano, K., and Tehrani, S. Y. (2025). Research directions for using LLM in software requirement engineering: a systematic review. Frontiers in Computer Science, 7, 1519437. https://doi.org/10.3389/fcomp.2025.1519437</w:t>
-      </w:r>
-    </w:p>
-    <w:p>
-      <w:pPr>
-        <w:rPr>
-          <w:rFonts w:ascii="Times New Roman" w:hAnsi="Times New Roman" w:cs="Times New Roman"/>
-        </w:rPr>
-      </w:pPr>
-      <w:r>
-        <w:rPr>
-          <w:rFonts w:ascii="Times New Roman" w:hAnsi="Times New Roman" w:cs="Times New Roman"/>
-        </w:rPr>
-        <w:t>[3] Ebrahim, M., Guirguis, S., and Basta, C. (2025). Enhancing Software Requirements Engineering with Language Models and Prompting Techniques: Insights from the Current Research and Future Directions. Proceedings of the 63rd Annual Meeting of the Association for Computational Linguistics, Student Research Workshop, 486–496. https://aclanthology.org/2025.acl-srw.31/</w:t>
-      </w:r>
-    </w:p>
-    <w:p>
-      <w:pPr>
-        <w:rPr>
-          <w:rFonts w:ascii="Times New Roman" w:hAnsi="Times New Roman" w:cs="Times New Roman"/>
-        </w:rPr>
-      </w:pPr>
-      <w:r>
-        <w:rPr>
-          <w:rFonts w:ascii="Times New Roman" w:hAnsi="Times New Roman" w:cs="Times New Roman"/>
-        </w:rPr>
-        <w:t xml:space="preserve">[4] Luitel, D., Hassani, S., and </w:t>
-      </w:r>
-      <w:proofErr w:type="spellStart"/>
-      <w:r>
-        <w:rPr>
-          <w:rFonts w:ascii="Times New Roman" w:hAnsi="Times New Roman" w:cs="Times New Roman"/>
-        </w:rPr>
-        <w:t>Sabetzadeh</w:t>
-      </w:r>
-      <w:proofErr w:type="spellEnd"/>
-      <w:r>
-        <w:rPr>
-          <w:rFonts w:ascii="Times New Roman" w:hAnsi="Times New Roman" w:cs="Times New Roman"/>
-        </w:rPr>
-        <w:t>, M. (2024). Improving requirements completeness: automated assistance through large language models. Requirements Engineering, 29, 73–95. https://doi.org/10.1007/s00766-024-00416-3</w:t>
-      </w:r>
-    </w:p>
-    <w:p>
-      <w:pPr>
-        <w:rPr>
-          <w:rFonts w:ascii="Times New Roman" w:hAnsi="Times New Roman" w:cs="Times New Roman"/>
-        </w:rPr>
-      </w:pPr>
-      <w:r>
-        <w:rPr>
-          <w:rFonts w:ascii="Times New Roman" w:hAnsi="Times New Roman" w:cs="Times New Roman"/>
-        </w:rPr>
-        <w:t>[5] Ji, Z., et al. (2023). Survey of Hallucination in Natural Language Generation. ACM Computing Surveys, 55(12). https://doi.org/10.1145/3571730 . Author manuscript: https://arxiv.org/abs/2202.03629</w:t>
-      </w:r>
-    </w:p>
-    <w:p>
-      <w:pPr>
-        <w:rPr>
-          <w:rFonts w:ascii="Times New Roman" w:hAnsi="Times New Roman" w:cs="Times New Roman"/>
-        </w:rPr>
-      </w:pPr>
-      <w:r>
-        <w:rPr>
-          <w:rFonts w:ascii="Times New Roman" w:hAnsi="Times New Roman" w:cs="Times New Roman"/>
-        </w:rPr>
-        <w:t xml:space="preserve">[6] Lin, S., Hilton, J., and Evans, O. (2022). </w:t>
-      </w:r>
-      <w:proofErr w:type="spellStart"/>
-      <w:r>
-        <w:rPr>
-          <w:rFonts w:ascii="Times New Roman" w:hAnsi="Times New Roman" w:cs="Times New Roman"/>
-        </w:rPr>
-        <w:t>TruthfulQA</w:t>
-      </w:r>
-      <w:proofErr w:type="spellEnd"/>
-      <w:r>
-        <w:rPr>
-          <w:rFonts w:ascii="Times New Roman" w:hAnsi="Times New Roman" w:cs="Times New Roman"/>
-        </w:rPr>
-        <w:t>: Measuring How Models Mimic Human Falsehoods. Proceedings of the 60th Annual Meeting of the Association for Computational Linguistics, Volume 1, 3214–3252. https://aclanthology.org/2022.acl-long.229/</w:t>
-      </w:r>
-    </w:p>
-    <w:p>
-      <w:pPr>
-        <w:rPr>
-          <w:rFonts w:ascii="Times New Roman" w:hAnsi="Times New Roman" w:cs="Times New Roman"/>
-        </w:rPr>
-      </w:pPr>
-      <w:r>
-        <w:rPr>
-          <w:rFonts w:ascii="Times New Roman" w:hAnsi="Times New Roman" w:cs="Times New Roman"/>
-        </w:rPr>
-        <w:t xml:space="preserve">[7] Radford, A., Kim, J. W., Xu, T., Brockman, G., McLeavey, C., and </w:t>
-      </w:r>
-      <w:proofErr w:type="spellStart"/>
-      <w:r>
-        <w:rPr>
-          <w:rFonts w:ascii="Times New Roman" w:hAnsi="Times New Roman" w:cs="Times New Roman"/>
-        </w:rPr>
-        <w:t>Sutskever</w:t>
-      </w:r>
-      <w:proofErr w:type="spellEnd"/>
-      <w:r>
-        <w:rPr>
-          <w:rFonts w:ascii="Times New Roman" w:hAnsi="Times New Roman" w:cs="Times New Roman"/>
-        </w:rPr>
-        <w:t>, I. (2023). Robust Speech Recognition via Large-Scale Weak Supervision. Proceedings of Machine Learning Research, 202, 28492–28518. https://proceedings.mlr.press/v202/radford23a.html</w:t>
-      </w:r>
-    </w:p>
-    <w:p>
-      <w:pPr>
-        <w:rPr>
-          <w:rFonts w:ascii="Times New Roman" w:hAnsi="Times New Roman" w:cs="Times New Roman"/>
-        </w:rPr>
-      </w:pPr>
-      <w:r>
-        <w:rPr>
-          <w:rFonts w:ascii="Times New Roman" w:hAnsi="Times New Roman" w:cs="Times New Roman"/>
-        </w:rPr>
-        <w:t xml:space="preserve">[8] </w:t>
-      </w:r>
-      <w:proofErr w:type="spellStart"/>
-      <w:r>
-        <w:rPr>
-          <w:rFonts w:ascii="Times New Roman" w:hAnsi="Times New Roman" w:cs="Times New Roman"/>
-        </w:rPr>
-        <w:t>Amershi</w:t>
-      </w:r>
-      <w:proofErr w:type="spellEnd"/>
-      <w:r>
-        <w:rPr>
-          <w:rFonts w:ascii="Times New Roman" w:hAnsi="Times New Roman" w:cs="Times New Roman"/>
-        </w:rPr>
-        <w:t>, S., et al. (2019). Guidelines for Human-AI Interaction. Proceedings of CHI 2019. https://www.microsoft.com/en-us/research/publication/guidelines-for-human-ai-interaction/</w:t>
-      </w:r>
-    </w:p>
-    <w:p>
-      <w:pPr>
-        <w:pStyle w:val="1"/>
-        <w:pageBreakBefore/>
+        <w:t>References continued</w:t>
+      </w:r>
+    </w:p>
+    <w:p>
+      <w:pPr>
+        <w:rPr>
+          <w:rFonts w:ascii="Times New Roman" w:hAnsi="Times New Roman" w:cs="Times New Roman"/>
+        </w:rPr>
+      </w:pPr>
+      <w:r>
+        <w:t xml:space="preserve">[9] Upwork. Uma, Upwork's Mindful AI. Product documentation and availability statements. </w:t>
+      </w:r>
+      <w:hyperlink r:id="rId43">
+        <w:r>
+          <w:rPr>
+            <w:color w:val="174D8C"/>
+            <w:u w:val="single"/>
+          </w:rPr>
+          <w:t>https://www.upwork.com/uma/</w:t>
+        </w:r>
+      </w:hyperlink>
+    </w:p>
+    <w:p>
+      <w:pPr>
+        <w:rPr>
+          <w:rFonts w:ascii="Times New Roman" w:hAnsi="Times New Roman" w:cs="Times New Roman"/>
+        </w:rPr>
+      </w:pPr>
+      <w:r>
+        <w:t xml:space="preserve">[10] Fiverr Help Center. Post a project brief, get tailored offers for your project. </w:t>
+      </w:r>
+      <w:hyperlink r:id="rId44">
+        <w:r>
+          <w:rPr>
+            <w:color w:val="174D8C"/>
+            <w:u w:val="single"/>
+          </w:rPr>
+          <w:t>https://help.fiverr.com/hc/en-us/articles/37552341279633-Post-a-project-brief-get-tailored-offers-for-your-project</w:t>
+        </w:r>
+      </w:hyperlink>
+    </w:p>
+    <w:p>
+      <w:pPr>
+        <w:rPr>
+          <w:rFonts w:ascii="Times New Roman" w:hAnsi="Times New Roman" w:cs="Times New Roman"/>
+        </w:rPr>
+      </w:pPr>
+      <w:r>
+        <w:t xml:space="preserve">[11] Riipen Help Center. How employers use Riipen. </w:t>
+      </w:r>
+      <w:hyperlink r:id="rId45">
+        <w:r>
+          <w:rPr>
+            <w:color w:val="174D8C"/>
+            <w:u w:val="single"/>
+          </w:rPr>
+          <w:t>https://help.riipen.com/en/articles/7321556-how-employers-use-riipen</w:t>
+        </w:r>
+      </w:hyperlink>
+    </w:p>
+    <w:p>
+      <w:pPr>
+        <w:rPr>
+          <w:rFonts w:ascii="Times New Roman" w:hAnsi="Times New Roman" w:cs="Times New Roman"/>
+        </w:rPr>
+      </w:pPr>
+      <w:r>
+        <w:t xml:space="preserve">[12] Atlassian Support. What is Jira Product Discovery? </w:t>
+      </w:r>
+      <w:hyperlink r:id="rId46">
+        <w:r>
+          <w:rPr>
+            <w:color w:val="174D8C"/>
+            <w:u w:val="single"/>
+          </w:rPr>
+          <w:t>https://support.atlassian.com/jira-product-discovery/docs/what-is-jira-product-discovery/</w:t>
+        </w:r>
+      </w:hyperlink>
+      <w:r>
+        <w:t xml:space="preserve"> . Supporting guide: </w:t>
+      </w:r>
+      <w:hyperlink r:id="rId47">
+        <w:r>
+          <w:rPr>
+            <w:color w:val="174D8C"/>
+            <w:u w:val="single"/>
+          </w:rPr>
+          <w:t>https://www.atlassian.com/software/jira/product-discovery/guides/ideas/overview</w:t>
+        </w:r>
+      </w:hyperlink>
+    </w:p>
+    <w:p>
+      <w:pPr>
+        <w:rPr>
+          <w:rFonts w:ascii="Times New Roman" w:hAnsi="Times New Roman" w:cs="Times New Roman"/>
+        </w:rPr>
+      </w:pPr>
+      <w:r>
+        <w:t xml:space="preserve">[13] Groq Documentation. Structured Outputs. </w:t>
+      </w:r>
+      <w:hyperlink r:id="rId48">
+        <w:r>
+          <w:rPr>
+            <w:color w:val="174D8C"/>
+            <w:u w:val="single"/>
+          </w:rPr>
+          <w:t>https://console.groq.com/docs/structured-outputs</w:t>
+        </w:r>
+      </w:hyperlink>
+    </w:p>
+    <w:p>
+      <w:pPr>
+        <w:rPr>
+          <w:rFonts w:ascii="Times New Roman" w:hAnsi="Times New Roman" w:cs="Times New Roman"/>
+        </w:rPr>
+      </w:pPr>
+      <w:r>
+        <w:t xml:space="preserve">[14] Groq Documentation. Speech to Text. </w:t>
+      </w:r>
+      <w:hyperlink r:id="rId49">
+        <w:r>
+          <w:rPr>
+            <w:color w:val="174D8C"/>
+            <w:u w:val="single"/>
+          </w:rPr>
+          <w:t>https://console.groq.com/docs/speech-to-text</w:t>
+        </w:r>
+      </w:hyperlink>
+    </w:p>
+    <w:p>
+      <w:pPr>
+        <w:rPr>
+          <w:rFonts w:ascii="Times New Roman" w:hAnsi="Times New Roman" w:cs="Times New Roman"/>
+        </w:rPr>
+      </w:pPr>
+      <w:r>
+        <w:t xml:space="preserve">[15] Go standard library. Package net/http. </w:t>
+      </w:r>
+      <w:hyperlink r:id="rId50">
+        <w:r>
+          <w:rPr>
+            <w:color w:val="174D8C"/>
+            <w:u w:val="single"/>
+          </w:rPr>
+          <w:t>https://pkg.go.dev/net/http</w:t>
+        </w:r>
+      </w:hyperlink>
+    </w:p>
+    <w:p>
+      <w:pPr>
+        <w:rPr>
+          <w:rFonts w:ascii="Times New Roman" w:hAnsi="Times New Roman" w:cs="Times New Roman"/>
+        </w:rPr>
+      </w:pPr>
+      <w:r>
+        <w:t xml:space="preserve">[16] PostgreSQL 16 Documentation. Transactions. </w:t>
+      </w:r>
+      <w:hyperlink r:id="rId51">
+        <w:r>
+          <w:rPr>
+            <w:color w:val="174D8C"/>
+            <w:u w:val="single"/>
+          </w:rPr>
+          <w:t>https://www.postgresql.org/docs/16/tutorial-transactions.html</w:t>
+        </w:r>
+      </w:hyperlink>
+    </w:p>
+    <w:p>
+      <w:pPr>
+        <w:rPr>
+          <w:rFonts w:ascii="Times New Roman" w:hAnsi="Times New Roman" w:cs="Times New Roman"/>
+        </w:rPr>
+      </w:pPr>
+      <w:r>
+        <w:t xml:space="preserve">[17] Vue Documentation. Quick Start. </w:t>
+      </w:r>
+      <w:hyperlink r:id="rId52">
+        <w:r>
+          <w:rPr>
+            <w:color w:val="174D8C"/>
+            <w:u w:val="single"/>
+          </w:rPr>
+          <w:t>https://vuejs.org/guide/quick-start.html</w:t>
+        </w:r>
+      </w:hyperlink>
+    </w:p>
+    <w:p>
+      <w:pPr>
+        <w:pStyle w:val="21"/>
         <w:rPr>
           <w:rFonts w:ascii="Times New Roman" w:hAnsi="Times New Roman" w:cs="Times New Roman"/>
           <w:sz w:val="22"/>
@@ -11992,268 +12650,81 @@
       <w:r>
         <w:rPr>
           <w:rFonts w:ascii="Times New Roman" w:hAnsi="Times New Roman" w:cs="Times New Roman"/>
+          <w:color w:val="000000"/>
           <w:sz w:val="22"/>
           <w:szCs w:val="22"/>
         </w:rPr>
-        <w:lastRenderedPageBreak/>
-        <w:t>References continued</w:t>
-      </w:r>
-    </w:p>
-    <w:p>
-      <w:pPr>
-        <w:rPr>
-          <w:rFonts w:ascii="Times New Roman" w:hAnsi="Times New Roman" w:cs="Times New Roman"/>
-        </w:rPr>
-      </w:pPr>
-      <w:r>
-        <w:rPr>
-          <w:rFonts w:ascii="Times New Roman" w:hAnsi="Times New Roman" w:cs="Times New Roman"/>
-        </w:rPr>
-        <w:t>[9] Upwork. Uma, Upwork's Mindful AI. Product documentation and availability statements. https://www.upwork.com/uma/</w:t>
-      </w:r>
-    </w:p>
-    <w:p>
-      <w:pPr>
-        <w:rPr>
-          <w:rFonts w:ascii="Times New Roman" w:hAnsi="Times New Roman" w:cs="Times New Roman"/>
-        </w:rPr>
-      </w:pPr>
-      <w:r>
-        <w:rPr>
-          <w:rFonts w:ascii="Times New Roman" w:hAnsi="Times New Roman" w:cs="Times New Roman"/>
-        </w:rPr>
-        <w:t>[10] Fiverr Help Center. Post a project brief, get tailored offers for your project. https://help.fiverr.com/hc/en-us/articles/37552341279633-Post-a-project-brief-get-tailored-offers-for-your-project</w:t>
-      </w:r>
-    </w:p>
-    <w:p>
-      <w:pPr>
-        <w:rPr>
-          <w:rFonts w:ascii="Times New Roman" w:hAnsi="Times New Roman" w:cs="Times New Roman"/>
-        </w:rPr>
-      </w:pPr>
-      <w:r>
-        <w:rPr>
-          <w:rFonts w:ascii="Times New Roman" w:hAnsi="Times New Roman" w:cs="Times New Roman"/>
-        </w:rPr>
-        <w:t xml:space="preserve">[11] </w:t>
+        <w:t>Repository and assignment evidence</w:t>
+      </w:r>
+    </w:p>
+    <w:p>
+      <w:pPr>
+        <w:rPr>
+          <w:rFonts w:ascii="Times New Roman" w:hAnsi="Times New Roman" w:cs="Times New Roman"/>
+        </w:rPr>
+      </w:pPr>
+      <w:r>
+        <w:t xml:space="preserve">[18] Diploma repository. </w:t>
+      </w:r>
+      <w:hyperlink r:id="rId9">
+        <w:r>
+          <w:rPr>
+            <w:color w:val="174D8C"/>
+            <w:u w:val="single"/>
+          </w:rPr>
+          <w:t>https://github.com/bekasyl00/Qadam_Diplom</w:t>
+        </w:r>
+      </w:hyperlink>
+      <w:r>
+        <w:t xml:space="preserve"> . Includes the Vue interface, Go server, task and proposal logic, AI integration, and configuration examples.</w:t>
+      </w:r>
+    </w:p>
+    <w:p>
+      <w:pPr>
+        <w:rPr>
+          <w:rFonts w:ascii="Times New Roman" w:hAnsi="Times New Roman" w:cs="Times New Roman"/>
+        </w:rPr>
+      </w:pPr>
+      <w:r>
+        <w:t xml:space="preserve">[19] Qadam repository history and submission version, checked 21 October 2026. </w:t>
+      </w:r>
+      <w:hyperlink r:id="rId53">
+        <w:r>
+          <w:rPr>
+            <w:color w:val="174D8C"/>
+            <w:u w:val="single"/>
+          </w:rPr>
+          <w:t>https://github.com/bekasyl00/Qadam_Diplom/commits/prob-period-1/</w:t>
+        </w:r>
+      </w:hyperlink>
+      <w:r>
+        <w:t xml:space="preserve"> . Authored changes support the contribution summary; they do not establish independent review or unpublished work.</w:t>
+      </w:r>
+    </w:p>
+    <w:p>
+      <w:pPr>
+        <w:rPr>
+          <w:rFonts w:ascii="Times New Roman" w:hAnsi="Times New Roman" w:cs="Times New Roman"/>
+        </w:rPr>
+      </w:pPr>
+      <w:r>
+        <w:rPr>
+          <w:rFonts w:ascii="Times New Roman" w:hAnsi="Times New Roman" w:cs="Times New Roman"/>
+        </w:rPr>
+        <w:t>[20] Supplied assignment “</w:t>
       </w:r>
       <w:proofErr w:type="spellStart"/>
       <w:r>
         <w:rPr>
           <w:rFonts w:ascii="Times New Roman" w:hAnsi="Times New Roman" w:cs="Times New Roman"/>
         </w:rPr>
-        <w:t>Riipen</w:t>
+        <w:t>До</w:t>
       </w:r>
       <w:proofErr w:type="spellEnd"/>
       <w:r>
         <w:rPr>
           <w:rFonts w:ascii="Times New Roman" w:hAnsi="Times New Roman" w:cs="Times New Roman"/>
         </w:rPr>
-        <w:t xml:space="preserve"> Help Center. How employers use </w:t>
-      </w:r>
-      <w:proofErr w:type="spellStart"/>
-      <w:r>
-        <w:rPr>
-          <w:rFonts w:ascii="Times New Roman" w:hAnsi="Times New Roman" w:cs="Times New Roman"/>
-        </w:rPr>
-        <w:t>Riipen</w:t>
-      </w:r>
-      <w:proofErr w:type="spellEnd"/>
-      <w:r>
-        <w:rPr>
-          <w:rFonts w:ascii="Times New Roman" w:hAnsi="Times New Roman" w:cs="Times New Roman"/>
-        </w:rPr>
-        <w:t>. https://help.riipen.com/en/articles/7321556-how-employers-use-riipen</w:t>
-      </w:r>
-    </w:p>
-    <w:p>
-      <w:pPr>
-        <w:rPr>
-          <w:rFonts w:ascii="Times New Roman" w:hAnsi="Times New Roman" w:cs="Times New Roman"/>
-        </w:rPr>
-      </w:pPr>
-      <w:r>
-        <w:rPr>
-          <w:rFonts w:ascii="Times New Roman" w:hAnsi="Times New Roman" w:cs="Times New Roman"/>
-        </w:rPr>
-        <w:t>[12] Atlassian Support. What is Jira Product Discovery? https://support.atlassian.com/jira-product-discovery/docs/what-is-jira-product-discovery/ . Supporting guide: https://www.atlassian.com/software/jira/product-discovery/guides/ideas/overview</w:t>
-      </w:r>
-    </w:p>
-    <w:p>
-      <w:pPr>
-        <w:rPr>
-          <w:rFonts w:ascii="Times New Roman" w:hAnsi="Times New Roman" w:cs="Times New Roman"/>
-        </w:rPr>
-      </w:pPr>
-      <w:r>
-        <w:rPr>
-          <w:rFonts w:ascii="Times New Roman" w:hAnsi="Times New Roman" w:cs="Times New Roman"/>
-        </w:rPr>
-        <w:t xml:space="preserve">[13] </w:t>
-      </w:r>
-      <w:proofErr w:type="spellStart"/>
-      <w:r>
-        <w:rPr>
-          <w:rFonts w:ascii="Times New Roman" w:hAnsi="Times New Roman" w:cs="Times New Roman"/>
-        </w:rPr>
-        <w:t>Groq</w:t>
-      </w:r>
-      <w:proofErr w:type="spellEnd"/>
-      <w:r>
-        <w:rPr>
-          <w:rFonts w:ascii="Times New Roman" w:hAnsi="Times New Roman" w:cs="Times New Roman"/>
-        </w:rPr>
-        <w:t xml:space="preserve"> Documentation. Structured Outputs. https://console.groq.com/docs/structured-outputs</w:t>
-      </w:r>
-    </w:p>
-    <w:p>
-      <w:pPr>
-        <w:rPr>
-          <w:rFonts w:ascii="Times New Roman" w:hAnsi="Times New Roman" w:cs="Times New Roman"/>
-        </w:rPr>
-      </w:pPr>
-      <w:r>
-        <w:rPr>
-          <w:rFonts w:ascii="Times New Roman" w:hAnsi="Times New Roman" w:cs="Times New Roman"/>
-        </w:rPr>
-        <w:t xml:space="preserve">[14] </w:t>
-      </w:r>
-      <w:proofErr w:type="spellStart"/>
-      <w:r>
-        <w:rPr>
-          <w:rFonts w:ascii="Times New Roman" w:hAnsi="Times New Roman" w:cs="Times New Roman"/>
-        </w:rPr>
-        <w:t>Groq</w:t>
-      </w:r>
-      <w:proofErr w:type="spellEnd"/>
-      <w:r>
-        <w:rPr>
-          <w:rFonts w:ascii="Times New Roman" w:hAnsi="Times New Roman" w:cs="Times New Roman"/>
-        </w:rPr>
-        <w:t xml:space="preserve"> Documentation. Speech to Text. https://console.groq.com/docs/speech-to-text</w:t>
-      </w:r>
-    </w:p>
-    <w:p>
-      <w:pPr>
-        <w:rPr>
-          <w:rFonts w:ascii="Times New Roman" w:hAnsi="Times New Roman" w:cs="Times New Roman"/>
-        </w:rPr>
-      </w:pPr>
-      <w:r>
-        <w:rPr>
-          <w:rFonts w:ascii="Times New Roman" w:hAnsi="Times New Roman" w:cs="Times New Roman"/>
-        </w:rPr>
-        <w:t>[15] Go standard library. Package net/http. https://pkg.go.dev/net/http</w:t>
-      </w:r>
-    </w:p>
-    <w:p>
-      <w:pPr>
-        <w:rPr>
-          <w:rFonts w:ascii="Times New Roman" w:hAnsi="Times New Roman" w:cs="Times New Roman"/>
-        </w:rPr>
-      </w:pPr>
-      <w:r>
-        <w:rPr>
-          <w:rFonts w:ascii="Times New Roman" w:hAnsi="Times New Roman" w:cs="Times New Roman"/>
-        </w:rPr>
-        <w:t>[16] PostgreSQL 16 Documentation. Transactions. https://www.postgresql.org/docs/16/tutorial-transactions.html</w:t>
-      </w:r>
-    </w:p>
-    <w:p>
-      <w:pPr>
-        <w:rPr>
-          <w:rFonts w:ascii="Times New Roman" w:hAnsi="Times New Roman" w:cs="Times New Roman"/>
-        </w:rPr>
-      </w:pPr>
-      <w:r>
-        <w:rPr>
-          <w:rFonts w:ascii="Times New Roman" w:hAnsi="Times New Roman" w:cs="Times New Roman"/>
-        </w:rPr>
-        <w:t>[17] Vue Documentation. Quick Start. https://vuejs.org/guide/quick-start.html</w:t>
-      </w:r>
-    </w:p>
-    <w:p>
-      <w:pPr>
-        <w:pStyle w:val="21"/>
-        <w:rPr>
-          <w:rFonts w:ascii="Times New Roman" w:hAnsi="Times New Roman" w:cs="Times New Roman"/>
-          <w:sz w:val="22"/>
-          <w:szCs w:val="22"/>
-        </w:rPr>
-      </w:pPr>
-      <w:r>
-        <w:rPr>
-          <w:rFonts w:ascii="Times New Roman" w:hAnsi="Times New Roman" w:cs="Times New Roman"/>
-          <w:sz w:val="22"/>
-          <w:szCs w:val="22"/>
-        </w:rPr>
-        <w:t>Repository and assignment evidence</w:t>
-      </w:r>
-    </w:p>
-    <w:p>
-      <w:pPr>
-        <w:rPr>
-          <w:rFonts w:ascii="Times New Roman" w:hAnsi="Times New Roman" w:cs="Times New Roman"/>
-        </w:rPr>
-      </w:pPr>
-      <w:r>
-        <w:rPr>
-          <w:rFonts w:ascii="Times New Roman" w:hAnsi="Times New Roman" w:cs="Times New Roman"/>
-        </w:rPr>
-        <w:t>[18] Diploma repository. https://github.com/bekasyl00/Qadam_Diplom . Includes the Vue interface, Go server, task and proposal logic, AI integration, and configuration examples.</w:t>
-      </w:r>
-    </w:p>
-    <w:p>
-      <w:pPr>
-        <w:rPr>
-          <w:rFonts w:ascii="Times New Roman" w:hAnsi="Times New Roman" w:cs="Times New Roman"/>
-        </w:rPr>
-      </w:pPr>
-      <w:r>
-        <w:rPr>
-          <w:rFonts w:ascii="Times New Roman" w:hAnsi="Times New Roman" w:cs="Times New Roman"/>
-        </w:rPr>
-        <w:t xml:space="preserve">[19] </w:t>
-      </w:r>
-      <w:proofErr w:type="spellStart"/>
-      <w:r>
-        <w:rPr>
-          <w:rFonts w:ascii="Times New Roman" w:hAnsi="Times New Roman" w:cs="Times New Roman"/>
-        </w:rPr>
-        <w:t>Qadam</w:t>
-      </w:r>
-      <w:proofErr w:type="spellEnd"/>
-      <w:r>
-        <w:rPr>
-          <w:rFonts w:ascii="Times New Roman" w:hAnsi="Times New Roman" w:cs="Times New Roman"/>
-        </w:rPr>
-        <w:t xml:space="preserve"> repository history and branch metadata, inspected 19 October 2026. https://github.com/bekasyl00/Qadam_Diplom/commits/main/ . Authored changes support the contribution summary; they do not establish independent review or unpublished work.</w:t>
-      </w:r>
-    </w:p>
-    <w:p>
-      <w:pPr>
-        <w:rPr>
-          <w:rFonts w:ascii="Times New Roman" w:hAnsi="Times New Roman" w:cs="Times New Roman"/>
-        </w:rPr>
-      </w:pPr>
-      <w:r>
-        <w:rPr>
-          <w:rFonts w:ascii="Times New Roman" w:hAnsi="Times New Roman" w:cs="Times New Roman"/>
-        </w:rPr>
-        <w:t>[20] Supplied assignment “</w:t>
-      </w:r>
-      <w:proofErr w:type="spellStart"/>
-      <w:r>
-        <w:rPr>
-          <w:rFonts w:ascii="Times New Roman" w:hAnsi="Times New Roman" w:cs="Times New Roman"/>
-        </w:rPr>
-        <w:t>До</w:t>
-      </w:r>
-      <w:proofErr w:type="spellEnd"/>
-      <w:r>
-        <w:rPr>
-          <w:rFonts w:ascii="Times New Roman" w:hAnsi="Times New Roman" w:cs="Times New Roman"/>
-        </w:rPr>
         <w:t xml:space="preserve"> 24 октября.docx”. Eleven checkpoint components and Git repository requirements. The source file was supplied by the student; its text defines the coverage checklist for this report.</w:t>
       </w:r>
     </w:p>
@@ -12264,10 +12735,19 @@
         </w:rPr>
       </w:pPr>
       <w:r>
-        <w:rPr>
-          <w:rFonts w:ascii="Times New Roman" w:hAnsi="Times New Roman" w:cs="Times New Roman"/>
-        </w:rPr>
-        <w:t>[21] Local verification and traceability records in this package: VERIFICATION.md, TRACEABILITY.md, BACKLOG.csv, and EVIDENCE_FORMS.md. Planned tasks and empty forms are not results or approvals.</w:t>
+        <w:t xml:space="preserve">[21] Supporting verification, traceability, planning and evidence templates: </w:t>
+      </w:r>
+      <w:hyperlink r:id="rId31">
+        <w:r>
+          <w:rPr>
+            <w:color w:val="174D8C"/>
+            <w:u w:val="single"/>
+          </w:rPr>
+          <w:t>https://github.com/bekasyl00/Qadam_Diplom/tree/prob-period-1/docs/diploma</w:t>
+        </w:r>
+      </w:hyperlink>
+      <w:r>
+        <w:t xml:space="preserve"> . Historical test records, planned tasks and empty forms are not fresh results or approvals.</w:t>
       </w:r>
     </w:p>
     <w:p>
@@ -13052,6 +13532,7 @@
       <w:rFonts w:asciiTheme="majorHAnsi" w:eastAsiaTheme="majorEastAsia" w:hAnsiTheme="majorHAnsi" w:cstheme="majorBidi"/>
       <w:b/>
       <w:bCs/>
+      <w:color w:val="000000"/>
       <w:sz w:val="36"/>
       <w:szCs w:val="28"/>
     </w:rPr>
@@ -13075,6 +13556,7 @@
       <w:rFonts w:asciiTheme="majorHAnsi" w:eastAsiaTheme="majorEastAsia" w:hAnsiTheme="majorHAnsi" w:cstheme="majorBidi"/>
       <w:b/>
       <w:bCs/>
+      <w:color w:val="000000"/>
       <w:sz w:val="24"/>
       <w:szCs w:val="26"/>
     </w:rPr>
@@ -13098,7 +13580,7 @@
       <w:rFonts w:asciiTheme="majorHAnsi" w:eastAsiaTheme="majorEastAsia" w:hAnsiTheme="majorHAnsi" w:cstheme="majorBidi"/>
       <w:b/>
       <w:bCs/>
-      <w:color w:val="4F81BD" w:themeColor="accent1"/>
+      <w:color w:val="000000"/>
     </w:rPr>
   </w:style>
   <w:style w:type="paragraph" w:styleId="4">
@@ -13380,6 +13862,7 @@
     <w:rPr>
       <w:rFonts w:asciiTheme="majorHAnsi" w:eastAsiaTheme="majorEastAsia" w:hAnsiTheme="majorHAnsi" w:cstheme="majorBidi"/>
       <w:b/>
+      <w:color w:val="000000"/>
       <w:spacing w:val="5"/>
       <w:kern w:val="28"/>
       <w:sz w:val="54"/>

</xml_diff>